<commit_message>
feat: completed all the code requirment for milestone 2
</commit_message>
<xml_diff>
--- a/Milestone 1/24046599 Naitik Joshi .docx
+++ b/Milestone 1/24046599 Naitik Joshi .docx
@@ -276,19 +276,11 @@
           <w:b/>
         </w:rPr>
       </w:pPr>
-      <w:proofErr w:type="gramStart"/>
       <w:r>
         <w:rPr>
           <w:b/>
         </w:rPr>
-        <w:t>Submission :</w:t>
-      </w:r>
-      <w:proofErr w:type="gramEnd"/>
-      <w:r>
-        <w:rPr>
-          <w:b/>
-        </w:rPr>
-        <w:t xml:space="preserve"> </w:t>
+        <w:t xml:space="preserve">Submission : </w:t>
       </w:r>
       <w:sdt>
         <w:sdtPr>
@@ -644,25 +636,7 @@
           <w:sz w:val="20"/>
           <w:szCs w:val="20"/>
         </w:rPr>
-        <w:t xml:space="preserve">I confirm that I understand my coursework needs to be submitted online via MST Classroom under the relevant module page before the deadline </w:t>
-      </w:r>
-      <w:proofErr w:type="gramStart"/>
-      <w:r>
-        <w:rPr>
-          <w:i/>
-          <w:sz w:val="20"/>
-          <w:szCs w:val="20"/>
-        </w:rPr>
-        <w:t>in order for</w:t>
-      </w:r>
-      <w:proofErr w:type="gramEnd"/>
-      <w:r>
-        <w:rPr>
-          <w:i/>
-          <w:sz w:val="20"/>
-          <w:szCs w:val="20"/>
-        </w:rPr>
-        <w:t xml:space="preserve"> my assignment to be accepted and marked. I am fully aware that late submissions will be treated as non-submission and a mark of zero will be awarded.</w:t>
+        <w:t>I confirm that I understand my coursework needs to be submitted online via MST Classroom under the relevant module page before the deadline in order for my assignment to be accepted and marked. I am fully aware that late submissions will be treated as non-submission and a mark of zero will be awarded.</w:t>
       </w:r>
     </w:p>
     <w:sdt>
@@ -2777,9 +2751,9 @@
       </w:tblPr>
       <w:tblGrid>
         <w:gridCol w:w="2295"/>
-        <w:gridCol w:w="1455"/>
-        <w:gridCol w:w="3019"/>
-        <w:gridCol w:w="2575"/>
+        <w:gridCol w:w="1426"/>
+        <w:gridCol w:w="2844"/>
+        <w:gridCol w:w="2439"/>
       </w:tblGrid>
       <w:tr>
         <w:tc>
@@ -5013,6 +4987,7 @@
                 <w:color w:val="1F1F1F"/>
                 <w:lang w:val="en-NP" w:eastAsia="en-US"/>
               </w:rPr>
+              <w:lastRenderedPageBreak/>
               <w:t>unnamed1</w:t>
             </w:r>
           </w:p>
@@ -5151,7 +5126,6 @@
           <w:szCs w:val="28"/>
           <w:lang w:val="en-NP" w:eastAsia="en-US"/>
         </w:rPr>
-        <w:lastRenderedPageBreak/>
         <w:t>1.3 Identified Challenges</w:t>
       </w:r>
       <w:bookmarkEnd w:id="3"/>
@@ -5173,16 +5147,6 @@
         </w:rPr>
         <w:t>Upon initial inspection, a few data quality challenges were identified. Firstly, there are missing values (NaN) in the crucial Amount and Age columns. Secondly, there are completely empty or irrelevant columns such as unnamed1 and Cust_name that add noise to the dataset. Finally, the raw data needs specific encoding to be read correctly into Python without throwing formatting errors.</w:t>
       </w:r>
-    </w:p>
-    <w:p>
-      <w:pPr>
-        <w:spacing w:after="240" w:line="360" w:lineRule="auto"/>
-        <w:rPr>
-          <w:rFonts w:eastAsia="Times New Roman"/>
-          <w:color w:val="1F1F1F"/>
-          <w:lang w:val="en-NP" w:eastAsia="en-US"/>
-        </w:rPr>
-      </w:pPr>
     </w:p>
     <w:p>
       <w:pPr>
@@ -5556,15 +5520,7 @@
         <w:fldChar w:fldCharType="end"/>
       </w:r>
       <w:r>
-        <w:t xml:space="preserve">: Showing data </w:t>
-      </w:r>
-      <w:proofErr w:type="gramStart"/>
-      <w:r>
-        <w:t>using .head</w:t>
-      </w:r>
-      <w:proofErr w:type="gramEnd"/>
-      <w:r>
-        <w:t>(15)</w:t>
+        <w:t>: Showing data using .head(15)</w:t>
       </w:r>
       <w:bookmarkEnd w:id="7"/>
     </w:p>
@@ -5638,6 +5594,26 @@
         </w:rPr>
         <w:t xml:space="preserve"> the chardet library was utilized. This automatically detected the correct encoding from the file's raw bytes and passed it into the pd.read_csv() function. The output of the first 15 rows confirms that the data was loaded successfully without any formatting errors.</w:t>
       </w:r>
+    </w:p>
+    <w:p>
+      <w:pPr>
+        <w:spacing w:after="240" w:line="360" w:lineRule="auto"/>
+        <w:rPr>
+          <w:rFonts w:eastAsia="Times New Roman"/>
+          <w:color w:val="1F1F1F"/>
+          <w:lang w:val="en-NP" w:eastAsia="en-US"/>
+        </w:rPr>
+      </w:pPr>
+    </w:p>
+    <w:p>
+      <w:pPr>
+        <w:spacing w:after="240" w:line="360" w:lineRule="auto"/>
+        <w:rPr>
+          <w:rFonts w:eastAsia="Times New Roman"/>
+          <w:color w:val="1F1F1F"/>
+          <w:lang w:val="en-NP" w:eastAsia="en-US"/>
+        </w:rPr>
+      </w:pPr>
     </w:p>
     <w:p>
       <w:pPr>
@@ -5663,6 +5639,7 @@
           <w:szCs w:val="28"/>
           <w:lang w:val="en-NP" w:eastAsia="en-US"/>
         </w:rPr>
+        <w:lastRenderedPageBreak/>
         <w:t>2.2 Dataset Insight</w:t>
       </w:r>
       <w:bookmarkEnd w:id="8"/>
@@ -5682,7 +5659,6 @@
           <w:lang w:val="en-NP" w:eastAsia="en-US"/>
           <w14:ligatures w14:val="standardContextual"/>
         </w:rPr>
-        <w:lastRenderedPageBreak/>
         <w:drawing>
           <wp:inline distT="0" distB="0" distL="0" distR="0" wp14:anchorId="4AD725A4" wp14:editId="7CF64CF9">
             <wp:extent cx="5943600" cy="2061845"/>
@@ -5760,15 +5736,7 @@
         <w:fldChar w:fldCharType="end"/>
       </w:r>
       <w:r>
-        <w:t xml:space="preserve">: </w:t>
-      </w:r>
-      <w:proofErr w:type="gramStart"/>
-      <w:r>
-        <w:t>df.info(</w:t>
-      </w:r>
-      <w:proofErr w:type="gramEnd"/>
-      <w:r>
-        <w:t>) showing datatypes</w:t>
+        <w:t>: df.info() showing datatypes</w:t>
       </w:r>
       <w:bookmarkEnd w:id="9"/>
     </w:p>
@@ -5857,7 +5825,7 @@
       </w:tblPr>
       <w:tblGrid>
         <w:gridCol w:w="2268"/>
-        <w:gridCol w:w="7076"/>
+        <w:gridCol w:w="6736"/>
       </w:tblGrid>
       <w:tr>
         <w:tc>
@@ -6264,6 +6232,14 @@
     </w:tbl>
     <w:p>
       <w:pPr>
+        <w:rPr>
+          <w:lang w:val="en-NP" w:eastAsia="en-US"/>
+        </w:rPr>
+      </w:pPr>
+      <w:bookmarkStart w:id="11" w:name="_Toc226119618"/>
+    </w:p>
+    <w:p>
+      <w:pPr>
         <w:spacing w:before="480" w:after="120" w:line="360" w:lineRule="auto"/>
         <w:outlineLvl w:val="0"/>
         <w:rPr>
@@ -6276,7 +6252,6 @@
           <w:lang w:val="en-NP" w:eastAsia="en-US"/>
         </w:rPr>
       </w:pPr>
-      <w:bookmarkStart w:id="11" w:name="_Toc226119618"/>
       <w:r>
         <w:rPr>
           <w:rFonts w:eastAsia="Times New Roman"/>
@@ -6288,6 +6263,7 @@
           <w:szCs w:val="28"/>
           <w:lang w:val="en-NP" w:eastAsia="en-US"/>
         </w:rPr>
+        <w:lastRenderedPageBreak/>
         <w:t>3. Data Cleaning</w:t>
       </w:r>
       <w:bookmarkEnd w:id="11"/>
@@ -6316,7 +6292,6 @@
           <w:szCs w:val="26"/>
           <w:lang w:val="en-NP" w:eastAsia="en-US"/>
         </w:rPr>
-        <w:lastRenderedPageBreak/>
         <w:t>3.1 Convert Age Group to Ordinal Categorical</w:t>
       </w:r>
       <w:bookmarkEnd w:id="12"/>
@@ -6499,6 +6474,25 @@
         <w:spacing w:after="240" w:line="360" w:lineRule="auto"/>
         <w:rPr>
           <w:rFonts w:eastAsia="Times New Roman"/>
+          <w:color w:val="1F1F1F"/>
+          <w:lang w:val="en-NP" w:eastAsia="en-US"/>
+        </w:rPr>
+      </w:pPr>
+    </w:p>
+    <w:p>
+      <w:pPr>
+        <w:spacing w:after="240" w:line="360" w:lineRule="auto"/>
+        <w:rPr>
+          <w:rFonts w:eastAsia="Times New Roman"/>
+          <w:lang w:val="en-NP" w:eastAsia="en-US"/>
+        </w:rPr>
+      </w:pPr>
+    </w:p>
+    <w:p>
+      <w:pPr>
+        <w:spacing w:after="240" w:line="360" w:lineRule="auto"/>
+        <w:rPr>
+          <w:rFonts w:eastAsia="Times New Roman"/>
           <w:lang w:val="en-NP" w:eastAsia="en-US"/>
         </w:rPr>
       </w:pPr>
@@ -6527,6 +6521,7 @@
           <w:szCs w:val="26"/>
           <w:lang w:val="en-NP" w:eastAsia="en-US"/>
         </w:rPr>
+        <w:lastRenderedPageBreak/>
         <w:t>3.2 Create Purchase_Value_Category Column</w:t>
       </w:r>
       <w:bookmarkEnd w:id="14"/>
@@ -6544,7 +6539,6 @@
           <w:lang w:val="en-NP" w:eastAsia="en-US"/>
           <w14:ligatures w14:val="standardContextual"/>
         </w:rPr>
-        <w:lastRenderedPageBreak/>
         <w:drawing>
           <wp:inline distT="0" distB="0" distL="0" distR="0" wp14:anchorId="23CE9572" wp14:editId="195C8FE4">
             <wp:extent cx="5943600" cy="1746250"/>
@@ -6776,15 +6770,7 @@
         <w:fldChar w:fldCharType="end"/>
       </w:r>
       <w:r>
-        <w:t xml:space="preserve">: Dropping </w:t>
-      </w:r>
-      <w:proofErr w:type="spellStart"/>
-      <w:r>
-        <w:t>Irelevant</w:t>
-      </w:r>
-      <w:proofErr w:type="spellEnd"/>
-      <w:r>
-        <w:t xml:space="preserve"> columns</w:t>
+        <w:t>: Dropping Irelevant columns</w:t>
       </w:r>
       <w:bookmarkEnd w:id="17"/>
     </w:p>
@@ -6824,6 +6810,15 @@
         </w:rPr>
         <w:t>Irrelevant columns were removed to clean the dataset. Cust_name and User_ID contain personal identifiers that provide no statistical value for aggregate sales analysis, and dropping them maintains data privacy. The unnamed1 column was an empty artefact. Removing these variables reduces dimensionality and saves memory.</w:t>
       </w:r>
+    </w:p>
+    <w:p>
+      <w:pPr>
+        <w:spacing w:after="240" w:line="360" w:lineRule="auto"/>
+        <w:rPr>
+          <w:rFonts w:eastAsia="Times New Roman"/>
+          <w:lang w:val="en-NP" w:eastAsia="en-US"/>
+        </w:rPr>
+      </w:pPr>
     </w:p>
     <w:p>
       <w:pPr>
@@ -6858,6 +6853,7 @@
           <w:szCs w:val="26"/>
           <w:lang w:val="en-NP" w:eastAsia="en-US"/>
         </w:rPr>
+        <w:lastRenderedPageBreak/>
         <w:t>3.4 Handle Missing Values</w:t>
       </w:r>
       <w:bookmarkEnd w:id="18"/>
@@ -6878,7 +6874,6 @@
           <w:color w:val="1F1F1F"/>
           <w:lang w:val="en-NP" w:eastAsia="en-US"/>
         </w:rPr>
-        <w:lastRenderedPageBreak/>
         <w:t>Techniques for Handling Missing Values:</w:t>
       </w:r>
     </w:p>
@@ -7179,6 +7174,15 @@
         <w:rPr>
           <w:rFonts w:eastAsia="Times New Roman"/>
           <w:color w:val="1F1F1F"/>
+          <w:lang w:val="en-NP" w:eastAsia="en-US"/>
+        </w:rPr>
+      </w:pPr>
+    </w:p>
+    <w:p>
+      <w:pPr>
+        <w:spacing w:after="240" w:line="360" w:lineRule="auto"/>
+        <w:rPr>
+          <w:rFonts w:eastAsia="Times New Roman"/>
           <w:lang w:val="en-NP" w:eastAsia="en-US"/>
         </w:rPr>
       </w:pPr>
@@ -7331,10 +7335,11 @@
       <w:headerReference w:type="default" r:id="rId20"/>
       <w:footerReference w:type="default" r:id="rId21"/>
       <w:footerReference w:type="first" r:id="rId22"/>
-      <w:pgSz w:w="12240" w:h="15840"/>
+      <w:pgSz w:w="11900" w:h="16840"/>
       <w:pgMar w:top="1440" w:right="1440" w:bottom="1440" w:left="1440" w:header="720" w:footer="720" w:gutter="0"/>
       <w:pgNumType w:start="1"/>
       <w:cols w:space="720"/>
+      <w:docGrid w:linePitch="326"/>
     </w:sectPr>
   </w:body>
 </w:document>
@@ -9389,8 +9394,8 @@
   <w:rsids>
     <w:rsidRoot w:val="00B44355"/>
     <w:rsid w:val="007863D9"/>
-    <w:rsid w:val="009A1500"/>
     <w:rsid w:val="00B44355"/>
+    <w:rsid w:val="00E23C07"/>
   </w:rsids>
   <m:mathPr>
     <m:mathFont m:val="Cambria Math"/>
@@ -10185,7 +10190,7 @@
 </file>
 
 <file path=customXml/itemProps1.xml><?xml version="1.0" encoding="utf-8"?>
-<ds:datastoreItem xmlns:ds="http://schemas.openxmlformats.org/officeDocument/2006/customXml" ds:itemID="{694E9CD5-D821-404D-B2CB-3DC4EB2CDC82}">
+<ds:datastoreItem xmlns:ds="http://schemas.openxmlformats.org/officeDocument/2006/customXml" ds:itemID="{C577BA7E-C587-AD47-8BAF-FC2E7A2CC5CA}">
   <ds:schemaRefs>
     <ds:schemaRef ds:uri="http://schemas.openxmlformats.org/officeDocument/2006/bibliography"/>
   </ds:schemaRefs>

</xml_diff>

<commit_message>
Fix: fixed the code for marital status
</commit_message>
<xml_diff>
--- a/Milestone 1/24046599 Naitik Joshi .docx
+++ b/Milestone 1/24046599 Naitik Joshi .docx
@@ -299,13 +299,7 @@
             <w:rPr>
               <w:b/>
             </w:rPr>
-            <w:t xml:space="preserve">Milestone </w:t>
-          </w:r>
-          <w:r>
-            <w:rPr>
-              <w:b/>
-            </w:rPr>
-            <w:t>2</w:t>
+            <w:t>Final Submission</w:t>
           </w:r>
         </w:sdtContent>
       </w:sdt>
@@ -535,7 +529,7 @@
           <w:placeholder>
             <w:docPart w:val="C5804D42DE0EE74DB71962997B292839"/>
           </w:placeholder>
-          <w:date w:fullDate="2026-04-27T00:00:00Z">
+          <w:date w:fullDate="2026-05-18T00:00:00Z">
             <w:dateFormat w:val="dddd, MMMM d, yyyy"/>
             <w:lid w:val="en-US"/>
             <w:storeMappedDataAs w:val="dateTime"/>
@@ -549,7 +543,7 @@
               <w:bCs/>
               <w:lang w:val="en-US"/>
             </w:rPr>
-            <w:t>Monday, April 27, 2026</w:t>
+            <w:t>Monday, May 18, 2026</w:t>
           </w:r>
         </w:sdtContent>
       </w:sdt>
@@ -585,7 +579,7 @@
           <w:placeholder>
             <w:docPart w:val="035E11BB1CD7464DBD6B5A99E3E44AEF"/>
           </w:placeholder>
-          <w:date w:fullDate="2026-04-27T00:00:00Z">
+          <w:date w:fullDate="2026-05-17T00:00:00Z">
             <w:dateFormat w:val="dddd, MMMM d, yyyy"/>
             <w:lid w:val="en-US"/>
             <w:storeMappedDataAs w:val="dateTime"/>
@@ -599,7 +593,7 @@
               <w:bCs/>
               <w:lang w:val="en-US"/>
             </w:rPr>
-            <w:t>Monday, April 27, 2026</w:t>
+            <w:t>Sunday, May 17, 2026</w:t>
           </w:r>
         </w:sdtContent>
       </w:sdt>
@@ -4679,119 +4673,63 @@
     <w:p>
       <w:pPr>
         <w:rPr>
+          <w:noProof/>
+        </w:rPr>
+      </w:pPr>
+      <w:r>
+        <w:fldChar w:fldCharType="end"/>
+      </w:r>
+      <w:r>
+        <w:br/>
+      </w:r>
+      <w:r>
+        <w:br/>
+      </w:r>
+      <w:r>
+        <w:br/>
+      </w:r>
+      <w:r>
+        <w:br/>
+      </w:r>
+      <w:r>
+        <w:br/>
+      </w:r>
+      <w:r>
+        <w:br/>
+      </w:r>
+      <w:r>
+        <w:br/>
+      </w:r>
+      <w:r>
+        <w:br/>
+      </w:r>
+      <w:r>
+        <w:br/>
+      </w:r>
+      <w:r>
+        <w:br/>
+      </w:r>
+      <w:r>
+        <w:br/>
+      </w:r>
+      <w:r>
+        <w:br/>
+      </w:r>
+      <w:r>
+        <w:br/>
+      </w:r>
+      <w:r>
+        <w:br/>
+      </w:r>
+      <w:r>
+        <w:br/>
+      </w:r>
+      <w:r>
+        <w:rPr>
           <w:b/>
           <w:bCs/>
-          <w:noProof/>
-        </w:rPr>
-      </w:pPr>
-      <w:r>
-        <w:fldChar w:fldCharType="end"/>
-      </w:r>
-      <w:r>
-        <w:br/>
-      </w:r>
-      <w:r>
-        <w:br/>
-      </w:r>
-      <w:r>
-        <w:br/>
-      </w:r>
-      <w:r>
-        <w:br/>
-      </w:r>
-      <w:r>
-        <w:br/>
-      </w:r>
-      <w:r>
-        <w:br/>
-      </w:r>
-      <w:r>
-        <w:br/>
-      </w:r>
-      <w:r>
-        <w:br/>
-      </w:r>
-      <w:r>
-        <w:br/>
-      </w:r>
-      <w:r>
-        <w:br/>
-      </w:r>
-      <w:r>
-        <w:br/>
-      </w:r>
-      <w:r>
-        <w:br/>
-      </w:r>
-      <w:r>
-        <w:br/>
-      </w:r>
-      <w:r>
-        <w:br/>
-      </w:r>
-      <w:r>
-        <w:br/>
-      </w:r>
-      <w:r>
+        </w:rPr>
         <w:lastRenderedPageBreak/>
-        <w:br/>
-      </w:r>
-      <w:r>
-        <w:br/>
-      </w:r>
-      <w:r>
-        <w:br/>
-      </w:r>
-      <w:r>
-        <w:br/>
-      </w:r>
-      <w:r>
-        <w:br/>
-      </w:r>
-      <w:r>
-        <w:br/>
-      </w:r>
-      <w:r>
-        <w:br/>
-      </w:r>
-      <w:r>
-        <w:br/>
-      </w:r>
-      <w:r>
-        <w:br/>
-      </w:r>
-      <w:r>
-        <w:br/>
-      </w:r>
-      <w:r>
-        <w:br/>
-      </w:r>
-      <w:r>
-        <w:br/>
-      </w:r>
-      <w:r>
-        <w:br/>
-      </w:r>
-      <w:r>
-        <w:br/>
-      </w:r>
-      <w:r>
-        <w:br/>
-      </w:r>
-      <w:r>
-        <w:br/>
-      </w:r>
-      <w:r>
-        <w:br/>
-      </w:r>
-      <w:r>
-        <w:br/>
-      </w:r>
-      <w:r>
-        <w:rPr>
-          <w:b/>
-          <w:bCs/>
-        </w:rPr>
         <w:t>Table of Tables</w:t>
       </w:r>
       <w:r>
@@ -4837,7 +4775,7 @@
           <w14:ligatures w14:val="standardContextual"/>
         </w:rPr>
       </w:pPr>
-      <w:hyperlink w:anchor="_Toc226119642" w:history="1">
+      <w:hyperlink w:anchor="_Toc228188183" w:history="1">
         <w:r>
           <w:rPr>
             <w:rStyle w:val="Hyperlink"/>
@@ -4864,7 +4802,7 @@
             <w:noProof/>
             <w:webHidden/>
           </w:rPr>
-          <w:instrText xml:space="preserve"> PAGEREF _Toc226119642 \h </w:instrText>
+          <w:instrText xml:space="preserve"> PAGEREF _Toc228188183 \h </w:instrText>
         </w:r>
         <w:r>
           <w:rPr>
@@ -4909,7 +4847,7 @@
           <w14:ligatures w14:val="standardContextual"/>
         </w:rPr>
       </w:pPr>
-      <w:hyperlink w:anchor="_Toc226119643" w:history="1">
+      <w:hyperlink w:anchor="_Toc228188184" w:history="1">
         <w:r>
           <w:rPr>
             <w:rStyle w:val="Hyperlink"/>
@@ -4936,7 +4874,7 @@
             <w:noProof/>
             <w:webHidden/>
           </w:rPr>
-          <w:instrText xml:space="preserve"> PAGEREF _Toc226119643 \h </w:instrText>
+          <w:instrText xml:space="preserve"> PAGEREF _Toc228188184 \h </w:instrText>
         </w:r>
         <w:r>
           <w:rPr>
@@ -5145,7 +5083,7 @@
         <w:pStyle w:val="Caption"/>
         <w:keepNext/>
       </w:pPr>
-      <w:bookmarkStart w:id="2" w:name="_Toc226119642"/>
+      <w:bookmarkStart w:id="2" w:name="_Toc228188183"/>
       <w:r>
         <w:t xml:space="preserve">Table </w:t>
       </w:r>
@@ -5174,38 +5112,24 @@
     </w:p>
     <w:tbl>
       <w:tblPr>
+        <w:tblStyle w:val="GridTable1Light"/>
         <w:tblW w:w="0" w:type="auto"/>
-        <w:tblCellMar>
-          <w:top w:w="15" w:type="dxa"/>
-          <w:left w:w="15" w:type="dxa"/>
-          <w:bottom w:w="15" w:type="dxa"/>
-          <w:right w:w="15" w:type="dxa"/>
-        </w:tblCellMar>
         <w:tblLook w:val="04A0" w:firstRow="1" w:lastRow="0" w:firstColumn="1" w:lastColumn="0" w:noHBand="0" w:noVBand="1"/>
       </w:tblPr>
       <w:tblGrid>
-        <w:gridCol w:w="2295"/>
-        <w:gridCol w:w="1426"/>
-        <w:gridCol w:w="2844"/>
-        <w:gridCol w:w="2439"/>
+        <w:gridCol w:w="2297"/>
+        <w:gridCol w:w="1319"/>
+        <w:gridCol w:w="2924"/>
+        <w:gridCol w:w="2470"/>
       </w:tblGrid>
       <w:tr>
+        <w:trPr>
+          <w:cnfStyle w:val="100000000000" w:firstRow="1" w:lastRow="0" w:firstColumn="0" w:lastColumn="0" w:oddVBand="0" w:evenVBand="0" w:oddHBand="0" w:evenHBand="0" w:firstRowFirstColumn="0" w:firstRowLastColumn="0" w:lastRowFirstColumn="0" w:lastRowLastColumn="0"/>
+        </w:trPr>
         <w:tc>
           <w:tcPr>
+            <w:cnfStyle w:val="001000000000" w:firstRow="0" w:lastRow="0" w:firstColumn="1" w:lastColumn="0" w:oddVBand="0" w:evenVBand="0" w:oddHBand="0" w:evenHBand="0" w:firstRowFirstColumn="0" w:firstRowLastColumn="0" w:lastRowFirstColumn="0" w:lastRowLastColumn="0"/>
             <w:tcW w:w="0" w:type="auto"/>
-            <w:tcBorders>
-              <w:top w:val="single" w:sz="6" w:space="0" w:color="000000"/>
-              <w:left w:val="single" w:sz="6" w:space="0" w:color="000000"/>
-              <w:bottom w:val="single" w:sz="6" w:space="0" w:color="000000"/>
-              <w:right w:val="single" w:sz="6" w:space="0" w:color="000000"/>
-            </w:tcBorders>
-            <w:shd w:val="clear" w:color="auto" w:fill="F8FAFD"/>
-            <w:tcMar>
-              <w:top w:w="120" w:type="dxa"/>
-              <w:left w:w="180" w:type="dxa"/>
-              <w:bottom w:w="120" w:type="dxa"/>
-              <w:right w:w="180" w:type="dxa"/>
-            </w:tcMar>
             <w:hideMark/>
           </w:tcPr>
           <w:p>
@@ -5219,8 +5143,6 @@
             <w:r>
               <w:rPr>
                 <w:rFonts w:eastAsia="Times New Roman"/>
-                <w:b/>
-                <w:bCs/>
                 <w:color w:val="1F1F1F"/>
                 <w:lang w:val="en-NP" w:eastAsia="en-US"/>
               </w:rPr>
@@ -5231,24 +5153,12 @@
         <w:tc>
           <w:tcPr>
             <w:tcW w:w="0" w:type="auto"/>
-            <w:tcBorders>
-              <w:top w:val="single" w:sz="6" w:space="0" w:color="000000"/>
-              <w:left w:val="single" w:sz="6" w:space="0" w:color="000000"/>
-              <w:bottom w:val="single" w:sz="6" w:space="0" w:color="000000"/>
-              <w:right w:val="single" w:sz="6" w:space="0" w:color="000000"/>
-            </w:tcBorders>
-            <w:shd w:val="clear" w:color="auto" w:fill="F8FAFD"/>
-            <w:tcMar>
-              <w:top w:w="120" w:type="dxa"/>
-              <w:left w:w="180" w:type="dxa"/>
-              <w:bottom w:w="120" w:type="dxa"/>
-              <w:right w:w="180" w:type="dxa"/>
-            </w:tcMar>
             <w:hideMark/>
           </w:tcPr>
           <w:p>
             <w:pPr>
               <w:spacing w:before="120" w:after="120" w:line="360" w:lineRule="auto"/>
+              <w:cnfStyle w:val="100000000000" w:firstRow="1" w:lastRow="0" w:firstColumn="0" w:lastColumn="0" w:oddVBand="0" w:evenVBand="0" w:oddHBand="0" w:evenHBand="0" w:firstRowFirstColumn="0" w:firstRowLastColumn="0" w:lastRowFirstColumn="0" w:lastRowLastColumn="0"/>
               <w:rPr>
                 <w:rFonts w:eastAsia="Times New Roman"/>
                 <w:lang w:val="en-NP" w:eastAsia="en-US"/>
@@ -5257,8 +5167,6 @@
             <w:r>
               <w:rPr>
                 <w:rFonts w:eastAsia="Times New Roman"/>
-                <w:b/>
-                <w:bCs/>
                 <w:color w:val="1F1F1F"/>
                 <w:lang w:val="en-NP" w:eastAsia="en-US"/>
               </w:rPr>
@@ -5269,24 +5177,12 @@
         <w:tc>
           <w:tcPr>
             <w:tcW w:w="0" w:type="auto"/>
-            <w:tcBorders>
-              <w:top w:val="single" w:sz="6" w:space="0" w:color="000000"/>
-              <w:left w:val="single" w:sz="6" w:space="0" w:color="000000"/>
-              <w:bottom w:val="single" w:sz="6" w:space="0" w:color="000000"/>
-              <w:right w:val="single" w:sz="6" w:space="0" w:color="000000"/>
-            </w:tcBorders>
-            <w:shd w:val="clear" w:color="auto" w:fill="F8FAFD"/>
-            <w:tcMar>
-              <w:top w:w="120" w:type="dxa"/>
-              <w:left w:w="180" w:type="dxa"/>
-              <w:bottom w:w="120" w:type="dxa"/>
-              <w:right w:w="180" w:type="dxa"/>
-            </w:tcMar>
             <w:hideMark/>
           </w:tcPr>
           <w:p>
             <w:pPr>
               <w:spacing w:before="120" w:after="120" w:line="360" w:lineRule="auto"/>
+              <w:cnfStyle w:val="100000000000" w:firstRow="1" w:lastRow="0" w:firstColumn="0" w:lastColumn="0" w:oddVBand="0" w:evenVBand="0" w:oddHBand="0" w:evenHBand="0" w:firstRowFirstColumn="0" w:firstRowLastColumn="0" w:lastRowFirstColumn="0" w:lastRowLastColumn="0"/>
               <w:rPr>
                 <w:rFonts w:eastAsia="Times New Roman"/>
                 <w:lang w:val="en-NP" w:eastAsia="en-US"/>
@@ -5295,8 +5191,6 @@
             <w:r>
               <w:rPr>
                 <w:rFonts w:eastAsia="Times New Roman"/>
-                <w:b/>
-                <w:bCs/>
                 <w:color w:val="1F1F1F"/>
                 <w:lang w:val="en-NP" w:eastAsia="en-US"/>
               </w:rPr>
@@ -5307,24 +5201,12 @@
         <w:tc>
           <w:tcPr>
             <w:tcW w:w="0" w:type="auto"/>
-            <w:tcBorders>
-              <w:top w:val="single" w:sz="6" w:space="0" w:color="000000"/>
-              <w:left w:val="single" w:sz="6" w:space="0" w:color="000000"/>
-              <w:bottom w:val="single" w:sz="6" w:space="0" w:color="000000"/>
-              <w:right w:val="single" w:sz="6" w:space="0" w:color="000000"/>
-            </w:tcBorders>
-            <w:shd w:val="clear" w:color="auto" w:fill="F8FAFD"/>
-            <w:tcMar>
-              <w:top w:w="120" w:type="dxa"/>
-              <w:left w:w="180" w:type="dxa"/>
-              <w:bottom w:w="120" w:type="dxa"/>
-              <w:right w:w="180" w:type="dxa"/>
-            </w:tcMar>
             <w:hideMark/>
           </w:tcPr>
           <w:p>
             <w:pPr>
               <w:spacing w:before="120" w:after="120" w:line="360" w:lineRule="auto"/>
+              <w:cnfStyle w:val="100000000000" w:firstRow="1" w:lastRow="0" w:firstColumn="0" w:lastColumn="0" w:oddVBand="0" w:evenVBand="0" w:oddHBand="0" w:evenHBand="0" w:firstRowFirstColumn="0" w:firstRowLastColumn="0" w:lastRowFirstColumn="0" w:lastRowLastColumn="0"/>
               <w:rPr>
                 <w:rFonts w:eastAsia="Times New Roman"/>
                 <w:lang w:val="en-NP" w:eastAsia="en-US"/>
@@ -5333,8 +5215,6 @@
             <w:r>
               <w:rPr>
                 <w:rFonts w:eastAsia="Times New Roman"/>
-                <w:b/>
-                <w:bCs/>
                 <w:color w:val="1F1F1F"/>
                 <w:lang w:val="en-NP" w:eastAsia="en-US"/>
               </w:rPr>
@@ -5346,25 +5226,13 @@
       <w:tr>
         <w:tc>
           <w:tcPr>
+            <w:cnfStyle w:val="001000000000" w:firstRow="0" w:lastRow="0" w:firstColumn="1" w:lastColumn="0" w:oddVBand="0" w:evenVBand="0" w:oddHBand="0" w:evenHBand="0" w:firstRowFirstColumn="0" w:firstRowLastColumn="0" w:lastRowFirstColumn="0" w:lastRowLastColumn="0"/>
             <w:tcW w:w="0" w:type="auto"/>
-            <w:tcBorders>
-              <w:top w:val="single" w:sz="6" w:space="0" w:color="000000"/>
-              <w:left w:val="single" w:sz="6" w:space="0" w:color="000000"/>
-              <w:bottom w:val="single" w:sz="6" w:space="0" w:color="000000"/>
-              <w:right w:val="single" w:sz="6" w:space="0" w:color="000000"/>
-            </w:tcBorders>
-            <w:shd w:val="clear" w:color="auto" w:fill="F8FAFD"/>
-            <w:tcMar>
-              <w:top w:w="120" w:type="dxa"/>
-              <w:left w:w="180" w:type="dxa"/>
-              <w:bottom w:w="120" w:type="dxa"/>
-              <w:right w:w="180" w:type="dxa"/>
-            </w:tcMar>
             <w:hideMark/>
           </w:tcPr>
           <w:p>
             <w:pPr>
-              <w:spacing w:after="0" w:line="360" w:lineRule="auto"/>
+              <w:spacing w:line="360" w:lineRule="auto"/>
               <w:rPr>
                 <w:rFonts w:eastAsia="Times New Roman"/>
                 <w:lang w:val="en-NP" w:eastAsia="en-US"/>
@@ -5383,24 +5251,12 @@
         <w:tc>
           <w:tcPr>
             <w:tcW w:w="0" w:type="auto"/>
-            <w:tcBorders>
-              <w:top w:val="single" w:sz="6" w:space="0" w:color="000000"/>
-              <w:left w:val="single" w:sz="6" w:space="0" w:color="000000"/>
-              <w:bottom w:val="single" w:sz="6" w:space="0" w:color="000000"/>
-              <w:right w:val="single" w:sz="6" w:space="0" w:color="000000"/>
-            </w:tcBorders>
-            <w:shd w:val="clear" w:color="auto" w:fill="F8FAFD"/>
-            <w:tcMar>
-              <w:top w:w="120" w:type="dxa"/>
-              <w:left w:w="180" w:type="dxa"/>
-              <w:bottom w:w="120" w:type="dxa"/>
-              <w:right w:w="180" w:type="dxa"/>
-            </w:tcMar>
             <w:hideMark/>
           </w:tcPr>
           <w:p>
             <w:pPr>
-              <w:spacing w:after="0" w:line="360" w:lineRule="auto"/>
+              <w:spacing w:line="360" w:lineRule="auto"/>
+              <w:cnfStyle w:val="000000000000" w:firstRow="0" w:lastRow="0" w:firstColumn="0" w:lastColumn="0" w:oddVBand="0" w:evenVBand="0" w:oddHBand="0" w:evenHBand="0" w:firstRowFirstColumn="0" w:firstRowLastColumn="0" w:lastRowFirstColumn="0" w:lastRowLastColumn="0"/>
               <w:rPr>
                 <w:rFonts w:eastAsia="Times New Roman"/>
                 <w:lang w:val="en-NP" w:eastAsia="en-US"/>
@@ -5419,24 +5275,12 @@
         <w:tc>
           <w:tcPr>
             <w:tcW w:w="0" w:type="auto"/>
-            <w:tcBorders>
-              <w:top w:val="single" w:sz="6" w:space="0" w:color="000000"/>
-              <w:left w:val="single" w:sz="6" w:space="0" w:color="000000"/>
-              <w:bottom w:val="single" w:sz="6" w:space="0" w:color="000000"/>
-              <w:right w:val="single" w:sz="6" w:space="0" w:color="000000"/>
-            </w:tcBorders>
-            <w:shd w:val="clear" w:color="auto" w:fill="F8FAFD"/>
-            <w:tcMar>
-              <w:top w:w="120" w:type="dxa"/>
-              <w:left w:w="180" w:type="dxa"/>
-              <w:bottom w:w="120" w:type="dxa"/>
-              <w:right w:w="180" w:type="dxa"/>
-            </w:tcMar>
             <w:hideMark/>
           </w:tcPr>
           <w:p>
             <w:pPr>
-              <w:spacing w:after="0" w:line="360" w:lineRule="auto"/>
+              <w:spacing w:line="360" w:lineRule="auto"/>
+              <w:cnfStyle w:val="000000000000" w:firstRow="0" w:lastRow="0" w:firstColumn="0" w:lastColumn="0" w:oddVBand="0" w:evenVBand="0" w:oddHBand="0" w:evenHBand="0" w:firstRowFirstColumn="0" w:firstRowLastColumn="0" w:lastRowFirstColumn="0" w:lastRowLastColumn="0"/>
               <w:rPr>
                 <w:rFonts w:eastAsia="Times New Roman"/>
                 <w:lang w:val="en-NP" w:eastAsia="en-US"/>
@@ -5455,24 +5299,12 @@
         <w:tc>
           <w:tcPr>
             <w:tcW w:w="0" w:type="auto"/>
-            <w:tcBorders>
-              <w:top w:val="single" w:sz="6" w:space="0" w:color="000000"/>
-              <w:left w:val="single" w:sz="6" w:space="0" w:color="000000"/>
-              <w:bottom w:val="single" w:sz="6" w:space="0" w:color="000000"/>
-              <w:right w:val="single" w:sz="6" w:space="0" w:color="000000"/>
-            </w:tcBorders>
-            <w:shd w:val="clear" w:color="auto" w:fill="F8FAFD"/>
-            <w:tcMar>
-              <w:top w:w="120" w:type="dxa"/>
-              <w:left w:w="180" w:type="dxa"/>
-              <w:bottom w:w="120" w:type="dxa"/>
-              <w:right w:w="180" w:type="dxa"/>
-            </w:tcMar>
             <w:hideMark/>
           </w:tcPr>
           <w:p>
             <w:pPr>
-              <w:spacing w:after="0" w:line="360" w:lineRule="auto"/>
+              <w:spacing w:line="360" w:lineRule="auto"/>
+              <w:cnfStyle w:val="000000000000" w:firstRow="0" w:lastRow="0" w:firstColumn="0" w:lastColumn="0" w:oddVBand="0" w:evenVBand="0" w:oddHBand="0" w:evenHBand="0" w:firstRowFirstColumn="0" w:firstRowLastColumn="0" w:lastRowFirstColumn="0" w:lastRowLastColumn="0"/>
               <w:rPr>
                 <w:rFonts w:eastAsia="Times New Roman"/>
                 <w:lang w:val="en-NP" w:eastAsia="en-US"/>
@@ -5492,25 +5324,13 @@
       <w:tr>
         <w:tc>
           <w:tcPr>
+            <w:cnfStyle w:val="001000000000" w:firstRow="0" w:lastRow="0" w:firstColumn="1" w:lastColumn="0" w:oddVBand="0" w:evenVBand="0" w:oddHBand="0" w:evenHBand="0" w:firstRowFirstColumn="0" w:firstRowLastColumn="0" w:lastRowFirstColumn="0" w:lastRowLastColumn="0"/>
             <w:tcW w:w="0" w:type="auto"/>
-            <w:tcBorders>
-              <w:top w:val="single" w:sz="6" w:space="0" w:color="000000"/>
-              <w:left w:val="single" w:sz="6" w:space="0" w:color="000000"/>
-              <w:bottom w:val="single" w:sz="6" w:space="0" w:color="000000"/>
-              <w:right w:val="single" w:sz="6" w:space="0" w:color="000000"/>
-            </w:tcBorders>
-            <w:shd w:val="clear" w:color="auto" w:fill="F8FAFD"/>
-            <w:tcMar>
-              <w:top w:w="120" w:type="dxa"/>
-              <w:left w:w="180" w:type="dxa"/>
-              <w:bottom w:w="120" w:type="dxa"/>
-              <w:right w:w="180" w:type="dxa"/>
-            </w:tcMar>
             <w:hideMark/>
           </w:tcPr>
           <w:p>
             <w:pPr>
-              <w:spacing w:after="0" w:line="360" w:lineRule="auto"/>
+              <w:spacing w:line="360" w:lineRule="auto"/>
               <w:rPr>
                 <w:rFonts w:eastAsia="Times New Roman"/>
                 <w:lang w:val="en-NP" w:eastAsia="en-US"/>
@@ -5529,24 +5349,12 @@
         <w:tc>
           <w:tcPr>
             <w:tcW w:w="0" w:type="auto"/>
-            <w:tcBorders>
-              <w:top w:val="single" w:sz="6" w:space="0" w:color="000000"/>
-              <w:left w:val="single" w:sz="6" w:space="0" w:color="000000"/>
-              <w:bottom w:val="single" w:sz="6" w:space="0" w:color="000000"/>
-              <w:right w:val="single" w:sz="6" w:space="0" w:color="000000"/>
-            </w:tcBorders>
-            <w:shd w:val="clear" w:color="auto" w:fill="F8FAFD"/>
-            <w:tcMar>
-              <w:top w:w="120" w:type="dxa"/>
-              <w:left w:w="180" w:type="dxa"/>
-              <w:bottom w:w="120" w:type="dxa"/>
-              <w:right w:w="180" w:type="dxa"/>
-            </w:tcMar>
             <w:hideMark/>
           </w:tcPr>
           <w:p>
             <w:pPr>
-              <w:spacing w:after="0" w:line="360" w:lineRule="auto"/>
+              <w:spacing w:line="360" w:lineRule="auto"/>
+              <w:cnfStyle w:val="000000000000" w:firstRow="0" w:lastRow="0" w:firstColumn="0" w:lastColumn="0" w:oddVBand="0" w:evenVBand="0" w:oddHBand="0" w:evenHBand="0" w:firstRowFirstColumn="0" w:firstRowLastColumn="0" w:lastRowFirstColumn="0" w:lastRowLastColumn="0"/>
               <w:rPr>
                 <w:rFonts w:eastAsia="Times New Roman"/>
                 <w:lang w:val="en-NP" w:eastAsia="en-US"/>
@@ -5565,24 +5373,12 @@
         <w:tc>
           <w:tcPr>
             <w:tcW w:w="0" w:type="auto"/>
-            <w:tcBorders>
-              <w:top w:val="single" w:sz="6" w:space="0" w:color="000000"/>
-              <w:left w:val="single" w:sz="6" w:space="0" w:color="000000"/>
-              <w:bottom w:val="single" w:sz="6" w:space="0" w:color="000000"/>
-              <w:right w:val="single" w:sz="6" w:space="0" w:color="000000"/>
-            </w:tcBorders>
-            <w:shd w:val="clear" w:color="auto" w:fill="F8FAFD"/>
-            <w:tcMar>
-              <w:top w:w="120" w:type="dxa"/>
-              <w:left w:w="180" w:type="dxa"/>
-              <w:bottom w:w="120" w:type="dxa"/>
-              <w:right w:w="180" w:type="dxa"/>
-            </w:tcMar>
             <w:hideMark/>
           </w:tcPr>
           <w:p>
             <w:pPr>
-              <w:spacing w:after="0" w:line="360" w:lineRule="auto"/>
+              <w:spacing w:line="360" w:lineRule="auto"/>
+              <w:cnfStyle w:val="000000000000" w:firstRow="0" w:lastRow="0" w:firstColumn="0" w:lastColumn="0" w:oddVBand="0" w:evenVBand="0" w:oddHBand="0" w:evenHBand="0" w:firstRowFirstColumn="0" w:firstRowLastColumn="0" w:lastRowFirstColumn="0" w:lastRowLastColumn="0"/>
               <w:rPr>
                 <w:rFonts w:eastAsia="Times New Roman"/>
                 <w:lang w:val="en-NP" w:eastAsia="en-US"/>
@@ -5601,24 +5397,12 @@
         <w:tc>
           <w:tcPr>
             <w:tcW w:w="0" w:type="auto"/>
-            <w:tcBorders>
-              <w:top w:val="single" w:sz="6" w:space="0" w:color="000000"/>
-              <w:left w:val="single" w:sz="6" w:space="0" w:color="000000"/>
-              <w:bottom w:val="single" w:sz="6" w:space="0" w:color="000000"/>
-              <w:right w:val="single" w:sz="6" w:space="0" w:color="000000"/>
-            </w:tcBorders>
-            <w:shd w:val="clear" w:color="auto" w:fill="F8FAFD"/>
-            <w:tcMar>
-              <w:top w:w="120" w:type="dxa"/>
-              <w:left w:w="180" w:type="dxa"/>
-              <w:bottom w:w="120" w:type="dxa"/>
-              <w:right w:w="180" w:type="dxa"/>
-            </w:tcMar>
             <w:hideMark/>
           </w:tcPr>
           <w:p>
             <w:pPr>
-              <w:spacing w:after="0" w:line="360" w:lineRule="auto"/>
+              <w:spacing w:line="360" w:lineRule="auto"/>
+              <w:cnfStyle w:val="000000000000" w:firstRow="0" w:lastRow="0" w:firstColumn="0" w:lastColumn="0" w:oddVBand="0" w:evenVBand="0" w:oddHBand="0" w:evenHBand="0" w:firstRowFirstColumn="0" w:firstRowLastColumn="0" w:lastRowFirstColumn="0" w:lastRowLastColumn="0"/>
               <w:rPr>
                 <w:rFonts w:eastAsia="Times New Roman"/>
                 <w:lang w:val="en-NP" w:eastAsia="en-US"/>
@@ -5638,25 +5422,13 @@
       <w:tr>
         <w:tc>
           <w:tcPr>
+            <w:cnfStyle w:val="001000000000" w:firstRow="0" w:lastRow="0" w:firstColumn="1" w:lastColumn="0" w:oddVBand="0" w:evenVBand="0" w:oddHBand="0" w:evenHBand="0" w:firstRowFirstColumn="0" w:firstRowLastColumn="0" w:lastRowFirstColumn="0" w:lastRowLastColumn="0"/>
             <w:tcW w:w="0" w:type="auto"/>
-            <w:tcBorders>
-              <w:top w:val="single" w:sz="6" w:space="0" w:color="000000"/>
-              <w:left w:val="single" w:sz="6" w:space="0" w:color="000000"/>
-              <w:bottom w:val="single" w:sz="6" w:space="0" w:color="000000"/>
-              <w:right w:val="single" w:sz="6" w:space="0" w:color="000000"/>
-            </w:tcBorders>
-            <w:shd w:val="clear" w:color="auto" w:fill="F8FAFD"/>
-            <w:tcMar>
-              <w:top w:w="120" w:type="dxa"/>
-              <w:left w:w="180" w:type="dxa"/>
-              <w:bottom w:w="120" w:type="dxa"/>
-              <w:right w:w="180" w:type="dxa"/>
-            </w:tcMar>
             <w:hideMark/>
           </w:tcPr>
           <w:p>
             <w:pPr>
-              <w:spacing w:after="0" w:line="360" w:lineRule="auto"/>
+              <w:spacing w:line="360" w:lineRule="auto"/>
               <w:rPr>
                 <w:rFonts w:eastAsia="Times New Roman"/>
                 <w:lang w:val="en-NP" w:eastAsia="en-US"/>
@@ -5675,24 +5447,12 @@
         <w:tc>
           <w:tcPr>
             <w:tcW w:w="0" w:type="auto"/>
-            <w:tcBorders>
-              <w:top w:val="single" w:sz="6" w:space="0" w:color="000000"/>
-              <w:left w:val="single" w:sz="6" w:space="0" w:color="000000"/>
-              <w:bottom w:val="single" w:sz="6" w:space="0" w:color="000000"/>
-              <w:right w:val="single" w:sz="6" w:space="0" w:color="000000"/>
-            </w:tcBorders>
-            <w:shd w:val="clear" w:color="auto" w:fill="F8FAFD"/>
-            <w:tcMar>
-              <w:top w:w="120" w:type="dxa"/>
-              <w:left w:w="180" w:type="dxa"/>
-              <w:bottom w:w="120" w:type="dxa"/>
-              <w:right w:w="180" w:type="dxa"/>
-            </w:tcMar>
             <w:hideMark/>
           </w:tcPr>
           <w:p>
             <w:pPr>
-              <w:spacing w:after="0" w:line="360" w:lineRule="auto"/>
+              <w:spacing w:line="360" w:lineRule="auto"/>
+              <w:cnfStyle w:val="000000000000" w:firstRow="0" w:lastRow="0" w:firstColumn="0" w:lastColumn="0" w:oddVBand="0" w:evenVBand="0" w:oddHBand="0" w:evenHBand="0" w:firstRowFirstColumn="0" w:firstRowLastColumn="0" w:lastRowFirstColumn="0" w:lastRowLastColumn="0"/>
               <w:rPr>
                 <w:rFonts w:eastAsia="Times New Roman"/>
                 <w:lang w:val="en-NP" w:eastAsia="en-US"/>
@@ -5711,24 +5471,12 @@
         <w:tc>
           <w:tcPr>
             <w:tcW w:w="0" w:type="auto"/>
-            <w:tcBorders>
-              <w:top w:val="single" w:sz="6" w:space="0" w:color="000000"/>
-              <w:left w:val="single" w:sz="6" w:space="0" w:color="000000"/>
-              <w:bottom w:val="single" w:sz="6" w:space="0" w:color="000000"/>
-              <w:right w:val="single" w:sz="6" w:space="0" w:color="000000"/>
-            </w:tcBorders>
-            <w:shd w:val="clear" w:color="auto" w:fill="F8FAFD"/>
-            <w:tcMar>
-              <w:top w:w="120" w:type="dxa"/>
-              <w:left w:w="180" w:type="dxa"/>
-              <w:bottom w:w="120" w:type="dxa"/>
-              <w:right w:w="180" w:type="dxa"/>
-            </w:tcMar>
             <w:hideMark/>
           </w:tcPr>
           <w:p>
             <w:pPr>
-              <w:spacing w:after="0" w:line="360" w:lineRule="auto"/>
+              <w:spacing w:line="360" w:lineRule="auto"/>
+              <w:cnfStyle w:val="000000000000" w:firstRow="0" w:lastRow="0" w:firstColumn="0" w:lastColumn="0" w:oddVBand="0" w:evenVBand="0" w:oddHBand="0" w:evenHBand="0" w:firstRowFirstColumn="0" w:firstRowLastColumn="0" w:lastRowFirstColumn="0" w:lastRowLastColumn="0"/>
               <w:rPr>
                 <w:rFonts w:eastAsia="Times New Roman"/>
                 <w:lang w:val="en-NP" w:eastAsia="en-US"/>
@@ -5747,24 +5495,12 @@
         <w:tc>
           <w:tcPr>
             <w:tcW w:w="0" w:type="auto"/>
-            <w:tcBorders>
-              <w:top w:val="single" w:sz="6" w:space="0" w:color="000000"/>
-              <w:left w:val="single" w:sz="6" w:space="0" w:color="000000"/>
-              <w:bottom w:val="single" w:sz="6" w:space="0" w:color="000000"/>
-              <w:right w:val="single" w:sz="6" w:space="0" w:color="000000"/>
-            </w:tcBorders>
-            <w:shd w:val="clear" w:color="auto" w:fill="F8FAFD"/>
-            <w:tcMar>
-              <w:top w:w="120" w:type="dxa"/>
-              <w:left w:w="180" w:type="dxa"/>
-              <w:bottom w:w="120" w:type="dxa"/>
-              <w:right w:w="180" w:type="dxa"/>
-            </w:tcMar>
             <w:hideMark/>
           </w:tcPr>
           <w:p>
             <w:pPr>
-              <w:spacing w:after="0" w:line="360" w:lineRule="auto"/>
+              <w:spacing w:line="360" w:lineRule="auto"/>
+              <w:cnfStyle w:val="000000000000" w:firstRow="0" w:lastRow="0" w:firstColumn="0" w:lastColumn="0" w:oddVBand="0" w:evenVBand="0" w:oddHBand="0" w:evenHBand="0" w:firstRowFirstColumn="0" w:firstRowLastColumn="0" w:lastRowFirstColumn="0" w:lastRowLastColumn="0"/>
               <w:rPr>
                 <w:rFonts w:eastAsia="Times New Roman"/>
                 <w:lang w:val="en-NP" w:eastAsia="en-US"/>
@@ -5784,25 +5520,13 @@
       <w:tr>
         <w:tc>
           <w:tcPr>
+            <w:cnfStyle w:val="001000000000" w:firstRow="0" w:lastRow="0" w:firstColumn="1" w:lastColumn="0" w:oddVBand="0" w:evenVBand="0" w:oddHBand="0" w:evenHBand="0" w:firstRowFirstColumn="0" w:firstRowLastColumn="0" w:lastRowFirstColumn="0" w:lastRowLastColumn="0"/>
             <w:tcW w:w="0" w:type="auto"/>
-            <w:tcBorders>
-              <w:top w:val="single" w:sz="6" w:space="0" w:color="000000"/>
-              <w:left w:val="single" w:sz="6" w:space="0" w:color="000000"/>
-              <w:bottom w:val="single" w:sz="6" w:space="0" w:color="000000"/>
-              <w:right w:val="single" w:sz="6" w:space="0" w:color="000000"/>
-            </w:tcBorders>
-            <w:shd w:val="clear" w:color="auto" w:fill="F8FAFD"/>
-            <w:tcMar>
-              <w:top w:w="120" w:type="dxa"/>
-              <w:left w:w="180" w:type="dxa"/>
-              <w:bottom w:w="120" w:type="dxa"/>
-              <w:right w:w="180" w:type="dxa"/>
-            </w:tcMar>
             <w:hideMark/>
           </w:tcPr>
           <w:p>
             <w:pPr>
-              <w:spacing w:after="0" w:line="360" w:lineRule="auto"/>
+              <w:spacing w:line="360" w:lineRule="auto"/>
               <w:rPr>
                 <w:rFonts w:eastAsia="Times New Roman"/>
                 <w:lang w:val="en-NP" w:eastAsia="en-US"/>
@@ -5821,24 +5545,12 @@
         <w:tc>
           <w:tcPr>
             <w:tcW w:w="0" w:type="auto"/>
-            <w:tcBorders>
-              <w:top w:val="single" w:sz="6" w:space="0" w:color="000000"/>
-              <w:left w:val="single" w:sz="6" w:space="0" w:color="000000"/>
-              <w:bottom w:val="single" w:sz="6" w:space="0" w:color="000000"/>
-              <w:right w:val="single" w:sz="6" w:space="0" w:color="000000"/>
-            </w:tcBorders>
-            <w:shd w:val="clear" w:color="auto" w:fill="F8FAFD"/>
-            <w:tcMar>
-              <w:top w:w="120" w:type="dxa"/>
-              <w:left w:w="180" w:type="dxa"/>
-              <w:bottom w:w="120" w:type="dxa"/>
-              <w:right w:w="180" w:type="dxa"/>
-            </w:tcMar>
             <w:hideMark/>
           </w:tcPr>
           <w:p>
             <w:pPr>
-              <w:spacing w:after="0" w:line="360" w:lineRule="auto"/>
+              <w:spacing w:line="360" w:lineRule="auto"/>
+              <w:cnfStyle w:val="000000000000" w:firstRow="0" w:lastRow="0" w:firstColumn="0" w:lastColumn="0" w:oddVBand="0" w:evenVBand="0" w:oddHBand="0" w:evenHBand="0" w:firstRowFirstColumn="0" w:firstRowLastColumn="0" w:lastRowFirstColumn="0" w:lastRowLastColumn="0"/>
               <w:rPr>
                 <w:rFonts w:eastAsia="Times New Roman"/>
                 <w:lang w:val="en-NP" w:eastAsia="en-US"/>
@@ -5857,24 +5569,12 @@
         <w:tc>
           <w:tcPr>
             <w:tcW w:w="0" w:type="auto"/>
-            <w:tcBorders>
-              <w:top w:val="single" w:sz="6" w:space="0" w:color="000000"/>
-              <w:left w:val="single" w:sz="6" w:space="0" w:color="000000"/>
-              <w:bottom w:val="single" w:sz="6" w:space="0" w:color="000000"/>
-              <w:right w:val="single" w:sz="6" w:space="0" w:color="000000"/>
-            </w:tcBorders>
-            <w:shd w:val="clear" w:color="auto" w:fill="F8FAFD"/>
-            <w:tcMar>
-              <w:top w:w="120" w:type="dxa"/>
-              <w:left w:w="180" w:type="dxa"/>
-              <w:bottom w:w="120" w:type="dxa"/>
-              <w:right w:w="180" w:type="dxa"/>
-            </w:tcMar>
             <w:hideMark/>
           </w:tcPr>
           <w:p>
             <w:pPr>
-              <w:spacing w:after="0" w:line="360" w:lineRule="auto"/>
+              <w:spacing w:line="360" w:lineRule="auto"/>
+              <w:cnfStyle w:val="000000000000" w:firstRow="0" w:lastRow="0" w:firstColumn="0" w:lastColumn="0" w:oddVBand="0" w:evenVBand="0" w:oddHBand="0" w:evenHBand="0" w:firstRowFirstColumn="0" w:firstRowLastColumn="0" w:lastRowFirstColumn="0" w:lastRowLastColumn="0"/>
               <w:rPr>
                 <w:rFonts w:eastAsia="Times New Roman"/>
                 <w:lang w:val="en-NP" w:eastAsia="en-US"/>
@@ -5893,24 +5593,12 @@
         <w:tc>
           <w:tcPr>
             <w:tcW w:w="0" w:type="auto"/>
-            <w:tcBorders>
-              <w:top w:val="single" w:sz="6" w:space="0" w:color="000000"/>
-              <w:left w:val="single" w:sz="6" w:space="0" w:color="000000"/>
-              <w:bottom w:val="single" w:sz="6" w:space="0" w:color="000000"/>
-              <w:right w:val="single" w:sz="6" w:space="0" w:color="000000"/>
-            </w:tcBorders>
-            <w:shd w:val="clear" w:color="auto" w:fill="F8FAFD"/>
-            <w:tcMar>
-              <w:top w:w="120" w:type="dxa"/>
-              <w:left w:w="180" w:type="dxa"/>
-              <w:bottom w:w="120" w:type="dxa"/>
-              <w:right w:w="180" w:type="dxa"/>
-            </w:tcMar>
             <w:hideMark/>
           </w:tcPr>
           <w:p>
             <w:pPr>
-              <w:spacing w:after="0" w:line="360" w:lineRule="auto"/>
+              <w:spacing w:line="360" w:lineRule="auto"/>
+              <w:cnfStyle w:val="000000000000" w:firstRow="0" w:lastRow="0" w:firstColumn="0" w:lastColumn="0" w:oddVBand="0" w:evenVBand="0" w:oddHBand="0" w:evenHBand="0" w:firstRowFirstColumn="0" w:firstRowLastColumn="0" w:lastRowFirstColumn="0" w:lastRowLastColumn="0"/>
               <w:rPr>
                 <w:rFonts w:eastAsia="Times New Roman"/>
                 <w:lang w:val="en-NP" w:eastAsia="en-US"/>
@@ -5930,25 +5618,13 @@
       <w:tr>
         <w:tc>
           <w:tcPr>
+            <w:cnfStyle w:val="001000000000" w:firstRow="0" w:lastRow="0" w:firstColumn="1" w:lastColumn="0" w:oddVBand="0" w:evenVBand="0" w:oddHBand="0" w:evenHBand="0" w:firstRowFirstColumn="0" w:firstRowLastColumn="0" w:lastRowFirstColumn="0" w:lastRowLastColumn="0"/>
             <w:tcW w:w="0" w:type="auto"/>
-            <w:tcBorders>
-              <w:top w:val="single" w:sz="6" w:space="0" w:color="000000"/>
-              <w:left w:val="single" w:sz="6" w:space="0" w:color="000000"/>
-              <w:bottom w:val="single" w:sz="6" w:space="0" w:color="000000"/>
-              <w:right w:val="single" w:sz="6" w:space="0" w:color="000000"/>
-            </w:tcBorders>
-            <w:shd w:val="clear" w:color="auto" w:fill="F8FAFD"/>
-            <w:tcMar>
-              <w:top w:w="120" w:type="dxa"/>
-              <w:left w:w="180" w:type="dxa"/>
-              <w:bottom w:w="120" w:type="dxa"/>
-              <w:right w:w="180" w:type="dxa"/>
-            </w:tcMar>
             <w:hideMark/>
           </w:tcPr>
           <w:p>
             <w:pPr>
-              <w:spacing w:after="0" w:line="360" w:lineRule="auto"/>
+              <w:spacing w:line="360" w:lineRule="auto"/>
               <w:rPr>
                 <w:rFonts w:eastAsia="Times New Roman"/>
                 <w:lang w:val="en-NP" w:eastAsia="en-US"/>
@@ -5960,7 +5636,6 @@
                 <w:color w:val="1F1F1F"/>
                 <w:lang w:val="en-NP" w:eastAsia="en-US"/>
               </w:rPr>
-              <w:lastRenderedPageBreak/>
               <w:t>Age Group</w:t>
             </w:r>
           </w:p>
@@ -5968,24 +5643,12 @@
         <w:tc>
           <w:tcPr>
             <w:tcW w:w="0" w:type="auto"/>
-            <w:tcBorders>
-              <w:top w:val="single" w:sz="6" w:space="0" w:color="000000"/>
-              <w:left w:val="single" w:sz="6" w:space="0" w:color="000000"/>
-              <w:bottom w:val="single" w:sz="6" w:space="0" w:color="000000"/>
-              <w:right w:val="single" w:sz="6" w:space="0" w:color="000000"/>
-            </w:tcBorders>
-            <w:shd w:val="clear" w:color="auto" w:fill="F8FAFD"/>
-            <w:tcMar>
-              <w:top w:w="120" w:type="dxa"/>
-              <w:left w:w="180" w:type="dxa"/>
-              <w:bottom w:w="120" w:type="dxa"/>
-              <w:right w:w="180" w:type="dxa"/>
-            </w:tcMar>
             <w:hideMark/>
           </w:tcPr>
           <w:p>
             <w:pPr>
-              <w:spacing w:after="0" w:line="360" w:lineRule="auto"/>
+              <w:spacing w:line="360" w:lineRule="auto"/>
+              <w:cnfStyle w:val="000000000000" w:firstRow="0" w:lastRow="0" w:firstColumn="0" w:lastColumn="0" w:oddVBand="0" w:evenVBand="0" w:oddHBand="0" w:evenHBand="0" w:firstRowFirstColumn="0" w:firstRowLastColumn="0" w:lastRowFirstColumn="0" w:lastRowLastColumn="0"/>
               <w:rPr>
                 <w:rFonts w:eastAsia="Times New Roman"/>
                 <w:lang w:val="en-NP" w:eastAsia="en-US"/>
@@ -6004,24 +5667,12 @@
         <w:tc>
           <w:tcPr>
             <w:tcW w:w="0" w:type="auto"/>
-            <w:tcBorders>
-              <w:top w:val="single" w:sz="6" w:space="0" w:color="000000"/>
-              <w:left w:val="single" w:sz="6" w:space="0" w:color="000000"/>
-              <w:bottom w:val="single" w:sz="6" w:space="0" w:color="000000"/>
-              <w:right w:val="single" w:sz="6" w:space="0" w:color="000000"/>
-            </w:tcBorders>
-            <w:shd w:val="clear" w:color="auto" w:fill="F8FAFD"/>
-            <w:tcMar>
-              <w:top w:w="120" w:type="dxa"/>
-              <w:left w:w="180" w:type="dxa"/>
-              <w:bottom w:w="120" w:type="dxa"/>
-              <w:right w:w="180" w:type="dxa"/>
-            </w:tcMar>
             <w:hideMark/>
           </w:tcPr>
           <w:p>
             <w:pPr>
-              <w:spacing w:after="0" w:line="360" w:lineRule="auto"/>
+              <w:spacing w:line="360" w:lineRule="auto"/>
+              <w:cnfStyle w:val="000000000000" w:firstRow="0" w:lastRow="0" w:firstColumn="0" w:lastColumn="0" w:oddVBand="0" w:evenVBand="0" w:oddHBand="0" w:evenHBand="0" w:firstRowFirstColumn="0" w:firstRowLastColumn="0" w:lastRowFirstColumn="0" w:lastRowLastColumn="0"/>
               <w:rPr>
                 <w:rFonts w:eastAsia="Times New Roman"/>
                 <w:lang w:val="en-NP" w:eastAsia="en-US"/>
@@ -6040,24 +5691,12 @@
         <w:tc>
           <w:tcPr>
             <w:tcW w:w="0" w:type="auto"/>
-            <w:tcBorders>
-              <w:top w:val="single" w:sz="6" w:space="0" w:color="000000"/>
-              <w:left w:val="single" w:sz="6" w:space="0" w:color="000000"/>
-              <w:bottom w:val="single" w:sz="6" w:space="0" w:color="000000"/>
-              <w:right w:val="single" w:sz="6" w:space="0" w:color="000000"/>
-            </w:tcBorders>
-            <w:shd w:val="clear" w:color="auto" w:fill="F8FAFD"/>
-            <w:tcMar>
-              <w:top w:w="120" w:type="dxa"/>
-              <w:left w:w="180" w:type="dxa"/>
-              <w:bottom w:w="120" w:type="dxa"/>
-              <w:right w:w="180" w:type="dxa"/>
-            </w:tcMar>
             <w:hideMark/>
           </w:tcPr>
           <w:p>
             <w:pPr>
-              <w:spacing w:after="0" w:line="360" w:lineRule="auto"/>
+              <w:spacing w:line="360" w:lineRule="auto"/>
+              <w:cnfStyle w:val="000000000000" w:firstRow="0" w:lastRow="0" w:firstColumn="0" w:lastColumn="0" w:oddVBand="0" w:evenVBand="0" w:oddHBand="0" w:evenHBand="0" w:firstRowFirstColumn="0" w:firstRowLastColumn="0" w:lastRowFirstColumn="0" w:lastRowLastColumn="0"/>
               <w:rPr>
                 <w:rFonts w:eastAsia="Times New Roman"/>
                 <w:lang w:val="en-NP" w:eastAsia="en-US"/>
@@ -6077,25 +5716,13 @@
       <w:tr>
         <w:tc>
           <w:tcPr>
+            <w:cnfStyle w:val="001000000000" w:firstRow="0" w:lastRow="0" w:firstColumn="1" w:lastColumn="0" w:oddVBand="0" w:evenVBand="0" w:oddHBand="0" w:evenHBand="0" w:firstRowFirstColumn="0" w:firstRowLastColumn="0" w:lastRowFirstColumn="0" w:lastRowLastColumn="0"/>
             <w:tcW w:w="0" w:type="auto"/>
-            <w:tcBorders>
-              <w:top w:val="single" w:sz="6" w:space="0" w:color="000000"/>
-              <w:left w:val="single" w:sz="6" w:space="0" w:color="000000"/>
-              <w:bottom w:val="single" w:sz="6" w:space="0" w:color="000000"/>
-              <w:right w:val="single" w:sz="6" w:space="0" w:color="000000"/>
-            </w:tcBorders>
-            <w:shd w:val="clear" w:color="auto" w:fill="F8FAFD"/>
-            <w:tcMar>
-              <w:top w:w="120" w:type="dxa"/>
-              <w:left w:w="180" w:type="dxa"/>
-              <w:bottom w:w="120" w:type="dxa"/>
-              <w:right w:w="180" w:type="dxa"/>
-            </w:tcMar>
             <w:hideMark/>
           </w:tcPr>
           <w:p>
             <w:pPr>
-              <w:spacing w:after="0" w:line="360" w:lineRule="auto"/>
+              <w:spacing w:line="360" w:lineRule="auto"/>
               <w:rPr>
                 <w:rFonts w:eastAsia="Times New Roman"/>
                 <w:lang w:val="en-NP" w:eastAsia="en-US"/>
@@ -6114,24 +5741,12 @@
         <w:tc>
           <w:tcPr>
             <w:tcW w:w="0" w:type="auto"/>
-            <w:tcBorders>
-              <w:top w:val="single" w:sz="6" w:space="0" w:color="000000"/>
-              <w:left w:val="single" w:sz="6" w:space="0" w:color="000000"/>
-              <w:bottom w:val="single" w:sz="6" w:space="0" w:color="000000"/>
-              <w:right w:val="single" w:sz="6" w:space="0" w:color="000000"/>
-            </w:tcBorders>
-            <w:shd w:val="clear" w:color="auto" w:fill="F8FAFD"/>
-            <w:tcMar>
-              <w:top w:w="120" w:type="dxa"/>
-              <w:left w:w="180" w:type="dxa"/>
-              <w:bottom w:w="120" w:type="dxa"/>
-              <w:right w:w="180" w:type="dxa"/>
-            </w:tcMar>
             <w:hideMark/>
           </w:tcPr>
           <w:p>
             <w:pPr>
-              <w:spacing w:after="0" w:line="360" w:lineRule="auto"/>
+              <w:spacing w:line="360" w:lineRule="auto"/>
+              <w:cnfStyle w:val="000000000000" w:firstRow="0" w:lastRow="0" w:firstColumn="0" w:lastColumn="0" w:oddVBand="0" w:evenVBand="0" w:oddHBand="0" w:evenHBand="0" w:firstRowFirstColumn="0" w:firstRowLastColumn="0" w:lastRowFirstColumn="0" w:lastRowLastColumn="0"/>
               <w:rPr>
                 <w:rFonts w:eastAsia="Times New Roman"/>
                 <w:lang w:val="en-NP" w:eastAsia="en-US"/>
@@ -6150,24 +5765,12 @@
         <w:tc>
           <w:tcPr>
             <w:tcW w:w="0" w:type="auto"/>
-            <w:tcBorders>
-              <w:top w:val="single" w:sz="6" w:space="0" w:color="000000"/>
-              <w:left w:val="single" w:sz="6" w:space="0" w:color="000000"/>
-              <w:bottom w:val="single" w:sz="6" w:space="0" w:color="000000"/>
-              <w:right w:val="single" w:sz="6" w:space="0" w:color="000000"/>
-            </w:tcBorders>
-            <w:shd w:val="clear" w:color="auto" w:fill="F8FAFD"/>
-            <w:tcMar>
-              <w:top w:w="120" w:type="dxa"/>
-              <w:left w:w="180" w:type="dxa"/>
-              <w:bottom w:w="120" w:type="dxa"/>
-              <w:right w:w="180" w:type="dxa"/>
-            </w:tcMar>
             <w:hideMark/>
           </w:tcPr>
           <w:p>
             <w:pPr>
-              <w:spacing w:after="0" w:line="360" w:lineRule="auto"/>
+              <w:spacing w:line="360" w:lineRule="auto"/>
+              <w:cnfStyle w:val="000000000000" w:firstRow="0" w:lastRow="0" w:firstColumn="0" w:lastColumn="0" w:oddVBand="0" w:evenVBand="0" w:oddHBand="0" w:evenHBand="0" w:firstRowFirstColumn="0" w:firstRowLastColumn="0" w:lastRowFirstColumn="0" w:lastRowLastColumn="0"/>
               <w:rPr>
                 <w:rFonts w:eastAsia="Times New Roman"/>
                 <w:lang w:val="en-NP" w:eastAsia="en-US"/>
@@ -6186,24 +5789,12 @@
         <w:tc>
           <w:tcPr>
             <w:tcW w:w="0" w:type="auto"/>
-            <w:tcBorders>
-              <w:top w:val="single" w:sz="6" w:space="0" w:color="000000"/>
-              <w:left w:val="single" w:sz="6" w:space="0" w:color="000000"/>
-              <w:bottom w:val="single" w:sz="6" w:space="0" w:color="000000"/>
-              <w:right w:val="single" w:sz="6" w:space="0" w:color="000000"/>
-            </w:tcBorders>
-            <w:shd w:val="clear" w:color="auto" w:fill="F8FAFD"/>
-            <w:tcMar>
-              <w:top w:w="120" w:type="dxa"/>
-              <w:left w:w="180" w:type="dxa"/>
-              <w:bottom w:w="120" w:type="dxa"/>
-              <w:right w:w="180" w:type="dxa"/>
-            </w:tcMar>
             <w:hideMark/>
           </w:tcPr>
           <w:p>
             <w:pPr>
-              <w:spacing w:after="0" w:line="360" w:lineRule="auto"/>
+              <w:spacing w:line="360" w:lineRule="auto"/>
+              <w:cnfStyle w:val="000000000000" w:firstRow="0" w:lastRow="0" w:firstColumn="0" w:lastColumn="0" w:oddVBand="0" w:evenVBand="0" w:oddHBand="0" w:evenHBand="0" w:firstRowFirstColumn="0" w:firstRowLastColumn="0" w:lastRowFirstColumn="0" w:lastRowLastColumn="0"/>
               <w:rPr>
                 <w:rFonts w:eastAsia="Times New Roman"/>
                 <w:lang w:val="en-NP" w:eastAsia="en-US"/>
@@ -6223,25 +5814,13 @@
       <w:tr>
         <w:tc>
           <w:tcPr>
+            <w:cnfStyle w:val="001000000000" w:firstRow="0" w:lastRow="0" w:firstColumn="1" w:lastColumn="0" w:oddVBand="0" w:evenVBand="0" w:oddHBand="0" w:evenHBand="0" w:firstRowFirstColumn="0" w:firstRowLastColumn="0" w:lastRowFirstColumn="0" w:lastRowLastColumn="0"/>
             <w:tcW w:w="0" w:type="auto"/>
-            <w:tcBorders>
-              <w:top w:val="single" w:sz="6" w:space="0" w:color="000000"/>
-              <w:left w:val="single" w:sz="6" w:space="0" w:color="000000"/>
-              <w:bottom w:val="single" w:sz="6" w:space="0" w:color="000000"/>
-              <w:right w:val="single" w:sz="6" w:space="0" w:color="000000"/>
-            </w:tcBorders>
-            <w:shd w:val="clear" w:color="auto" w:fill="F8FAFD"/>
-            <w:tcMar>
-              <w:top w:w="120" w:type="dxa"/>
-              <w:left w:w="180" w:type="dxa"/>
-              <w:bottom w:w="120" w:type="dxa"/>
-              <w:right w:w="180" w:type="dxa"/>
-            </w:tcMar>
             <w:hideMark/>
           </w:tcPr>
           <w:p>
             <w:pPr>
-              <w:spacing w:after="0" w:line="360" w:lineRule="auto"/>
+              <w:spacing w:line="360" w:lineRule="auto"/>
               <w:rPr>
                 <w:rFonts w:eastAsia="Times New Roman"/>
                 <w:lang w:val="en-NP" w:eastAsia="en-US"/>
@@ -6260,24 +5839,12 @@
         <w:tc>
           <w:tcPr>
             <w:tcW w:w="0" w:type="auto"/>
-            <w:tcBorders>
-              <w:top w:val="single" w:sz="6" w:space="0" w:color="000000"/>
-              <w:left w:val="single" w:sz="6" w:space="0" w:color="000000"/>
-              <w:bottom w:val="single" w:sz="6" w:space="0" w:color="000000"/>
-              <w:right w:val="single" w:sz="6" w:space="0" w:color="000000"/>
-            </w:tcBorders>
-            <w:shd w:val="clear" w:color="auto" w:fill="F8FAFD"/>
-            <w:tcMar>
-              <w:top w:w="120" w:type="dxa"/>
-              <w:left w:w="180" w:type="dxa"/>
-              <w:bottom w:w="120" w:type="dxa"/>
-              <w:right w:w="180" w:type="dxa"/>
-            </w:tcMar>
             <w:hideMark/>
           </w:tcPr>
           <w:p>
             <w:pPr>
-              <w:spacing w:after="0" w:line="360" w:lineRule="auto"/>
+              <w:spacing w:line="360" w:lineRule="auto"/>
+              <w:cnfStyle w:val="000000000000" w:firstRow="0" w:lastRow="0" w:firstColumn="0" w:lastColumn="0" w:oddVBand="0" w:evenVBand="0" w:oddHBand="0" w:evenHBand="0" w:firstRowFirstColumn="0" w:firstRowLastColumn="0" w:lastRowFirstColumn="0" w:lastRowLastColumn="0"/>
               <w:rPr>
                 <w:rFonts w:eastAsia="Times New Roman"/>
                 <w:lang w:val="en-NP" w:eastAsia="en-US"/>
@@ -6296,24 +5863,12 @@
         <w:tc>
           <w:tcPr>
             <w:tcW w:w="0" w:type="auto"/>
-            <w:tcBorders>
-              <w:top w:val="single" w:sz="6" w:space="0" w:color="000000"/>
-              <w:left w:val="single" w:sz="6" w:space="0" w:color="000000"/>
-              <w:bottom w:val="single" w:sz="6" w:space="0" w:color="000000"/>
-              <w:right w:val="single" w:sz="6" w:space="0" w:color="000000"/>
-            </w:tcBorders>
-            <w:shd w:val="clear" w:color="auto" w:fill="F8FAFD"/>
-            <w:tcMar>
-              <w:top w:w="120" w:type="dxa"/>
-              <w:left w:w="180" w:type="dxa"/>
-              <w:bottom w:w="120" w:type="dxa"/>
-              <w:right w:w="180" w:type="dxa"/>
-            </w:tcMar>
             <w:hideMark/>
           </w:tcPr>
           <w:p>
             <w:pPr>
-              <w:spacing w:after="0" w:line="360" w:lineRule="auto"/>
+              <w:spacing w:line="360" w:lineRule="auto"/>
+              <w:cnfStyle w:val="000000000000" w:firstRow="0" w:lastRow="0" w:firstColumn="0" w:lastColumn="0" w:oddVBand="0" w:evenVBand="0" w:oddHBand="0" w:evenHBand="0" w:firstRowFirstColumn="0" w:firstRowLastColumn="0" w:lastRowFirstColumn="0" w:lastRowLastColumn="0"/>
               <w:rPr>
                 <w:rFonts w:eastAsia="Times New Roman"/>
                 <w:lang w:val="en-NP" w:eastAsia="en-US"/>
@@ -6332,24 +5887,12 @@
         <w:tc>
           <w:tcPr>
             <w:tcW w:w="0" w:type="auto"/>
-            <w:tcBorders>
-              <w:top w:val="single" w:sz="6" w:space="0" w:color="000000"/>
-              <w:left w:val="single" w:sz="6" w:space="0" w:color="000000"/>
-              <w:bottom w:val="single" w:sz="6" w:space="0" w:color="000000"/>
-              <w:right w:val="single" w:sz="6" w:space="0" w:color="000000"/>
-            </w:tcBorders>
-            <w:shd w:val="clear" w:color="auto" w:fill="F8FAFD"/>
-            <w:tcMar>
-              <w:top w:w="120" w:type="dxa"/>
-              <w:left w:w="180" w:type="dxa"/>
-              <w:bottom w:w="120" w:type="dxa"/>
-              <w:right w:w="180" w:type="dxa"/>
-            </w:tcMar>
             <w:hideMark/>
           </w:tcPr>
           <w:p>
             <w:pPr>
-              <w:spacing w:after="0" w:line="360" w:lineRule="auto"/>
+              <w:spacing w:line="360" w:lineRule="auto"/>
+              <w:cnfStyle w:val="000000000000" w:firstRow="0" w:lastRow="0" w:firstColumn="0" w:lastColumn="0" w:oddVBand="0" w:evenVBand="0" w:oddHBand="0" w:evenHBand="0" w:firstRowFirstColumn="0" w:firstRowLastColumn="0" w:lastRowFirstColumn="0" w:lastRowLastColumn="0"/>
               <w:rPr>
                 <w:rFonts w:eastAsia="Times New Roman"/>
                 <w:lang w:val="en-NP" w:eastAsia="en-US"/>
@@ -6369,25 +5912,13 @@
       <w:tr>
         <w:tc>
           <w:tcPr>
+            <w:cnfStyle w:val="001000000000" w:firstRow="0" w:lastRow="0" w:firstColumn="1" w:lastColumn="0" w:oddVBand="0" w:evenVBand="0" w:oddHBand="0" w:evenHBand="0" w:firstRowFirstColumn="0" w:firstRowLastColumn="0" w:lastRowFirstColumn="0" w:lastRowLastColumn="0"/>
             <w:tcW w:w="0" w:type="auto"/>
-            <w:tcBorders>
-              <w:top w:val="single" w:sz="6" w:space="0" w:color="000000"/>
-              <w:left w:val="single" w:sz="6" w:space="0" w:color="000000"/>
-              <w:bottom w:val="single" w:sz="6" w:space="0" w:color="000000"/>
-              <w:right w:val="single" w:sz="6" w:space="0" w:color="000000"/>
-            </w:tcBorders>
-            <w:shd w:val="clear" w:color="auto" w:fill="F8FAFD"/>
-            <w:tcMar>
-              <w:top w:w="120" w:type="dxa"/>
-              <w:left w:w="180" w:type="dxa"/>
-              <w:bottom w:w="120" w:type="dxa"/>
-              <w:right w:w="180" w:type="dxa"/>
-            </w:tcMar>
             <w:hideMark/>
           </w:tcPr>
           <w:p>
             <w:pPr>
-              <w:spacing w:after="0" w:line="360" w:lineRule="auto"/>
+              <w:spacing w:line="360" w:lineRule="auto"/>
               <w:rPr>
                 <w:rFonts w:eastAsia="Times New Roman"/>
                 <w:lang w:val="en-NP" w:eastAsia="en-US"/>
@@ -6399,6 +5930,7 @@
                 <w:color w:val="1F1F1F"/>
                 <w:lang w:val="en-NP" w:eastAsia="en-US"/>
               </w:rPr>
+              <w:lastRenderedPageBreak/>
               <w:t>State</w:t>
             </w:r>
           </w:p>
@@ -6406,24 +5938,12 @@
         <w:tc>
           <w:tcPr>
             <w:tcW w:w="0" w:type="auto"/>
-            <w:tcBorders>
-              <w:top w:val="single" w:sz="6" w:space="0" w:color="000000"/>
-              <w:left w:val="single" w:sz="6" w:space="0" w:color="000000"/>
-              <w:bottom w:val="single" w:sz="6" w:space="0" w:color="000000"/>
-              <w:right w:val="single" w:sz="6" w:space="0" w:color="000000"/>
-            </w:tcBorders>
-            <w:shd w:val="clear" w:color="auto" w:fill="F8FAFD"/>
-            <w:tcMar>
-              <w:top w:w="120" w:type="dxa"/>
-              <w:left w:w="180" w:type="dxa"/>
-              <w:bottom w:w="120" w:type="dxa"/>
-              <w:right w:w="180" w:type="dxa"/>
-            </w:tcMar>
             <w:hideMark/>
           </w:tcPr>
           <w:p>
             <w:pPr>
-              <w:spacing w:after="0" w:line="360" w:lineRule="auto"/>
+              <w:spacing w:line="360" w:lineRule="auto"/>
+              <w:cnfStyle w:val="000000000000" w:firstRow="0" w:lastRow="0" w:firstColumn="0" w:lastColumn="0" w:oddVBand="0" w:evenVBand="0" w:oddHBand="0" w:evenHBand="0" w:firstRowFirstColumn="0" w:firstRowLastColumn="0" w:lastRowFirstColumn="0" w:lastRowLastColumn="0"/>
               <w:rPr>
                 <w:rFonts w:eastAsia="Times New Roman"/>
                 <w:lang w:val="en-NP" w:eastAsia="en-US"/>
@@ -6442,24 +5962,12 @@
         <w:tc>
           <w:tcPr>
             <w:tcW w:w="0" w:type="auto"/>
-            <w:tcBorders>
-              <w:top w:val="single" w:sz="6" w:space="0" w:color="000000"/>
-              <w:left w:val="single" w:sz="6" w:space="0" w:color="000000"/>
-              <w:bottom w:val="single" w:sz="6" w:space="0" w:color="000000"/>
-              <w:right w:val="single" w:sz="6" w:space="0" w:color="000000"/>
-            </w:tcBorders>
-            <w:shd w:val="clear" w:color="auto" w:fill="F8FAFD"/>
-            <w:tcMar>
-              <w:top w:w="120" w:type="dxa"/>
-              <w:left w:w="180" w:type="dxa"/>
-              <w:bottom w:w="120" w:type="dxa"/>
-              <w:right w:w="180" w:type="dxa"/>
-            </w:tcMar>
             <w:hideMark/>
           </w:tcPr>
           <w:p>
             <w:pPr>
-              <w:spacing w:after="0" w:line="360" w:lineRule="auto"/>
+              <w:spacing w:line="360" w:lineRule="auto"/>
+              <w:cnfStyle w:val="000000000000" w:firstRow="0" w:lastRow="0" w:firstColumn="0" w:lastColumn="0" w:oddVBand="0" w:evenVBand="0" w:oddHBand="0" w:evenHBand="0" w:firstRowFirstColumn="0" w:firstRowLastColumn="0" w:lastRowFirstColumn="0" w:lastRowLastColumn="0"/>
               <w:rPr>
                 <w:rFonts w:eastAsia="Times New Roman"/>
                 <w:lang w:val="en-NP" w:eastAsia="en-US"/>
@@ -6478,24 +5986,12 @@
         <w:tc>
           <w:tcPr>
             <w:tcW w:w="0" w:type="auto"/>
-            <w:tcBorders>
-              <w:top w:val="single" w:sz="6" w:space="0" w:color="000000"/>
-              <w:left w:val="single" w:sz="6" w:space="0" w:color="000000"/>
-              <w:bottom w:val="single" w:sz="6" w:space="0" w:color="000000"/>
-              <w:right w:val="single" w:sz="6" w:space="0" w:color="000000"/>
-            </w:tcBorders>
-            <w:shd w:val="clear" w:color="auto" w:fill="F8FAFD"/>
-            <w:tcMar>
-              <w:top w:w="120" w:type="dxa"/>
-              <w:left w:w="180" w:type="dxa"/>
-              <w:bottom w:w="120" w:type="dxa"/>
-              <w:right w:w="180" w:type="dxa"/>
-            </w:tcMar>
             <w:hideMark/>
           </w:tcPr>
           <w:p>
             <w:pPr>
-              <w:spacing w:after="0" w:line="360" w:lineRule="auto"/>
+              <w:spacing w:line="360" w:lineRule="auto"/>
+              <w:cnfStyle w:val="000000000000" w:firstRow="0" w:lastRow="0" w:firstColumn="0" w:lastColumn="0" w:oddVBand="0" w:evenVBand="0" w:oddHBand="0" w:evenHBand="0" w:firstRowFirstColumn="0" w:firstRowLastColumn="0" w:lastRowFirstColumn="0" w:lastRowLastColumn="0"/>
               <w:rPr>
                 <w:rFonts w:eastAsia="Times New Roman"/>
                 <w:lang w:val="en-NP" w:eastAsia="en-US"/>
@@ -6515,25 +6011,13 @@
       <w:tr>
         <w:tc>
           <w:tcPr>
+            <w:cnfStyle w:val="001000000000" w:firstRow="0" w:lastRow="0" w:firstColumn="1" w:lastColumn="0" w:oddVBand="0" w:evenVBand="0" w:oddHBand="0" w:evenHBand="0" w:firstRowFirstColumn="0" w:firstRowLastColumn="0" w:lastRowFirstColumn="0" w:lastRowLastColumn="0"/>
             <w:tcW w:w="0" w:type="auto"/>
-            <w:tcBorders>
-              <w:top w:val="single" w:sz="6" w:space="0" w:color="000000"/>
-              <w:left w:val="single" w:sz="6" w:space="0" w:color="000000"/>
-              <w:bottom w:val="single" w:sz="6" w:space="0" w:color="000000"/>
-              <w:right w:val="single" w:sz="6" w:space="0" w:color="000000"/>
-            </w:tcBorders>
-            <w:shd w:val="clear" w:color="auto" w:fill="F8FAFD"/>
-            <w:tcMar>
-              <w:top w:w="120" w:type="dxa"/>
-              <w:left w:w="180" w:type="dxa"/>
-              <w:bottom w:w="120" w:type="dxa"/>
-              <w:right w:w="180" w:type="dxa"/>
-            </w:tcMar>
             <w:hideMark/>
           </w:tcPr>
           <w:p>
             <w:pPr>
-              <w:spacing w:after="0" w:line="360" w:lineRule="auto"/>
+              <w:spacing w:line="360" w:lineRule="auto"/>
               <w:rPr>
                 <w:rFonts w:eastAsia="Times New Roman"/>
                 <w:lang w:val="en-NP" w:eastAsia="en-US"/>
@@ -6552,24 +6036,12 @@
         <w:tc>
           <w:tcPr>
             <w:tcW w:w="0" w:type="auto"/>
-            <w:tcBorders>
-              <w:top w:val="single" w:sz="6" w:space="0" w:color="000000"/>
-              <w:left w:val="single" w:sz="6" w:space="0" w:color="000000"/>
-              <w:bottom w:val="single" w:sz="6" w:space="0" w:color="000000"/>
-              <w:right w:val="single" w:sz="6" w:space="0" w:color="000000"/>
-            </w:tcBorders>
-            <w:shd w:val="clear" w:color="auto" w:fill="F8FAFD"/>
-            <w:tcMar>
-              <w:top w:w="120" w:type="dxa"/>
-              <w:left w:w="180" w:type="dxa"/>
-              <w:bottom w:w="120" w:type="dxa"/>
-              <w:right w:w="180" w:type="dxa"/>
-            </w:tcMar>
             <w:hideMark/>
           </w:tcPr>
           <w:p>
             <w:pPr>
-              <w:spacing w:after="0" w:line="360" w:lineRule="auto"/>
+              <w:spacing w:line="360" w:lineRule="auto"/>
+              <w:cnfStyle w:val="000000000000" w:firstRow="0" w:lastRow="0" w:firstColumn="0" w:lastColumn="0" w:oddVBand="0" w:evenVBand="0" w:oddHBand="0" w:evenHBand="0" w:firstRowFirstColumn="0" w:firstRowLastColumn="0" w:lastRowFirstColumn="0" w:lastRowLastColumn="0"/>
               <w:rPr>
                 <w:rFonts w:eastAsia="Times New Roman"/>
                 <w:lang w:val="en-NP" w:eastAsia="en-US"/>
@@ -6588,24 +6060,12 @@
         <w:tc>
           <w:tcPr>
             <w:tcW w:w="0" w:type="auto"/>
-            <w:tcBorders>
-              <w:top w:val="single" w:sz="6" w:space="0" w:color="000000"/>
-              <w:left w:val="single" w:sz="6" w:space="0" w:color="000000"/>
-              <w:bottom w:val="single" w:sz="6" w:space="0" w:color="000000"/>
-              <w:right w:val="single" w:sz="6" w:space="0" w:color="000000"/>
-            </w:tcBorders>
-            <w:shd w:val="clear" w:color="auto" w:fill="F8FAFD"/>
-            <w:tcMar>
-              <w:top w:w="120" w:type="dxa"/>
-              <w:left w:w="180" w:type="dxa"/>
-              <w:bottom w:w="120" w:type="dxa"/>
-              <w:right w:w="180" w:type="dxa"/>
-            </w:tcMar>
             <w:hideMark/>
           </w:tcPr>
           <w:p>
             <w:pPr>
-              <w:spacing w:after="0" w:line="360" w:lineRule="auto"/>
+              <w:spacing w:line="360" w:lineRule="auto"/>
+              <w:cnfStyle w:val="000000000000" w:firstRow="0" w:lastRow="0" w:firstColumn="0" w:lastColumn="0" w:oddVBand="0" w:evenVBand="0" w:oddHBand="0" w:evenHBand="0" w:firstRowFirstColumn="0" w:firstRowLastColumn="0" w:lastRowFirstColumn="0" w:lastRowLastColumn="0"/>
               <w:rPr>
                 <w:rFonts w:eastAsia="Times New Roman"/>
                 <w:lang w:val="en-NP" w:eastAsia="en-US"/>
@@ -6624,24 +6084,12 @@
         <w:tc>
           <w:tcPr>
             <w:tcW w:w="0" w:type="auto"/>
-            <w:tcBorders>
-              <w:top w:val="single" w:sz="6" w:space="0" w:color="000000"/>
-              <w:left w:val="single" w:sz="6" w:space="0" w:color="000000"/>
-              <w:bottom w:val="single" w:sz="6" w:space="0" w:color="000000"/>
-              <w:right w:val="single" w:sz="6" w:space="0" w:color="000000"/>
-            </w:tcBorders>
-            <w:shd w:val="clear" w:color="auto" w:fill="F8FAFD"/>
-            <w:tcMar>
-              <w:top w:w="120" w:type="dxa"/>
-              <w:left w:w="180" w:type="dxa"/>
-              <w:bottom w:w="120" w:type="dxa"/>
-              <w:right w:w="180" w:type="dxa"/>
-            </w:tcMar>
             <w:hideMark/>
           </w:tcPr>
           <w:p>
             <w:pPr>
-              <w:spacing w:after="0" w:line="360" w:lineRule="auto"/>
+              <w:spacing w:line="360" w:lineRule="auto"/>
+              <w:cnfStyle w:val="000000000000" w:firstRow="0" w:lastRow="0" w:firstColumn="0" w:lastColumn="0" w:oddVBand="0" w:evenVBand="0" w:oddHBand="0" w:evenHBand="0" w:firstRowFirstColumn="0" w:firstRowLastColumn="0" w:lastRowFirstColumn="0" w:lastRowLastColumn="0"/>
               <w:rPr>
                 <w:rFonts w:eastAsia="Times New Roman"/>
                 <w:lang w:val="en-NP" w:eastAsia="en-US"/>
@@ -6661,25 +6109,13 @@
       <w:tr>
         <w:tc>
           <w:tcPr>
+            <w:cnfStyle w:val="001000000000" w:firstRow="0" w:lastRow="0" w:firstColumn="1" w:lastColumn="0" w:oddVBand="0" w:evenVBand="0" w:oddHBand="0" w:evenHBand="0" w:firstRowFirstColumn="0" w:firstRowLastColumn="0" w:lastRowFirstColumn="0" w:lastRowLastColumn="0"/>
             <w:tcW w:w="0" w:type="auto"/>
-            <w:tcBorders>
-              <w:top w:val="single" w:sz="6" w:space="0" w:color="000000"/>
-              <w:left w:val="single" w:sz="6" w:space="0" w:color="000000"/>
-              <w:bottom w:val="single" w:sz="6" w:space="0" w:color="000000"/>
-              <w:right w:val="single" w:sz="6" w:space="0" w:color="000000"/>
-            </w:tcBorders>
-            <w:shd w:val="clear" w:color="auto" w:fill="F8FAFD"/>
-            <w:tcMar>
-              <w:top w:w="120" w:type="dxa"/>
-              <w:left w:w="180" w:type="dxa"/>
-              <w:bottom w:w="120" w:type="dxa"/>
-              <w:right w:w="180" w:type="dxa"/>
-            </w:tcMar>
             <w:hideMark/>
           </w:tcPr>
           <w:p>
             <w:pPr>
-              <w:spacing w:after="0" w:line="360" w:lineRule="auto"/>
+              <w:spacing w:line="360" w:lineRule="auto"/>
               <w:rPr>
                 <w:rFonts w:eastAsia="Times New Roman"/>
                 <w:lang w:val="en-NP" w:eastAsia="en-US"/>
@@ -6698,24 +6134,12 @@
         <w:tc>
           <w:tcPr>
             <w:tcW w:w="0" w:type="auto"/>
-            <w:tcBorders>
-              <w:top w:val="single" w:sz="6" w:space="0" w:color="000000"/>
-              <w:left w:val="single" w:sz="6" w:space="0" w:color="000000"/>
-              <w:bottom w:val="single" w:sz="6" w:space="0" w:color="000000"/>
-              <w:right w:val="single" w:sz="6" w:space="0" w:color="000000"/>
-            </w:tcBorders>
-            <w:shd w:val="clear" w:color="auto" w:fill="F8FAFD"/>
-            <w:tcMar>
-              <w:top w:w="120" w:type="dxa"/>
-              <w:left w:w="180" w:type="dxa"/>
-              <w:bottom w:w="120" w:type="dxa"/>
-              <w:right w:w="180" w:type="dxa"/>
-            </w:tcMar>
             <w:hideMark/>
           </w:tcPr>
           <w:p>
             <w:pPr>
-              <w:spacing w:after="0" w:line="360" w:lineRule="auto"/>
+              <w:spacing w:line="360" w:lineRule="auto"/>
+              <w:cnfStyle w:val="000000000000" w:firstRow="0" w:lastRow="0" w:firstColumn="0" w:lastColumn="0" w:oddVBand="0" w:evenVBand="0" w:oddHBand="0" w:evenHBand="0" w:firstRowFirstColumn="0" w:firstRowLastColumn="0" w:lastRowFirstColumn="0" w:lastRowLastColumn="0"/>
               <w:rPr>
                 <w:rFonts w:eastAsia="Times New Roman"/>
                 <w:lang w:val="en-NP" w:eastAsia="en-US"/>
@@ -6734,24 +6158,12 @@
         <w:tc>
           <w:tcPr>
             <w:tcW w:w="0" w:type="auto"/>
-            <w:tcBorders>
-              <w:top w:val="single" w:sz="6" w:space="0" w:color="000000"/>
-              <w:left w:val="single" w:sz="6" w:space="0" w:color="000000"/>
-              <w:bottom w:val="single" w:sz="6" w:space="0" w:color="000000"/>
-              <w:right w:val="single" w:sz="6" w:space="0" w:color="000000"/>
-            </w:tcBorders>
-            <w:shd w:val="clear" w:color="auto" w:fill="F8FAFD"/>
-            <w:tcMar>
-              <w:top w:w="120" w:type="dxa"/>
-              <w:left w:w="180" w:type="dxa"/>
-              <w:bottom w:w="120" w:type="dxa"/>
-              <w:right w:w="180" w:type="dxa"/>
-            </w:tcMar>
             <w:hideMark/>
           </w:tcPr>
           <w:p>
             <w:pPr>
-              <w:spacing w:after="0" w:line="360" w:lineRule="auto"/>
+              <w:spacing w:line="360" w:lineRule="auto"/>
+              <w:cnfStyle w:val="000000000000" w:firstRow="0" w:lastRow="0" w:firstColumn="0" w:lastColumn="0" w:oddVBand="0" w:evenVBand="0" w:oddHBand="0" w:evenHBand="0" w:firstRowFirstColumn="0" w:firstRowLastColumn="0" w:lastRowFirstColumn="0" w:lastRowLastColumn="0"/>
               <w:rPr>
                 <w:rFonts w:eastAsia="Times New Roman"/>
                 <w:lang w:val="en-NP" w:eastAsia="en-US"/>
@@ -6770,24 +6182,12 @@
         <w:tc>
           <w:tcPr>
             <w:tcW w:w="0" w:type="auto"/>
-            <w:tcBorders>
-              <w:top w:val="single" w:sz="6" w:space="0" w:color="000000"/>
-              <w:left w:val="single" w:sz="6" w:space="0" w:color="000000"/>
-              <w:bottom w:val="single" w:sz="6" w:space="0" w:color="000000"/>
-              <w:right w:val="single" w:sz="6" w:space="0" w:color="000000"/>
-            </w:tcBorders>
-            <w:shd w:val="clear" w:color="auto" w:fill="F8FAFD"/>
-            <w:tcMar>
-              <w:top w:w="120" w:type="dxa"/>
-              <w:left w:w="180" w:type="dxa"/>
-              <w:bottom w:w="120" w:type="dxa"/>
-              <w:right w:w="180" w:type="dxa"/>
-            </w:tcMar>
             <w:hideMark/>
           </w:tcPr>
           <w:p>
             <w:pPr>
-              <w:spacing w:after="0" w:line="360" w:lineRule="auto"/>
+              <w:spacing w:line="360" w:lineRule="auto"/>
+              <w:cnfStyle w:val="000000000000" w:firstRow="0" w:lastRow="0" w:firstColumn="0" w:lastColumn="0" w:oddVBand="0" w:evenVBand="0" w:oddHBand="0" w:evenHBand="0" w:firstRowFirstColumn="0" w:firstRowLastColumn="0" w:lastRowFirstColumn="0" w:lastRowLastColumn="0"/>
               <w:rPr>
                 <w:rFonts w:eastAsia="Times New Roman"/>
                 <w:lang w:val="en-NP" w:eastAsia="en-US"/>
@@ -6807,25 +6207,13 @@
       <w:tr>
         <w:tc>
           <w:tcPr>
+            <w:cnfStyle w:val="001000000000" w:firstRow="0" w:lastRow="0" w:firstColumn="1" w:lastColumn="0" w:oddVBand="0" w:evenVBand="0" w:oddHBand="0" w:evenHBand="0" w:firstRowFirstColumn="0" w:firstRowLastColumn="0" w:lastRowFirstColumn="0" w:lastRowLastColumn="0"/>
             <w:tcW w:w="0" w:type="auto"/>
-            <w:tcBorders>
-              <w:top w:val="single" w:sz="6" w:space="0" w:color="000000"/>
-              <w:left w:val="single" w:sz="6" w:space="0" w:color="000000"/>
-              <w:bottom w:val="single" w:sz="6" w:space="0" w:color="000000"/>
-              <w:right w:val="single" w:sz="6" w:space="0" w:color="000000"/>
-            </w:tcBorders>
-            <w:shd w:val="clear" w:color="auto" w:fill="F8FAFD"/>
-            <w:tcMar>
-              <w:top w:w="120" w:type="dxa"/>
-              <w:left w:w="180" w:type="dxa"/>
-              <w:bottom w:w="120" w:type="dxa"/>
-              <w:right w:w="180" w:type="dxa"/>
-            </w:tcMar>
             <w:hideMark/>
           </w:tcPr>
           <w:p>
             <w:pPr>
-              <w:spacing w:after="0" w:line="360" w:lineRule="auto"/>
+              <w:spacing w:line="360" w:lineRule="auto"/>
               <w:rPr>
                 <w:rFonts w:eastAsia="Times New Roman"/>
                 <w:lang w:val="en-NP" w:eastAsia="en-US"/>
@@ -6844,24 +6232,12 @@
         <w:tc>
           <w:tcPr>
             <w:tcW w:w="0" w:type="auto"/>
-            <w:tcBorders>
-              <w:top w:val="single" w:sz="6" w:space="0" w:color="000000"/>
-              <w:left w:val="single" w:sz="6" w:space="0" w:color="000000"/>
-              <w:bottom w:val="single" w:sz="6" w:space="0" w:color="000000"/>
-              <w:right w:val="single" w:sz="6" w:space="0" w:color="000000"/>
-            </w:tcBorders>
-            <w:shd w:val="clear" w:color="auto" w:fill="F8FAFD"/>
-            <w:tcMar>
-              <w:top w:w="120" w:type="dxa"/>
-              <w:left w:w="180" w:type="dxa"/>
-              <w:bottom w:w="120" w:type="dxa"/>
-              <w:right w:w="180" w:type="dxa"/>
-            </w:tcMar>
             <w:hideMark/>
           </w:tcPr>
           <w:p>
             <w:pPr>
-              <w:spacing w:after="0" w:line="360" w:lineRule="auto"/>
+              <w:spacing w:line="360" w:lineRule="auto"/>
+              <w:cnfStyle w:val="000000000000" w:firstRow="0" w:lastRow="0" w:firstColumn="0" w:lastColumn="0" w:oddVBand="0" w:evenVBand="0" w:oddHBand="0" w:evenHBand="0" w:firstRowFirstColumn="0" w:firstRowLastColumn="0" w:lastRowFirstColumn="0" w:lastRowLastColumn="0"/>
               <w:rPr>
                 <w:rFonts w:eastAsia="Times New Roman"/>
                 <w:lang w:val="en-NP" w:eastAsia="en-US"/>
@@ -6880,24 +6256,12 @@
         <w:tc>
           <w:tcPr>
             <w:tcW w:w="0" w:type="auto"/>
-            <w:tcBorders>
-              <w:top w:val="single" w:sz="6" w:space="0" w:color="000000"/>
-              <w:left w:val="single" w:sz="6" w:space="0" w:color="000000"/>
-              <w:bottom w:val="single" w:sz="6" w:space="0" w:color="000000"/>
-              <w:right w:val="single" w:sz="6" w:space="0" w:color="000000"/>
-            </w:tcBorders>
-            <w:shd w:val="clear" w:color="auto" w:fill="F8FAFD"/>
-            <w:tcMar>
-              <w:top w:w="120" w:type="dxa"/>
-              <w:left w:w="180" w:type="dxa"/>
-              <w:bottom w:w="120" w:type="dxa"/>
-              <w:right w:w="180" w:type="dxa"/>
-            </w:tcMar>
             <w:hideMark/>
           </w:tcPr>
           <w:p>
             <w:pPr>
-              <w:spacing w:after="0" w:line="360" w:lineRule="auto"/>
+              <w:spacing w:line="360" w:lineRule="auto"/>
+              <w:cnfStyle w:val="000000000000" w:firstRow="0" w:lastRow="0" w:firstColumn="0" w:lastColumn="0" w:oddVBand="0" w:evenVBand="0" w:oddHBand="0" w:evenHBand="0" w:firstRowFirstColumn="0" w:firstRowLastColumn="0" w:lastRowFirstColumn="0" w:lastRowLastColumn="0"/>
               <w:rPr>
                 <w:rFonts w:eastAsia="Times New Roman"/>
                 <w:lang w:val="en-NP" w:eastAsia="en-US"/>
@@ -6916,24 +6280,12 @@
         <w:tc>
           <w:tcPr>
             <w:tcW w:w="0" w:type="auto"/>
-            <w:tcBorders>
-              <w:top w:val="single" w:sz="6" w:space="0" w:color="000000"/>
-              <w:left w:val="single" w:sz="6" w:space="0" w:color="000000"/>
-              <w:bottom w:val="single" w:sz="6" w:space="0" w:color="000000"/>
-              <w:right w:val="single" w:sz="6" w:space="0" w:color="000000"/>
-            </w:tcBorders>
-            <w:shd w:val="clear" w:color="auto" w:fill="F8FAFD"/>
-            <w:tcMar>
-              <w:top w:w="120" w:type="dxa"/>
-              <w:left w:w="180" w:type="dxa"/>
-              <w:bottom w:w="120" w:type="dxa"/>
-              <w:right w:w="180" w:type="dxa"/>
-            </w:tcMar>
             <w:hideMark/>
           </w:tcPr>
           <w:p>
             <w:pPr>
-              <w:spacing w:after="0" w:line="360" w:lineRule="auto"/>
+              <w:spacing w:line="360" w:lineRule="auto"/>
+              <w:cnfStyle w:val="000000000000" w:firstRow="0" w:lastRow="0" w:firstColumn="0" w:lastColumn="0" w:oddVBand="0" w:evenVBand="0" w:oddHBand="0" w:evenHBand="0" w:firstRowFirstColumn="0" w:firstRowLastColumn="0" w:lastRowFirstColumn="0" w:lastRowLastColumn="0"/>
               <w:rPr>
                 <w:rFonts w:eastAsia="Times New Roman"/>
                 <w:lang w:val="en-NP" w:eastAsia="en-US"/>
@@ -6953,25 +6305,13 @@
       <w:tr>
         <w:tc>
           <w:tcPr>
+            <w:cnfStyle w:val="001000000000" w:firstRow="0" w:lastRow="0" w:firstColumn="1" w:lastColumn="0" w:oddVBand="0" w:evenVBand="0" w:oddHBand="0" w:evenHBand="0" w:firstRowFirstColumn="0" w:firstRowLastColumn="0" w:lastRowFirstColumn="0" w:lastRowLastColumn="0"/>
             <w:tcW w:w="0" w:type="auto"/>
-            <w:tcBorders>
-              <w:top w:val="single" w:sz="6" w:space="0" w:color="000000"/>
-              <w:left w:val="single" w:sz="6" w:space="0" w:color="000000"/>
-              <w:bottom w:val="single" w:sz="6" w:space="0" w:color="000000"/>
-              <w:right w:val="single" w:sz="6" w:space="0" w:color="000000"/>
-            </w:tcBorders>
-            <w:shd w:val="clear" w:color="auto" w:fill="F8FAFD"/>
-            <w:tcMar>
-              <w:top w:w="120" w:type="dxa"/>
-              <w:left w:w="180" w:type="dxa"/>
-              <w:bottom w:w="120" w:type="dxa"/>
-              <w:right w:w="180" w:type="dxa"/>
-            </w:tcMar>
             <w:hideMark/>
           </w:tcPr>
           <w:p>
             <w:pPr>
-              <w:spacing w:after="0" w:line="360" w:lineRule="auto"/>
+              <w:spacing w:line="360" w:lineRule="auto"/>
               <w:rPr>
                 <w:rFonts w:eastAsia="Times New Roman"/>
                 <w:lang w:val="en-NP" w:eastAsia="en-US"/>
@@ -6990,24 +6330,12 @@
         <w:tc>
           <w:tcPr>
             <w:tcW w:w="0" w:type="auto"/>
-            <w:tcBorders>
-              <w:top w:val="single" w:sz="6" w:space="0" w:color="000000"/>
-              <w:left w:val="single" w:sz="6" w:space="0" w:color="000000"/>
-              <w:bottom w:val="single" w:sz="6" w:space="0" w:color="000000"/>
-              <w:right w:val="single" w:sz="6" w:space="0" w:color="000000"/>
-            </w:tcBorders>
-            <w:shd w:val="clear" w:color="auto" w:fill="F8FAFD"/>
-            <w:tcMar>
-              <w:top w:w="120" w:type="dxa"/>
-              <w:left w:w="180" w:type="dxa"/>
-              <w:bottom w:w="120" w:type="dxa"/>
-              <w:right w:w="180" w:type="dxa"/>
-            </w:tcMar>
             <w:hideMark/>
           </w:tcPr>
           <w:p>
             <w:pPr>
-              <w:spacing w:after="0" w:line="360" w:lineRule="auto"/>
+              <w:spacing w:line="360" w:lineRule="auto"/>
+              <w:cnfStyle w:val="000000000000" w:firstRow="0" w:lastRow="0" w:firstColumn="0" w:lastColumn="0" w:oddVBand="0" w:evenVBand="0" w:oddHBand="0" w:evenHBand="0" w:firstRowFirstColumn="0" w:firstRowLastColumn="0" w:lastRowFirstColumn="0" w:lastRowLastColumn="0"/>
               <w:rPr>
                 <w:rFonts w:eastAsia="Times New Roman"/>
                 <w:lang w:val="en-NP" w:eastAsia="en-US"/>
@@ -7026,24 +6354,12 @@
         <w:tc>
           <w:tcPr>
             <w:tcW w:w="0" w:type="auto"/>
-            <w:tcBorders>
-              <w:top w:val="single" w:sz="6" w:space="0" w:color="000000"/>
-              <w:left w:val="single" w:sz="6" w:space="0" w:color="000000"/>
-              <w:bottom w:val="single" w:sz="6" w:space="0" w:color="000000"/>
-              <w:right w:val="single" w:sz="6" w:space="0" w:color="000000"/>
-            </w:tcBorders>
-            <w:shd w:val="clear" w:color="auto" w:fill="F8FAFD"/>
-            <w:tcMar>
-              <w:top w:w="120" w:type="dxa"/>
-              <w:left w:w="180" w:type="dxa"/>
-              <w:bottom w:w="120" w:type="dxa"/>
-              <w:right w:w="180" w:type="dxa"/>
-            </w:tcMar>
             <w:hideMark/>
           </w:tcPr>
           <w:p>
             <w:pPr>
-              <w:spacing w:after="0" w:line="360" w:lineRule="auto"/>
+              <w:spacing w:line="360" w:lineRule="auto"/>
+              <w:cnfStyle w:val="000000000000" w:firstRow="0" w:lastRow="0" w:firstColumn="0" w:lastColumn="0" w:oddVBand="0" w:evenVBand="0" w:oddHBand="0" w:evenHBand="0" w:firstRowFirstColumn="0" w:firstRowLastColumn="0" w:lastRowFirstColumn="0" w:lastRowLastColumn="0"/>
               <w:rPr>
                 <w:rFonts w:eastAsia="Times New Roman"/>
                 <w:lang w:val="en-NP" w:eastAsia="en-US"/>
@@ -7062,24 +6378,12 @@
         <w:tc>
           <w:tcPr>
             <w:tcW w:w="0" w:type="auto"/>
-            <w:tcBorders>
-              <w:top w:val="single" w:sz="6" w:space="0" w:color="000000"/>
-              <w:left w:val="single" w:sz="6" w:space="0" w:color="000000"/>
-              <w:bottom w:val="single" w:sz="6" w:space="0" w:color="000000"/>
-              <w:right w:val="single" w:sz="6" w:space="0" w:color="000000"/>
-            </w:tcBorders>
-            <w:shd w:val="clear" w:color="auto" w:fill="F8FAFD"/>
-            <w:tcMar>
-              <w:top w:w="120" w:type="dxa"/>
-              <w:left w:w="180" w:type="dxa"/>
-              <w:bottom w:w="120" w:type="dxa"/>
-              <w:right w:w="180" w:type="dxa"/>
-            </w:tcMar>
             <w:hideMark/>
           </w:tcPr>
           <w:p>
             <w:pPr>
-              <w:spacing w:after="0" w:line="360" w:lineRule="auto"/>
+              <w:spacing w:line="360" w:lineRule="auto"/>
+              <w:cnfStyle w:val="000000000000" w:firstRow="0" w:lastRow="0" w:firstColumn="0" w:lastColumn="0" w:oddVBand="0" w:evenVBand="0" w:oddHBand="0" w:evenHBand="0" w:firstRowFirstColumn="0" w:firstRowLastColumn="0" w:lastRowFirstColumn="0" w:lastRowLastColumn="0"/>
               <w:rPr>
                 <w:rFonts w:eastAsia="Times New Roman"/>
                 <w:lang w:val="en-NP" w:eastAsia="en-US"/>
@@ -7099,25 +6403,13 @@
       <w:tr>
         <w:tc>
           <w:tcPr>
+            <w:cnfStyle w:val="001000000000" w:firstRow="0" w:lastRow="0" w:firstColumn="1" w:lastColumn="0" w:oddVBand="0" w:evenVBand="0" w:oddHBand="0" w:evenHBand="0" w:firstRowFirstColumn="0" w:firstRowLastColumn="0" w:lastRowFirstColumn="0" w:lastRowLastColumn="0"/>
             <w:tcW w:w="0" w:type="auto"/>
-            <w:tcBorders>
-              <w:top w:val="single" w:sz="6" w:space="0" w:color="000000"/>
-              <w:left w:val="single" w:sz="6" w:space="0" w:color="000000"/>
-              <w:bottom w:val="single" w:sz="6" w:space="0" w:color="000000"/>
-              <w:right w:val="single" w:sz="6" w:space="0" w:color="000000"/>
-            </w:tcBorders>
-            <w:shd w:val="clear" w:color="auto" w:fill="F8FAFD"/>
-            <w:tcMar>
-              <w:top w:w="120" w:type="dxa"/>
-              <w:left w:w="180" w:type="dxa"/>
-              <w:bottom w:w="120" w:type="dxa"/>
-              <w:right w:w="180" w:type="dxa"/>
-            </w:tcMar>
             <w:hideMark/>
           </w:tcPr>
           <w:p>
             <w:pPr>
-              <w:spacing w:after="0" w:line="360" w:lineRule="auto"/>
+              <w:spacing w:line="360" w:lineRule="auto"/>
               <w:rPr>
                 <w:rFonts w:eastAsia="Times New Roman"/>
                 <w:lang w:val="en-NP" w:eastAsia="en-US"/>
@@ -7136,24 +6428,12 @@
         <w:tc>
           <w:tcPr>
             <w:tcW w:w="0" w:type="auto"/>
-            <w:tcBorders>
-              <w:top w:val="single" w:sz="6" w:space="0" w:color="000000"/>
-              <w:left w:val="single" w:sz="6" w:space="0" w:color="000000"/>
-              <w:bottom w:val="single" w:sz="6" w:space="0" w:color="000000"/>
-              <w:right w:val="single" w:sz="6" w:space="0" w:color="000000"/>
-            </w:tcBorders>
-            <w:shd w:val="clear" w:color="auto" w:fill="F8FAFD"/>
-            <w:tcMar>
-              <w:top w:w="120" w:type="dxa"/>
-              <w:left w:w="180" w:type="dxa"/>
-              <w:bottom w:w="120" w:type="dxa"/>
-              <w:right w:w="180" w:type="dxa"/>
-            </w:tcMar>
             <w:hideMark/>
           </w:tcPr>
           <w:p>
             <w:pPr>
-              <w:spacing w:after="0" w:line="360" w:lineRule="auto"/>
+              <w:spacing w:line="360" w:lineRule="auto"/>
+              <w:cnfStyle w:val="000000000000" w:firstRow="0" w:lastRow="0" w:firstColumn="0" w:lastColumn="0" w:oddVBand="0" w:evenVBand="0" w:oddHBand="0" w:evenHBand="0" w:firstRowFirstColumn="0" w:firstRowLastColumn="0" w:lastRowFirstColumn="0" w:lastRowLastColumn="0"/>
               <w:rPr>
                 <w:rFonts w:eastAsia="Times New Roman"/>
                 <w:lang w:val="en-NP" w:eastAsia="en-US"/>
@@ -7172,24 +6452,12 @@
         <w:tc>
           <w:tcPr>
             <w:tcW w:w="0" w:type="auto"/>
-            <w:tcBorders>
-              <w:top w:val="single" w:sz="6" w:space="0" w:color="000000"/>
-              <w:left w:val="single" w:sz="6" w:space="0" w:color="000000"/>
-              <w:bottom w:val="single" w:sz="6" w:space="0" w:color="000000"/>
-              <w:right w:val="single" w:sz="6" w:space="0" w:color="000000"/>
-            </w:tcBorders>
-            <w:shd w:val="clear" w:color="auto" w:fill="F8FAFD"/>
-            <w:tcMar>
-              <w:top w:w="120" w:type="dxa"/>
-              <w:left w:w="180" w:type="dxa"/>
-              <w:bottom w:w="120" w:type="dxa"/>
-              <w:right w:w="180" w:type="dxa"/>
-            </w:tcMar>
             <w:hideMark/>
           </w:tcPr>
           <w:p>
             <w:pPr>
-              <w:spacing w:after="0" w:line="360" w:lineRule="auto"/>
+              <w:spacing w:line="360" w:lineRule="auto"/>
+              <w:cnfStyle w:val="000000000000" w:firstRow="0" w:lastRow="0" w:firstColumn="0" w:lastColumn="0" w:oddVBand="0" w:evenVBand="0" w:oddHBand="0" w:evenHBand="0" w:firstRowFirstColumn="0" w:firstRowLastColumn="0" w:lastRowFirstColumn="0" w:lastRowLastColumn="0"/>
               <w:rPr>
                 <w:rFonts w:eastAsia="Times New Roman"/>
                 <w:lang w:val="en-NP" w:eastAsia="en-US"/>
@@ -7208,24 +6476,12 @@
         <w:tc>
           <w:tcPr>
             <w:tcW w:w="0" w:type="auto"/>
-            <w:tcBorders>
-              <w:top w:val="single" w:sz="6" w:space="0" w:color="000000"/>
-              <w:left w:val="single" w:sz="6" w:space="0" w:color="000000"/>
-              <w:bottom w:val="single" w:sz="6" w:space="0" w:color="000000"/>
-              <w:right w:val="single" w:sz="6" w:space="0" w:color="000000"/>
-            </w:tcBorders>
-            <w:shd w:val="clear" w:color="auto" w:fill="F8FAFD"/>
-            <w:tcMar>
-              <w:top w:w="120" w:type="dxa"/>
-              <w:left w:w="180" w:type="dxa"/>
-              <w:bottom w:w="120" w:type="dxa"/>
-              <w:right w:w="180" w:type="dxa"/>
-            </w:tcMar>
             <w:hideMark/>
           </w:tcPr>
           <w:p>
             <w:pPr>
-              <w:spacing w:after="0" w:line="360" w:lineRule="auto"/>
+              <w:spacing w:line="360" w:lineRule="auto"/>
+              <w:cnfStyle w:val="000000000000" w:firstRow="0" w:lastRow="0" w:firstColumn="0" w:lastColumn="0" w:oddVBand="0" w:evenVBand="0" w:oddHBand="0" w:evenHBand="0" w:firstRowFirstColumn="0" w:firstRowLastColumn="0" w:lastRowFirstColumn="0" w:lastRowLastColumn="0"/>
               <w:rPr>
                 <w:rFonts w:eastAsia="Times New Roman"/>
                 <w:lang w:val="en-NP" w:eastAsia="en-US"/>
@@ -7245,25 +6501,13 @@
       <w:tr>
         <w:tc>
           <w:tcPr>
+            <w:cnfStyle w:val="001000000000" w:firstRow="0" w:lastRow="0" w:firstColumn="1" w:lastColumn="0" w:oddVBand="0" w:evenVBand="0" w:oddHBand="0" w:evenHBand="0" w:firstRowFirstColumn="0" w:firstRowLastColumn="0" w:lastRowFirstColumn="0" w:lastRowLastColumn="0"/>
             <w:tcW w:w="0" w:type="auto"/>
-            <w:tcBorders>
-              <w:top w:val="single" w:sz="6" w:space="0" w:color="000000"/>
-              <w:left w:val="single" w:sz="6" w:space="0" w:color="000000"/>
-              <w:bottom w:val="single" w:sz="6" w:space="0" w:color="000000"/>
-              <w:right w:val="single" w:sz="6" w:space="0" w:color="000000"/>
-            </w:tcBorders>
-            <w:shd w:val="clear" w:color="auto" w:fill="F8FAFD"/>
-            <w:tcMar>
-              <w:top w:w="120" w:type="dxa"/>
-              <w:left w:w="180" w:type="dxa"/>
-              <w:bottom w:w="120" w:type="dxa"/>
-              <w:right w:w="180" w:type="dxa"/>
-            </w:tcMar>
             <w:hideMark/>
           </w:tcPr>
           <w:p>
             <w:pPr>
-              <w:spacing w:after="0" w:line="360" w:lineRule="auto"/>
+              <w:spacing w:line="360" w:lineRule="auto"/>
               <w:rPr>
                 <w:rFonts w:eastAsia="Times New Roman"/>
                 <w:lang w:val="en-NP" w:eastAsia="en-US"/>
@@ -7282,24 +6526,12 @@
         <w:tc>
           <w:tcPr>
             <w:tcW w:w="0" w:type="auto"/>
-            <w:tcBorders>
-              <w:top w:val="single" w:sz="6" w:space="0" w:color="000000"/>
-              <w:left w:val="single" w:sz="6" w:space="0" w:color="000000"/>
-              <w:bottom w:val="single" w:sz="6" w:space="0" w:color="000000"/>
-              <w:right w:val="single" w:sz="6" w:space="0" w:color="000000"/>
-            </w:tcBorders>
-            <w:shd w:val="clear" w:color="auto" w:fill="F8FAFD"/>
-            <w:tcMar>
-              <w:top w:w="120" w:type="dxa"/>
-              <w:left w:w="180" w:type="dxa"/>
-              <w:bottom w:w="120" w:type="dxa"/>
-              <w:right w:w="180" w:type="dxa"/>
-            </w:tcMar>
             <w:hideMark/>
           </w:tcPr>
           <w:p>
             <w:pPr>
-              <w:spacing w:after="0" w:line="360" w:lineRule="auto"/>
+              <w:spacing w:line="360" w:lineRule="auto"/>
+              <w:cnfStyle w:val="000000000000" w:firstRow="0" w:lastRow="0" w:firstColumn="0" w:lastColumn="0" w:oddVBand="0" w:evenVBand="0" w:oddHBand="0" w:evenHBand="0" w:firstRowFirstColumn="0" w:firstRowLastColumn="0" w:lastRowFirstColumn="0" w:lastRowLastColumn="0"/>
               <w:rPr>
                 <w:rFonts w:eastAsia="Times New Roman"/>
                 <w:lang w:val="en-NP" w:eastAsia="en-US"/>
@@ -7318,24 +6550,12 @@
         <w:tc>
           <w:tcPr>
             <w:tcW w:w="0" w:type="auto"/>
-            <w:tcBorders>
-              <w:top w:val="single" w:sz="6" w:space="0" w:color="000000"/>
-              <w:left w:val="single" w:sz="6" w:space="0" w:color="000000"/>
-              <w:bottom w:val="single" w:sz="6" w:space="0" w:color="000000"/>
-              <w:right w:val="single" w:sz="6" w:space="0" w:color="000000"/>
-            </w:tcBorders>
-            <w:shd w:val="clear" w:color="auto" w:fill="F8FAFD"/>
-            <w:tcMar>
-              <w:top w:w="120" w:type="dxa"/>
-              <w:left w:w="180" w:type="dxa"/>
-              <w:bottom w:w="120" w:type="dxa"/>
-              <w:right w:w="180" w:type="dxa"/>
-            </w:tcMar>
             <w:hideMark/>
           </w:tcPr>
           <w:p>
             <w:pPr>
-              <w:spacing w:after="0" w:line="360" w:lineRule="auto"/>
+              <w:spacing w:line="360" w:lineRule="auto"/>
+              <w:cnfStyle w:val="000000000000" w:firstRow="0" w:lastRow="0" w:firstColumn="0" w:lastColumn="0" w:oddVBand="0" w:evenVBand="0" w:oddHBand="0" w:evenHBand="0" w:firstRowFirstColumn="0" w:firstRowLastColumn="0" w:lastRowFirstColumn="0" w:lastRowLastColumn="0"/>
               <w:rPr>
                 <w:rFonts w:eastAsia="Times New Roman"/>
                 <w:lang w:val="en-NP" w:eastAsia="en-US"/>
@@ -7354,24 +6574,12 @@
         <w:tc>
           <w:tcPr>
             <w:tcW w:w="0" w:type="auto"/>
-            <w:tcBorders>
-              <w:top w:val="single" w:sz="6" w:space="0" w:color="000000"/>
-              <w:left w:val="single" w:sz="6" w:space="0" w:color="000000"/>
-              <w:bottom w:val="single" w:sz="6" w:space="0" w:color="000000"/>
-              <w:right w:val="single" w:sz="6" w:space="0" w:color="000000"/>
-            </w:tcBorders>
-            <w:shd w:val="clear" w:color="auto" w:fill="F8FAFD"/>
-            <w:tcMar>
-              <w:top w:w="120" w:type="dxa"/>
-              <w:left w:w="180" w:type="dxa"/>
-              <w:bottom w:w="120" w:type="dxa"/>
-              <w:right w:w="180" w:type="dxa"/>
-            </w:tcMar>
             <w:hideMark/>
           </w:tcPr>
           <w:p>
             <w:pPr>
-              <w:spacing w:after="0" w:line="360" w:lineRule="auto"/>
+              <w:spacing w:line="360" w:lineRule="auto"/>
+              <w:cnfStyle w:val="000000000000" w:firstRow="0" w:lastRow="0" w:firstColumn="0" w:lastColumn="0" w:oddVBand="0" w:evenVBand="0" w:oddHBand="0" w:evenHBand="0" w:firstRowFirstColumn="0" w:firstRowLastColumn="0" w:lastRowFirstColumn="0" w:lastRowLastColumn="0"/>
               <w:rPr>
                 <w:rFonts w:eastAsia="Times New Roman"/>
                 <w:lang w:val="en-NP" w:eastAsia="en-US"/>
@@ -7391,25 +6599,13 @@
       <w:tr>
         <w:tc>
           <w:tcPr>
+            <w:cnfStyle w:val="001000000000" w:firstRow="0" w:lastRow="0" w:firstColumn="1" w:lastColumn="0" w:oddVBand="0" w:evenVBand="0" w:oddHBand="0" w:evenHBand="0" w:firstRowFirstColumn="0" w:firstRowLastColumn="0" w:lastRowFirstColumn="0" w:lastRowLastColumn="0"/>
             <w:tcW w:w="0" w:type="auto"/>
-            <w:tcBorders>
-              <w:top w:val="single" w:sz="6" w:space="0" w:color="000000"/>
-              <w:left w:val="single" w:sz="6" w:space="0" w:color="000000"/>
-              <w:bottom w:val="single" w:sz="6" w:space="0" w:color="000000"/>
-              <w:right w:val="single" w:sz="6" w:space="0" w:color="000000"/>
-            </w:tcBorders>
-            <w:shd w:val="clear" w:color="auto" w:fill="F8FAFD"/>
-            <w:tcMar>
-              <w:top w:w="120" w:type="dxa"/>
-              <w:left w:w="180" w:type="dxa"/>
-              <w:bottom w:w="120" w:type="dxa"/>
-              <w:right w:w="180" w:type="dxa"/>
-            </w:tcMar>
             <w:hideMark/>
           </w:tcPr>
           <w:p>
             <w:pPr>
-              <w:spacing w:after="0" w:line="360" w:lineRule="auto"/>
+              <w:spacing w:line="360" w:lineRule="auto"/>
               <w:rPr>
                 <w:rFonts w:eastAsia="Times New Roman"/>
                 <w:lang w:val="en-NP" w:eastAsia="en-US"/>
@@ -7421,7 +6617,6 @@
                 <w:color w:val="1F1F1F"/>
                 <w:lang w:val="en-NP" w:eastAsia="en-US"/>
               </w:rPr>
-              <w:lastRenderedPageBreak/>
               <w:t>unnamed1</w:t>
             </w:r>
           </w:p>
@@ -7429,24 +6624,12 @@
         <w:tc>
           <w:tcPr>
             <w:tcW w:w="0" w:type="auto"/>
-            <w:tcBorders>
-              <w:top w:val="single" w:sz="6" w:space="0" w:color="000000"/>
-              <w:left w:val="single" w:sz="6" w:space="0" w:color="000000"/>
-              <w:bottom w:val="single" w:sz="6" w:space="0" w:color="000000"/>
-              <w:right w:val="single" w:sz="6" w:space="0" w:color="000000"/>
-            </w:tcBorders>
-            <w:shd w:val="clear" w:color="auto" w:fill="F8FAFD"/>
-            <w:tcMar>
-              <w:top w:w="120" w:type="dxa"/>
-              <w:left w:w="180" w:type="dxa"/>
-              <w:bottom w:w="120" w:type="dxa"/>
-              <w:right w:w="180" w:type="dxa"/>
-            </w:tcMar>
             <w:hideMark/>
           </w:tcPr>
           <w:p>
             <w:pPr>
-              <w:spacing w:after="0" w:line="360" w:lineRule="auto"/>
+              <w:spacing w:line="360" w:lineRule="auto"/>
+              <w:cnfStyle w:val="000000000000" w:firstRow="0" w:lastRow="0" w:firstColumn="0" w:lastColumn="0" w:oddVBand="0" w:evenVBand="0" w:oddHBand="0" w:evenHBand="0" w:firstRowFirstColumn="0" w:firstRowLastColumn="0" w:lastRowFirstColumn="0" w:lastRowLastColumn="0"/>
               <w:rPr>
                 <w:rFonts w:eastAsia="Times New Roman"/>
                 <w:lang w:val="en-NP" w:eastAsia="en-US"/>
@@ -7465,24 +6648,12 @@
         <w:tc>
           <w:tcPr>
             <w:tcW w:w="0" w:type="auto"/>
-            <w:tcBorders>
-              <w:top w:val="single" w:sz="6" w:space="0" w:color="000000"/>
-              <w:left w:val="single" w:sz="6" w:space="0" w:color="000000"/>
-              <w:bottom w:val="single" w:sz="6" w:space="0" w:color="000000"/>
-              <w:right w:val="single" w:sz="6" w:space="0" w:color="000000"/>
-            </w:tcBorders>
-            <w:shd w:val="clear" w:color="auto" w:fill="F8FAFD"/>
-            <w:tcMar>
-              <w:top w:w="120" w:type="dxa"/>
-              <w:left w:w="180" w:type="dxa"/>
-              <w:bottom w:w="120" w:type="dxa"/>
-              <w:right w:w="180" w:type="dxa"/>
-            </w:tcMar>
             <w:hideMark/>
           </w:tcPr>
           <w:p>
             <w:pPr>
-              <w:spacing w:after="0" w:line="360" w:lineRule="auto"/>
+              <w:spacing w:line="360" w:lineRule="auto"/>
+              <w:cnfStyle w:val="000000000000" w:firstRow="0" w:lastRow="0" w:firstColumn="0" w:lastColumn="0" w:oddVBand="0" w:evenVBand="0" w:oddHBand="0" w:evenHBand="0" w:firstRowFirstColumn="0" w:firstRowLastColumn="0" w:lastRowFirstColumn="0" w:lastRowLastColumn="0"/>
               <w:rPr>
                 <w:rFonts w:eastAsia="Times New Roman"/>
                 <w:lang w:val="en-NP" w:eastAsia="en-US"/>
@@ -7501,24 +6672,12 @@
         <w:tc>
           <w:tcPr>
             <w:tcW w:w="0" w:type="auto"/>
-            <w:tcBorders>
-              <w:top w:val="single" w:sz="6" w:space="0" w:color="000000"/>
-              <w:left w:val="single" w:sz="6" w:space="0" w:color="000000"/>
-              <w:bottom w:val="single" w:sz="6" w:space="0" w:color="000000"/>
-              <w:right w:val="single" w:sz="6" w:space="0" w:color="000000"/>
-            </w:tcBorders>
-            <w:shd w:val="clear" w:color="auto" w:fill="F8FAFD"/>
-            <w:tcMar>
-              <w:top w:w="120" w:type="dxa"/>
-              <w:left w:w="180" w:type="dxa"/>
-              <w:bottom w:w="120" w:type="dxa"/>
-              <w:right w:w="180" w:type="dxa"/>
-            </w:tcMar>
             <w:hideMark/>
           </w:tcPr>
           <w:p>
             <w:pPr>
-              <w:spacing w:after="0" w:line="360" w:lineRule="auto"/>
+              <w:spacing w:line="360" w:lineRule="auto"/>
+              <w:cnfStyle w:val="000000000000" w:firstRow="0" w:lastRow="0" w:firstColumn="0" w:lastColumn="0" w:oddVBand="0" w:evenVBand="0" w:oddHBand="0" w:evenHBand="0" w:firstRowFirstColumn="0" w:firstRowLastColumn="0" w:lastRowFirstColumn="0" w:lastRowLastColumn="0"/>
               <w:rPr>
                 <w:rFonts w:eastAsia="Times New Roman"/>
                 <w:lang w:val="en-NP" w:eastAsia="en-US"/>
@@ -7581,96 +6740,6 @@
         </w:rPr>
         <w:t>Upon initial inspection, a few data quality challenges were identified. Firstly, there are missing values (NaN) in the crucial Amount and Age columns. Secondly, there are completely empty or irrelevant columns such as unnamed1 and Cust_name that add noise to the dataset. Finally, the raw data needs specific encoding to be read correctly into Python without throwing formatting errors.</w:t>
       </w:r>
-    </w:p>
-    <w:p>
-      <w:pPr>
-        <w:spacing w:after="240" w:line="360" w:lineRule="auto"/>
-        <w:rPr>
-          <w:rFonts w:eastAsia="Times New Roman"/>
-          <w:color w:val="1F1F1F"/>
-          <w:lang w:val="en-NP" w:eastAsia="en-US"/>
-        </w:rPr>
-      </w:pPr>
-    </w:p>
-    <w:p>
-      <w:pPr>
-        <w:spacing w:after="240" w:line="360" w:lineRule="auto"/>
-        <w:rPr>
-          <w:rFonts w:eastAsia="Times New Roman"/>
-          <w:color w:val="1F1F1F"/>
-          <w:lang w:val="en-NP" w:eastAsia="en-US"/>
-        </w:rPr>
-      </w:pPr>
-    </w:p>
-    <w:p>
-      <w:pPr>
-        <w:spacing w:after="240" w:line="360" w:lineRule="auto"/>
-        <w:rPr>
-          <w:rFonts w:eastAsia="Times New Roman"/>
-          <w:color w:val="1F1F1F"/>
-          <w:lang w:val="en-NP" w:eastAsia="en-US"/>
-        </w:rPr>
-      </w:pPr>
-    </w:p>
-    <w:p>
-      <w:pPr>
-        <w:spacing w:after="240" w:line="360" w:lineRule="auto"/>
-        <w:rPr>
-          <w:rFonts w:eastAsia="Times New Roman"/>
-          <w:color w:val="1F1F1F"/>
-          <w:lang w:val="en-NP" w:eastAsia="en-US"/>
-        </w:rPr>
-      </w:pPr>
-    </w:p>
-    <w:p>
-      <w:pPr>
-        <w:spacing w:after="240" w:line="360" w:lineRule="auto"/>
-        <w:rPr>
-          <w:rFonts w:eastAsia="Times New Roman"/>
-          <w:color w:val="1F1F1F"/>
-          <w:lang w:val="en-NP" w:eastAsia="en-US"/>
-        </w:rPr>
-      </w:pPr>
-    </w:p>
-    <w:p>
-      <w:pPr>
-        <w:spacing w:after="240" w:line="360" w:lineRule="auto"/>
-        <w:rPr>
-          <w:rFonts w:eastAsia="Times New Roman"/>
-          <w:color w:val="1F1F1F"/>
-          <w:lang w:val="en-NP" w:eastAsia="en-US"/>
-        </w:rPr>
-      </w:pPr>
-    </w:p>
-    <w:p>
-      <w:pPr>
-        <w:spacing w:after="240" w:line="360" w:lineRule="auto"/>
-        <w:rPr>
-          <w:rFonts w:eastAsia="Times New Roman"/>
-          <w:color w:val="1F1F1F"/>
-          <w:lang w:val="en-NP" w:eastAsia="en-US"/>
-        </w:rPr>
-      </w:pPr>
-    </w:p>
-    <w:p>
-      <w:pPr>
-        <w:spacing w:after="240" w:line="360" w:lineRule="auto"/>
-        <w:rPr>
-          <w:rFonts w:eastAsia="Times New Roman"/>
-          <w:color w:val="1F1F1F"/>
-          <w:lang w:val="en-NP" w:eastAsia="en-US"/>
-        </w:rPr>
-      </w:pPr>
-    </w:p>
-    <w:p>
-      <w:pPr>
-        <w:spacing w:after="240" w:line="360" w:lineRule="auto"/>
-        <w:rPr>
-          <w:rFonts w:eastAsia="Times New Roman"/>
-          <w:color w:val="1F1F1F"/>
-          <w:lang w:val="en-NP" w:eastAsia="en-US"/>
-        </w:rPr>
-      </w:pPr>
     </w:p>
     <w:p>
       <w:pPr>
@@ -7998,44 +7067,94 @@
       </w:pPr>
       <w:r>
         <w:rPr>
+          <w:color w:val="000000"/>
+        </w:rPr>
+        <w:t xml:space="preserve">The dataset was imported using Pandas. A standard import failed due to an unknown encoding style. </w:t>
+      </w:r>
+      <w:r>
+        <w:rPr>
+          <w:color w:val="000000"/>
+        </w:rPr>
+        <w:t>Hence</w:t>
+      </w:r>
+      <w:r>
+        <w:rPr>
+          <w:color w:val="000000"/>
+        </w:rPr>
+        <w:t xml:space="preserve"> the </w:t>
+      </w:r>
+      <w:proofErr w:type="spellStart"/>
+      <w:r>
+        <w:rPr>
+          <w:color w:val="000000"/>
+        </w:rPr>
+        <w:t>chardet</w:t>
+      </w:r>
+      <w:proofErr w:type="spellEnd"/>
+      <w:r>
+        <w:rPr>
+          <w:color w:val="000000"/>
+        </w:rPr>
+        <w:t xml:space="preserve"> library </w:t>
+      </w:r>
+      <w:r>
+        <w:rPr>
+          <w:color w:val="000000"/>
+        </w:rPr>
+        <w:t xml:space="preserve">was introduced </w:t>
+      </w:r>
+      <w:r>
+        <w:rPr>
+          <w:color w:val="000000"/>
+        </w:rPr>
+        <w:t xml:space="preserve">to automatically detect the correct encoding and passed it to </w:t>
+      </w:r>
+      <w:proofErr w:type="spellStart"/>
+      <w:proofErr w:type="gramStart"/>
+      <w:r>
+        <w:rPr>
+          <w:color w:val="000000"/>
+        </w:rPr>
+        <w:t>pd.read</w:t>
+      </w:r>
+      <w:proofErr w:type="gramEnd"/>
+      <w:r>
+        <w:rPr>
+          <w:color w:val="000000"/>
+        </w:rPr>
+        <w:t>_</w:t>
+      </w:r>
+      <w:proofErr w:type="gramStart"/>
+      <w:r>
+        <w:rPr>
+          <w:color w:val="000000"/>
+        </w:rPr>
+        <w:t>csv</w:t>
+      </w:r>
+      <w:proofErr w:type="spellEnd"/>
+      <w:r>
+        <w:rPr>
+          <w:color w:val="000000"/>
+        </w:rPr>
+        <w:t>(</w:t>
+      </w:r>
+      <w:proofErr w:type="gramEnd"/>
+      <w:r>
+        <w:rPr>
+          <w:color w:val="000000"/>
+        </w:rPr>
+        <w:t>). The output of the first 15 rows confirms a successful load without formatting errors.</w:t>
+      </w:r>
+    </w:p>
+    <w:p>
+      <w:pPr>
+        <w:spacing w:after="240" w:line="360" w:lineRule="auto"/>
+        <w:rPr>
           <w:rFonts w:eastAsia="Times New Roman"/>
           <w:color w:val="1F1F1F"/>
           <w:lang w:val="en-NP" w:eastAsia="en-US"/>
         </w:rPr>
-        <w:t xml:space="preserve">The dataset was imported using the Pandas library. Because the CSV file contained </w:t>
-      </w:r>
-      <w:r>
-        <w:rPr>
-          <w:rFonts w:eastAsia="Times New Roman"/>
-          <w:color w:val="1F1F1F"/>
-          <w:lang w:val="en-NP" w:eastAsia="en-US"/>
-        </w:rPr>
-        <w:t>different encoding style, it</w:t>
-      </w:r>
-      <w:r>
-        <w:rPr>
-          <w:rFonts w:eastAsia="Times New Roman"/>
-          <w:color w:val="1F1F1F"/>
-          <w:lang w:val="en-NP" w:eastAsia="en-US"/>
-        </w:rPr>
-        <w:t xml:space="preserve"> caused a standard import to fail</w:t>
-      </w:r>
-      <w:r>
-        <w:rPr>
-          <w:rFonts w:eastAsia="Times New Roman"/>
-          <w:color w:val="1F1F1F"/>
-          <w:lang w:val="en-NP" w:eastAsia="en-US"/>
-        </w:rPr>
-        <w:t>. Hence,</w:t>
-      </w:r>
-      <w:r>
-        <w:rPr>
-          <w:rFonts w:eastAsia="Times New Roman"/>
-          <w:color w:val="1F1F1F"/>
-          <w:lang w:val="en-NP" w:eastAsia="en-US"/>
-        </w:rPr>
-        <w:t xml:space="preserve"> the chardet library was utilized. This automatically detected the correct encoding from the file's raw bytes and passed it into the pd.read_csv() function. The output of the first 15 rows confirms that the data was loaded successfully without any formatting errors.</w:t>
-      </w:r>
+      </w:pPr>
     </w:p>
     <w:p>
       <w:pPr>
@@ -8235,7 +7354,7 @@
         <w:pStyle w:val="Caption"/>
         <w:keepNext/>
       </w:pPr>
-      <w:bookmarkStart w:id="10" w:name="_Toc226119643"/>
+      <w:bookmarkStart w:id="10" w:name="_Toc228188184"/>
       <w:r>
         <w:t xml:space="preserve">Table </w:t>
       </w:r>
@@ -8264,36 +7383,22 @@
     </w:p>
     <w:tbl>
       <w:tblPr>
+        <w:tblStyle w:val="GridTable1Light"/>
         <w:tblW w:w="0" w:type="auto"/>
-        <w:tblCellMar>
-          <w:top w:w="15" w:type="dxa"/>
-          <w:left w:w="15" w:type="dxa"/>
-          <w:bottom w:w="15" w:type="dxa"/>
-          <w:right w:w="15" w:type="dxa"/>
-        </w:tblCellMar>
         <w:tblLook w:val="04A0" w:firstRow="1" w:lastRow="0" w:firstColumn="1" w:lastColumn="0" w:noHBand="0" w:noVBand="1"/>
       </w:tblPr>
       <w:tblGrid>
-        <w:gridCol w:w="2268"/>
-        <w:gridCol w:w="6736"/>
+        <w:gridCol w:w="2124"/>
+        <w:gridCol w:w="6886"/>
       </w:tblGrid>
       <w:tr>
+        <w:trPr>
+          <w:cnfStyle w:val="100000000000" w:firstRow="1" w:lastRow="0" w:firstColumn="0" w:lastColumn="0" w:oddVBand="0" w:evenVBand="0" w:oddHBand="0" w:evenHBand="0" w:firstRowFirstColumn="0" w:firstRowLastColumn="0" w:lastRowFirstColumn="0" w:lastRowLastColumn="0"/>
+        </w:trPr>
         <w:tc>
           <w:tcPr>
+            <w:cnfStyle w:val="001000000000" w:firstRow="0" w:lastRow="0" w:firstColumn="1" w:lastColumn="0" w:oddVBand="0" w:evenVBand="0" w:oddHBand="0" w:evenHBand="0" w:firstRowFirstColumn="0" w:firstRowLastColumn="0" w:lastRowFirstColumn="0" w:lastRowLastColumn="0"/>
             <w:tcW w:w="0" w:type="auto"/>
-            <w:tcBorders>
-              <w:top w:val="single" w:sz="6" w:space="0" w:color="000000"/>
-              <w:left w:val="single" w:sz="6" w:space="0" w:color="000000"/>
-              <w:bottom w:val="single" w:sz="6" w:space="0" w:color="000000"/>
-              <w:right w:val="single" w:sz="6" w:space="0" w:color="000000"/>
-            </w:tcBorders>
-            <w:shd w:val="clear" w:color="auto" w:fill="F8FAFD"/>
-            <w:tcMar>
-              <w:top w:w="120" w:type="dxa"/>
-              <w:left w:w="180" w:type="dxa"/>
-              <w:bottom w:w="120" w:type="dxa"/>
-              <w:right w:w="180" w:type="dxa"/>
-            </w:tcMar>
             <w:hideMark/>
           </w:tcPr>
           <w:p>
@@ -8307,8 +7412,6 @@
             <w:r>
               <w:rPr>
                 <w:rFonts w:eastAsia="Times New Roman"/>
-                <w:b/>
-                <w:bCs/>
                 <w:color w:val="1F1F1F"/>
                 <w:sz w:val="22"/>
                 <w:szCs w:val="22"/>
@@ -8321,24 +7424,12 @@
         <w:tc>
           <w:tcPr>
             <w:tcW w:w="0" w:type="auto"/>
-            <w:tcBorders>
-              <w:top w:val="single" w:sz="6" w:space="0" w:color="000000"/>
-              <w:left w:val="single" w:sz="6" w:space="0" w:color="000000"/>
-              <w:bottom w:val="single" w:sz="6" w:space="0" w:color="000000"/>
-              <w:right w:val="single" w:sz="6" w:space="0" w:color="000000"/>
-            </w:tcBorders>
-            <w:shd w:val="clear" w:color="auto" w:fill="F8FAFD"/>
-            <w:tcMar>
-              <w:top w:w="120" w:type="dxa"/>
-              <w:left w:w="180" w:type="dxa"/>
-              <w:bottom w:w="120" w:type="dxa"/>
-              <w:right w:w="180" w:type="dxa"/>
-            </w:tcMar>
             <w:hideMark/>
           </w:tcPr>
           <w:p>
             <w:pPr>
               <w:spacing w:before="120" w:after="120" w:line="360" w:lineRule="auto"/>
+              <w:cnfStyle w:val="100000000000" w:firstRow="1" w:lastRow="0" w:firstColumn="0" w:lastColumn="0" w:oddVBand="0" w:evenVBand="0" w:oddHBand="0" w:evenHBand="0" w:firstRowFirstColumn="0" w:firstRowLastColumn="0" w:lastRowFirstColumn="0" w:lastRowLastColumn="0"/>
               <w:rPr>
                 <w:rFonts w:eastAsia="Times New Roman"/>
                 <w:lang w:val="en-NP" w:eastAsia="en-US"/>
@@ -8347,8 +7438,6 @@
             <w:r>
               <w:rPr>
                 <w:rFonts w:eastAsia="Times New Roman"/>
-                <w:b/>
-                <w:bCs/>
                 <w:color w:val="1F1F1F"/>
                 <w:sz w:val="22"/>
                 <w:szCs w:val="22"/>
@@ -8362,25 +7451,13 @@
       <w:tr>
         <w:tc>
           <w:tcPr>
+            <w:cnfStyle w:val="001000000000" w:firstRow="0" w:lastRow="0" w:firstColumn="1" w:lastColumn="0" w:oddVBand="0" w:evenVBand="0" w:oddHBand="0" w:evenHBand="0" w:firstRowFirstColumn="0" w:firstRowLastColumn="0" w:lastRowFirstColumn="0" w:lastRowLastColumn="0"/>
             <w:tcW w:w="0" w:type="auto"/>
-            <w:tcBorders>
-              <w:top w:val="single" w:sz="6" w:space="0" w:color="000000"/>
-              <w:left w:val="single" w:sz="6" w:space="0" w:color="000000"/>
-              <w:bottom w:val="single" w:sz="6" w:space="0" w:color="000000"/>
-              <w:right w:val="single" w:sz="6" w:space="0" w:color="000000"/>
-            </w:tcBorders>
-            <w:shd w:val="clear" w:color="auto" w:fill="F8FAFD"/>
-            <w:tcMar>
-              <w:top w:w="120" w:type="dxa"/>
-              <w:left w:w="180" w:type="dxa"/>
-              <w:bottom w:w="120" w:type="dxa"/>
-              <w:right w:w="180" w:type="dxa"/>
-            </w:tcMar>
             <w:hideMark/>
           </w:tcPr>
           <w:p>
             <w:pPr>
-              <w:spacing w:after="0" w:line="360" w:lineRule="auto"/>
+              <w:spacing w:line="360" w:lineRule="auto"/>
               <w:rPr>
                 <w:rFonts w:eastAsia="Times New Roman"/>
                 <w:lang w:val="en-NP" w:eastAsia="en-US"/>
@@ -8389,8 +7466,6 @@
             <w:r>
               <w:rPr>
                 <w:rFonts w:eastAsia="Times New Roman"/>
-                <w:b/>
-                <w:bCs/>
                 <w:color w:val="1F1F1F"/>
                 <w:sz w:val="22"/>
                 <w:szCs w:val="22"/>
@@ -8403,24 +7478,12 @@
         <w:tc>
           <w:tcPr>
             <w:tcW w:w="0" w:type="auto"/>
-            <w:tcBorders>
-              <w:top w:val="single" w:sz="6" w:space="0" w:color="000000"/>
-              <w:left w:val="single" w:sz="6" w:space="0" w:color="000000"/>
-              <w:bottom w:val="single" w:sz="6" w:space="0" w:color="000000"/>
-              <w:right w:val="single" w:sz="6" w:space="0" w:color="000000"/>
-            </w:tcBorders>
-            <w:shd w:val="clear" w:color="auto" w:fill="F8FAFD"/>
-            <w:tcMar>
-              <w:top w:w="120" w:type="dxa"/>
-              <w:left w:w="180" w:type="dxa"/>
-              <w:bottom w:w="120" w:type="dxa"/>
-              <w:right w:w="180" w:type="dxa"/>
-            </w:tcMar>
             <w:hideMark/>
           </w:tcPr>
           <w:p>
             <w:pPr>
-              <w:spacing w:after="0" w:line="360" w:lineRule="auto"/>
+              <w:spacing w:line="360" w:lineRule="auto"/>
+              <w:cnfStyle w:val="000000000000" w:firstRow="0" w:lastRow="0" w:firstColumn="0" w:lastColumn="0" w:oddVBand="0" w:evenVBand="0" w:oddHBand="0" w:evenHBand="0" w:firstRowFirstColumn="0" w:firstRowLastColumn="0" w:lastRowFirstColumn="0" w:lastRowLastColumn="0"/>
               <w:rPr>
                 <w:rFonts w:eastAsia="Times New Roman"/>
                 <w:lang w:val="en-NP" w:eastAsia="en-US"/>
@@ -8442,25 +7505,13 @@
       <w:tr>
         <w:tc>
           <w:tcPr>
+            <w:cnfStyle w:val="001000000000" w:firstRow="0" w:lastRow="0" w:firstColumn="1" w:lastColumn="0" w:oddVBand="0" w:evenVBand="0" w:oddHBand="0" w:evenHBand="0" w:firstRowFirstColumn="0" w:firstRowLastColumn="0" w:lastRowFirstColumn="0" w:lastRowLastColumn="0"/>
             <w:tcW w:w="0" w:type="auto"/>
-            <w:tcBorders>
-              <w:top w:val="single" w:sz="6" w:space="0" w:color="000000"/>
-              <w:left w:val="single" w:sz="6" w:space="0" w:color="000000"/>
-              <w:bottom w:val="single" w:sz="6" w:space="0" w:color="000000"/>
-              <w:right w:val="single" w:sz="6" w:space="0" w:color="000000"/>
-            </w:tcBorders>
-            <w:shd w:val="clear" w:color="auto" w:fill="F8FAFD"/>
-            <w:tcMar>
-              <w:top w:w="120" w:type="dxa"/>
-              <w:left w:w="180" w:type="dxa"/>
-              <w:bottom w:w="120" w:type="dxa"/>
-              <w:right w:w="180" w:type="dxa"/>
-            </w:tcMar>
             <w:hideMark/>
           </w:tcPr>
           <w:p>
             <w:pPr>
-              <w:spacing w:after="0" w:line="360" w:lineRule="auto"/>
+              <w:spacing w:line="360" w:lineRule="auto"/>
               <w:rPr>
                 <w:rFonts w:eastAsia="Times New Roman"/>
                 <w:lang w:val="en-NP" w:eastAsia="en-US"/>
@@ -8469,8 +7520,6 @@
             <w:r>
               <w:rPr>
                 <w:rFonts w:eastAsia="Times New Roman"/>
-                <w:b/>
-                <w:bCs/>
                 <w:color w:val="1F1F1F"/>
                 <w:sz w:val="22"/>
                 <w:szCs w:val="22"/>
@@ -8483,24 +7532,12 @@
         <w:tc>
           <w:tcPr>
             <w:tcW w:w="0" w:type="auto"/>
-            <w:tcBorders>
-              <w:top w:val="single" w:sz="6" w:space="0" w:color="000000"/>
-              <w:left w:val="single" w:sz="6" w:space="0" w:color="000000"/>
-              <w:bottom w:val="single" w:sz="6" w:space="0" w:color="000000"/>
-              <w:right w:val="single" w:sz="6" w:space="0" w:color="000000"/>
-            </w:tcBorders>
-            <w:shd w:val="clear" w:color="auto" w:fill="F8FAFD"/>
-            <w:tcMar>
-              <w:top w:w="120" w:type="dxa"/>
-              <w:left w:w="180" w:type="dxa"/>
-              <w:bottom w:w="120" w:type="dxa"/>
-              <w:right w:w="180" w:type="dxa"/>
-            </w:tcMar>
             <w:hideMark/>
           </w:tcPr>
           <w:p>
             <w:pPr>
-              <w:spacing w:after="0" w:line="360" w:lineRule="auto"/>
+              <w:spacing w:line="360" w:lineRule="auto"/>
+              <w:cnfStyle w:val="000000000000" w:firstRow="0" w:lastRow="0" w:firstColumn="0" w:lastColumn="0" w:oddVBand="0" w:evenVBand="0" w:oddHBand="0" w:evenHBand="0" w:firstRowFirstColumn="0" w:firstRowLastColumn="0" w:lastRowFirstColumn="0" w:lastRowLastColumn="0"/>
               <w:rPr>
                 <w:rFonts w:eastAsia="Times New Roman"/>
                 <w:lang w:val="en-NP" w:eastAsia="en-US"/>
@@ -8522,25 +7559,13 @@
       <w:tr>
         <w:tc>
           <w:tcPr>
+            <w:cnfStyle w:val="001000000000" w:firstRow="0" w:lastRow="0" w:firstColumn="1" w:lastColumn="0" w:oddVBand="0" w:evenVBand="0" w:oddHBand="0" w:evenHBand="0" w:firstRowFirstColumn="0" w:firstRowLastColumn="0" w:lastRowFirstColumn="0" w:lastRowLastColumn="0"/>
             <w:tcW w:w="0" w:type="auto"/>
-            <w:tcBorders>
-              <w:top w:val="single" w:sz="6" w:space="0" w:color="000000"/>
-              <w:left w:val="single" w:sz="6" w:space="0" w:color="000000"/>
-              <w:bottom w:val="single" w:sz="6" w:space="0" w:color="000000"/>
-              <w:right w:val="single" w:sz="6" w:space="0" w:color="000000"/>
-            </w:tcBorders>
-            <w:shd w:val="clear" w:color="auto" w:fill="F8FAFD"/>
-            <w:tcMar>
-              <w:top w:w="120" w:type="dxa"/>
-              <w:left w:w="180" w:type="dxa"/>
-              <w:bottom w:w="120" w:type="dxa"/>
-              <w:right w:w="180" w:type="dxa"/>
-            </w:tcMar>
             <w:hideMark/>
           </w:tcPr>
           <w:p>
             <w:pPr>
-              <w:spacing w:after="0" w:line="360" w:lineRule="auto"/>
+              <w:spacing w:line="360" w:lineRule="auto"/>
               <w:rPr>
                 <w:rFonts w:eastAsia="Times New Roman"/>
                 <w:lang w:val="en-NP" w:eastAsia="en-US"/>
@@ -8549,8 +7574,6 @@
             <w:r>
               <w:rPr>
                 <w:rFonts w:eastAsia="Times New Roman"/>
-                <w:b/>
-                <w:bCs/>
                 <w:color w:val="1F1F1F"/>
                 <w:sz w:val="22"/>
                 <w:szCs w:val="22"/>
@@ -8563,24 +7586,12 @@
         <w:tc>
           <w:tcPr>
             <w:tcW w:w="0" w:type="auto"/>
-            <w:tcBorders>
-              <w:top w:val="single" w:sz="6" w:space="0" w:color="000000"/>
-              <w:left w:val="single" w:sz="6" w:space="0" w:color="000000"/>
-              <w:bottom w:val="single" w:sz="6" w:space="0" w:color="000000"/>
-              <w:right w:val="single" w:sz="6" w:space="0" w:color="000000"/>
-            </w:tcBorders>
-            <w:shd w:val="clear" w:color="auto" w:fill="F8FAFD"/>
-            <w:tcMar>
-              <w:top w:w="120" w:type="dxa"/>
-              <w:left w:w="180" w:type="dxa"/>
-              <w:bottom w:w="120" w:type="dxa"/>
-              <w:right w:w="180" w:type="dxa"/>
-            </w:tcMar>
             <w:hideMark/>
           </w:tcPr>
           <w:p>
             <w:pPr>
-              <w:spacing w:after="0" w:line="360" w:lineRule="auto"/>
+              <w:spacing w:line="360" w:lineRule="auto"/>
+              <w:cnfStyle w:val="000000000000" w:firstRow="0" w:lastRow="0" w:firstColumn="0" w:lastColumn="0" w:oddVBand="0" w:evenVBand="0" w:oddHBand="0" w:evenHBand="0" w:firstRowFirstColumn="0" w:firstRowLastColumn="0" w:lastRowFirstColumn="0" w:lastRowLastColumn="0"/>
               <w:rPr>
                 <w:rFonts w:eastAsia="Times New Roman"/>
                 <w:lang w:val="en-NP" w:eastAsia="en-US"/>
@@ -8602,25 +7613,13 @@
       <w:tr>
         <w:tc>
           <w:tcPr>
+            <w:cnfStyle w:val="001000000000" w:firstRow="0" w:lastRow="0" w:firstColumn="1" w:lastColumn="0" w:oddVBand="0" w:evenVBand="0" w:oddHBand="0" w:evenHBand="0" w:firstRowFirstColumn="0" w:firstRowLastColumn="0" w:lastRowFirstColumn="0" w:lastRowLastColumn="0"/>
             <w:tcW w:w="0" w:type="auto"/>
-            <w:tcBorders>
-              <w:top w:val="single" w:sz="6" w:space="0" w:color="000000"/>
-              <w:left w:val="single" w:sz="6" w:space="0" w:color="000000"/>
-              <w:bottom w:val="single" w:sz="6" w:space="0" w:color="000000"/>
-              <w:right w:val="single" w:sz="6" w:space="0" w:color="000000"/>
-            </w:tcBorders>
-            <w:shd w:val="clear" w:color="auto" w:fill="F8FAFD"/>
-            <w:tcMar>
-              <w:top w:w="120" w:type="dxa"/>
-              <w:left w:w="180" w:type="dxa"/>
-              <w:bottom w:w="120" w:type="dxa"/>
-              <w:right w:w="180" w:type="dxa"/>
-            </w:tcMar>
             <w:hideMark/>
           </w:tcPr>
           <w:p>
             <w:pPr>
-              <w:spacing w:after="0" w:line="360" w:lineRule="auto"/>
+              <w:spacing w:line="360" w:lineRule="auto"/>
               <w:rPr>
                 <w:rFonts w:eastAsia="Times New Roman"/>
                 <w:lang w:val="en-NP" w:eastAsia="en-US"/>
@@ -8629,8 +7628,6 @@
             <w:r>
               <w:rPr>
                 <w:rFonts w:eastAsia="Times New Roman"/>
-                <w:b/>
-                <w:bCs/>
                 <w:color w:val="1F1F1F"/>
                 <w:sz w:val="22"/>
                 <w:szCs w:val="22"/>
@@ -8643,24 +7640,12 @@
         <w:tc>
           <w:tcPr>
             <w:tcW w:w="0" w:type="auto"/>
-            <w:tcBorders>
-              <w:top w:val="single" w:sz="6" w:space="0" w:color="000000"/>
-              <w:left w:val="single" w:sz="6" w:space="0" w:color="000000"/>
-              <w:bottom w:val="single" w:sz="6" w:space="0" w:color="000000"/>
-              <w:right w:val="single" w:sz="6" w:space="0" w:color="000000"/>
-            </w:tcBorders>
-            <w:shd w:val="clear" w:color="auto" w:fill="F8FAFD"/>
-            <w:tcMar>
-              <w:top w:w="120" w:type="dxa"/>
-              <w:left w:w="180" w:type="dxa"/>
-              <w:bottom w:w="120" w:type="dxa"/>
-              <w:right w:w="180" w:type="dxa"/>
-            </w:tcMar>
             <w:hideMark/>
           </w:tcPr>
           <w:p>
             <w:pPr>
-              <w:spacing w:after="0" w:line="360" w:lineRule="auto"/>
+              <w:spacing w:line="360" w:lineRule="auto"/>
+              <w:cnfStyle w:val="000000000000" w:firstRow="0" w:lastRow="0" w:firstColumn="0" w:lastColumn="0" w:oddVBand="0" w:evenVBand="0" w:oddHBand="0" w:evenHBand="0" w:firstRowFirstColumn="0" w:firstRowLastColumn="0" w:lastRowFirstColumn="0" w:lastRowLastColumn="0"/>
               <w:rPr>
                 <w:rFonts w:eastAsia="Times New Roman"/>
                 <w:lang w:val="en-NP" w:eastAsia="en-US"/>
@@ -8680,6 +7665,35 @@
         </w:tc>
       </w:tr>
     </w:tbl>
+    <w:p>
+      <w:pPr>
+        <w:rPr>
+          <w:lang w:val="en-NP" w:eastAsia="en-US"/>
+        </w:rPr>
+      </w:pPr>
+    </w:p>
+    <w:p>
+      <w:pPr>
+        <w:rPr>
+          <w:lang w:val="en-NP" w:eastAsia="en-US"/>
+        </w:rPr>
+      </w:pPr>
+      <w:bookmarkStart w:id="11" w:name="_Toc228188122"/>
+    </w:p>
+    <w:p>
+      <w:pPr>
+        <w:rPr>
+          <w:lang w:val="en-NP" w:eastAsia="en-US"/>
+        </w:rPr>
+      </w:pPr>
+    </w:p>
+    <w:p>
+      <w:pPr>
+        <w:rPr>
+          <w:lang w:val="en-NP" w:eastAsia="en-US"/>
+        </w:rPr>
+      </w:pPr>
+    </w:p>
     <w:p>
       <w:pPr>
         <w:rPr>
@@ -8701,7 +7715,6 @@
           <w:lang w:val="en-NP" w:eastAsia="en-US"/>
         </w:rPr>
       </w:pPr>
-      <w:bookmarkStart w:id="11" w:name="_Toc228188122"/>
       <w:r>
         <w:rPr>
           <w:rFonts w:eastAsia="Times New Roman"/>
@@ -8876,18 +7889,44 @@
           <w:color w:val="1F1F1F"/>
           <w:lang w:val="en-NP" w:eastAsia="en-US"/>
         </w:rPr>
-        <w:t>To accurately analyze demographics, a custom mapping function was created to group numerical ages into life stages: Minor (17 and under), Adult (18 to 54), and Senior (55 and older). The pd.Categorical() function was then used with the parameter ordered=True. Ordinal encoding is vital because it preserves the meaningful sequence of these life stages (Minor &lt; Adult &lt; Senior), enabling logical and mathematical comparisons during analysis.</w:t>
-      </w:r>
-    </w:p>
-    <w:p>
-      <w:pPr>
-        <w:spacing w:after="240" w:line="360" w:lineRule="auto"/>
+        <w:t xml:space="preserve">To accurately analyze demographics, </w:t>
+      </w:r>
+      <w:r>
         <w:rPr>
           <w:rFonts w:eastAsia="Times New Roman"/>
           <w:color w:val="1F1F1F"/>
-          <w:lang w:val="en-NP" w:eastAsia="en-US"/>
-        </w:rPr>
-      </w:pPr>
+          <w:lang w:eastAsia="en-US"/>
+        </w:rPr>
+        <w:t>a</w:t>
+      </w:r>
+      <w:r>
+        <w:rPr>
+          <w:rFonts w:eastAsia="Times New Roman"/>
+          <w:color w:val="1F1F1F"/>
+          <w:lang w:eastAsia="en-US"/>
+        </w:rPr>
+        <w:t xml:space="preserve"> custom mapping function grouped numerical ages into three ordinal life stages: Minor, Adult, and Senior. Using the </w:t>
+      </w:r>
+      <w:proofErr w:type="spellStart"/>
+      <w:proofErr w:type="gramStart"/>
+      <w:r>
+        <w:rPr>
+          <w:rFonts w:eastAsia="Times New Roman"/>
+          <w:color w:val="1F1F1F"/>
+          <w:lang w:eastAsia="en-US"/>
+        </w:rPr>
+        <w:t>pd.Categorical</w:t>
+      </w:r>
+      <w:proofErr w:type="spellEnd"/>
+      <w:proofErr w:type="gramEnd"/>
+      <w:r>
+        <w:rPr>
+          <w:rFonts w:eastAsia="Times New Roman"/>
+          <w:color w:val="1F1F1F"/>
+          <w:lang w:eastAsia="en-US"/>
+        </w:rPr>
+        <w:t>() function with ordered=True preserves the meaningful sequence of these stages for logical and mathematical comparison in analysis.</w:t>
+      </w:r>
     </w:p>
     <w:p>
       <w:pPr>
@@ -8971,7 +8010,6 @@
           <w:szCs w:val="26"/>
           <w:lang w:val="en-NP" w:eastAsia="en-US"/>
         </w:rPr>
-        <w:lastRenderedPageBreak/>
         <w:t>3.2 Create Purchase_Value_Category Column</w:t>
       </w:r>
       <w:bookmarkEnd w:id="14"/>
@@ -8989,6 +8027,7 @@
           <w:lang w:val="en-NP" w:eastAsia="en-US"/>
           <w14:ligatures w14:val="standardContextual"/>
         </w:rPr>
+        <w:lastRenderedPageBreak/>
         <w:drawing>
           <wp:inline distT="0" distB="0" distL="0" distR="0" wp14:anchorId="23CE9572" wp14:editId="195C8FE4">
             <wp:extent cx="5943600" cy="1746250"/>
@@ -9099,9 +8138,55 @@
         <w:rPr>
           <w:rFonts w:eastAsia="Times New Roman"/>
           <w:color w:val="1F1F1F"/>
-          <w:lang w:val="en-NP" w:eastAsia="en-US"/>
-        </w:rPr>
-        <w:t>To segment customers by their spending habits, a new column named Purchase_Value_Category was created. The pd.cut() function was utilized to partition the continuous Amount variable into discrete categories. The thresholds were defined as Low (0-4000), Medium (4001-10000), and High (10000+). This categorization simplifies high-level reporting on customer spending tiers.</w:t>
+          <w:lang w:eastAsia="en-US"/>
+        </w:rPr>
+        <w:t xml:space="preserve">We created </w:t>
+      </w:r>
+      <w:proofErr w:type="spellStart"/>
+      <w:r>
+        <w:rPr>
+          <w:rFonts w:eastAsia="Times New Roman"/>
+          <w:color w:val="1F1F1F"/>
+          <w:lang w:eastAsia="en-US"/>
+        </w:rPr>
+        <w:t>Purchase_Value_Category</w:t>
+      </w:r>
+      <w:proofErr w:type="spellEnd"/>
+      <w:r>
+        <w:rPr>
+          <w:rFonts w:eastAsia="Times New Roman"/>
+          <w:color w:val="1F1F1F"/>
+          <w:lang w:eastAsia="en-US"/>
+        </w:rPr>
+        <w:t xml:space="preserve"> to segment customer spending. The </w:t>
+      </w:r>
+      <w:proofErr w:type="spellStart"/>
+      <w:proofErr w:type="gramStart"/>
+      <w:r>
+        <w:rPr>
+          <w:rFonts w:eastAsia="Times New Roman"/>
+          <w:color w:val="1F1F1F"/>
+          <w:lang w:eastAsia="en-US"/>
+        </w:rPr>
+        <w:t>pd.cut</w:t>
+      </w:r>
+      <w:proofErr w:type="spellEnd"/>
+      <w:r>
+        <w:rPr>
+          <w:rFonts w:eastAsia="Times New Roman"/>
+          <w:color w:val="1F1F1F"/>
+          <w:lang w:eastAsia="en-US"/>
+        </w:rPr>
+        <w:t>(</w:t>
+      </w:r>
+      <w:proofErr w:type="gramEnd"/>
+      <w:r>
+        <w:rPr>
+          <w:rFonts w:eastAsia="Times New Roman"/>
+          <w:color w:val="1F1F1F"/>
+          <w:lang w:eastAsia="en-US"/>
+        </w:rPr>
+        <w:t>) function partitioned the continuous Amount variable into discrete tiers: Low (0-4000), Medium (4001-10000), and High (10000+). This categorization simplifies high-level reporting on customer spending tiers.</w:t>
       </w:r>
     </w:p>
     <w:p>
@@ -9256,7 +8341,6 @@
         <w:spacing w:after="240" w:line="360" w:lineRule="auto"/>
         <w:rPr>
           <w:rFonts w:eastAsia="Times New Roman"/>
-          <w:color w:val="1F1F1F"/>
           <w:lang w:val="en-NP" w:eastAsia="en-US"/>
         </w:rPr>
       </w:pPr>
@@ -9264,19 +8348,46 @@
         <w:rPr>
           <w:rFonts w:eastAsia="Times New Roman"/>
           <w:color w:val="1F1F1F"/>
-          <w:lang w:val="en-NP" w:eastAsia="en-US"/>
-        </w:rPr>
-        <w:t>Irrelevant columns were removed to clean the dataset. Cust_name and User_ID contain personal identifiers that provide no statistical value for aggregate sales analysis, and dropping them maintains data privacy. The unnamed1 column was an empty artefact. Removing these variables reduces dimensionality and saves memory.</w:t>
-      </w:r>
-    </w:p>
-    <w:p>
-      <w:pPr>
-        <w:spacing w:after="240" w:line="360" w:lineRule="auto"/>
+          <w:lang w:eastAsia="en-US"/>
+        </w:rPr>
+        <w:t xml:space="preserve">Irrelevant columns were removed to clean the dataset. </w:t>
+      </w:r>
+      <w:proofErr w:type="spellStart"/>
+      <w:r>
         <w:rPr>
           <w:rFonts w:eastAsia="Times New Roman"/>
-          <w:lang w:val="en-NP" w:eastAsia="en-US"/>
-        </w:rPr>
-      </w:pPr>
+          <w:color w:val="1F1F1F"/>
+          <w:lang w:eastAsia="en-US"/>
+        </w:rPr>
+        <w:t>Cust_name</w:t>
+      </w:r>
+      <w:proofErr w:type="spellEnd"/>
+      <w:r>
+        <w:rPr>
+          <w:rFonts w:eastAsia="Times New Roman"/>
+          <w:color w:val="1F1F1F"/>
+          <w:lang w:eastAsia="en-US"/>
+        </w:rPr>
+        <w:t xml:space="preserve"> and </w:t>
+      </w:r>
+      <w:proofErr w:type="spellStart"/>
+      <w:r>
+        <w:rPr>
+          <w:rFonts w:eastAsia="Times New Roman"/>
+          <w:color w:val="1F1F1F"/>
+          <w:lang w:eastAsia="en-US"/>
+        </w:rPr>
+        <w:t>User_ID</w:t>
+      </w:r>
+      <w:proofErr w:type="spellEnd"/>
+      <w:r>
+        <w:rPr>
+          <w:rFonts w:eastAsia="Times New Roman"/>
+          <w:color w:val="1F1F1F"/>
+          <w:lang w:eastAsia="en-US"/>
+        </w:rPr>
+        <w:t xml:space="preserve"> were dropped to maintain privacy and because they provide no statistical value for aggregate sales analysis. The empty unnamed1 column was also removed. This process reduces dimensionality and saves memory.</w:t>
+      </w:r>
     </w:p>
     <w:p>
       <w:pPr>
@@ -9311,7 +8422,6 @@
           <w:szCs w:val="26"/>
           <w:lang w:val="en-NP" w:eastAsia="en-US"/>
         </w:rPr>
-        <w:lastRenderedPageBreak/>
         <w:t>3.4 Handle Missing Values</w:t>
       </w:r>
       <w:bookmarkEnd w:id="18"/>
@@ -9375,6 +8485,7 @@
           <w:color w:val="1F1F1F"/>
           <w:lang w:val="en-NP" w:eastAsia="en-US"/>
         </w:rPr>
+        <w:lastRenderedPageBreak/>
         <w:t>Mean/Median Imputation:</w:t>
       </w:r>
       <w:r>
@@ -9581,9 +8692,37 @@
         <w:rPr>
           <w:rFonts w:eastAsia="Times New Roman"/>
           <w:color w:val="1F1F1F"/>
-          <w:lang w:val="en-NP" w:eastAsia="en-US"/>
-        </w:rPr>
-        <w:t>A total of 12 rows contained null values in the critical Amount and Age fields. These rows were completely removed using the .dropna() method. Dropping these rows was chosen over imputing (guessing) the values because Amount is our primary outcome variable. Estimating financial sales figures would introduce statistical bias and compromise the integrity of our later analysis.</w:t>
+          <w:lang w:eastAsia="en-US"/>
+        </w:rPr>
+        <w:t xml:space="preserve">Twelve rows containing null values in the critical Amount and Age fields were removed using </w:t>
+      </w:r>
+      <w:proofErr w:type="gramStart"/>
+      <w:r>
+        <w:rPr>
+          <w:rFonts w:eastAsia="Times New Roman"/>
+          <w:color w:val="1F1F1F"/>
+          <w:lang w:eastAsia="en-US"/>
+        </w:rPr>
+        <w:t>the .</w:t>
+      </w:r>
+      <w:proofErr w:type="spellStart"/>
+      <w:r>
+        <w:rPr>
+          <w:rFonts w:eastAsia="Times New Roman"/>
+          <w:color w:val="1F1F1F"/>
+          <w:lang w:eastAsia="en-US"/>
+        </w:rPr>
+        <w:t>dropna</w:t>
+      </w:r>
+      <w:proofErr w:type="spellEnd"/>
+      <w:proofErr w:type="gramEnd"/>
+      <w:r>
+        <w:rPr>
+          <w:rFonts w:eastAsia="Times New Roman"/>
+          <w:color w:val="1F1F1F"/>
+          <w:lang w:eastAsia="en-US"/>
+        </w:rPr>
+        <w:t>() method. Dropping these rows was preferred over imputation because Amount is the primary outcome variable. Estimating financial figures would introduce bias and compromise analysis integrity.</w:t>
       </w:r>
     </w:p>
     <w:p>
@@ -9631,7 +8770,33 @@
         <w:spacing w:after="240" w:line="360" w:lineRule="auto"/>
         <w:rPr>
           <w:rFonts w:eastAsia="Times New Roman"/>
-          <w:color w:val="1F1F1F"/>
+          <w:lang w:val="en-NP" w:eastAsia="en-US"/>
+        </w:rPr>
+      </w:pPr>
+    </w:p>
+    <w:p>
+      <w:pPr>
+        <w:spacing w:after="240" w:line="360" w:lineRule="auto"/>
+        <w:rPr>
+          <w:rFonts w:eastAsia="Times New Roman"/>
+          <w:lang w:val="en-NP" w:eastAsia="en-US"/>
+        </w:rPr>
+      </w:pPr>
+    </w:p>
+    <w:p>
+      <w:pPr>
+        <w:spacing w:after="240" w:line="360" w:lineRule="auto"/>
+        <w:rPr>
+          <w:rFonts w:eastAsia="Times New Roman"/>
+          <w:lang w:val="en-NP" w:eastAsia="en-US"/>
+        </w:rPr>
+      </w:pPr>
+    </w:p>
+    <w:p>
+      <w:pPr>
+        <w:spacing w:after="240" w:line="360" w:lineRule="auto"/>
+        <w:rPr>
+          <w:rFonts w:eastAsia="Times New Roman"/>
           <w:lang w:val="en-NP" w:eastAsia="en-US"/>
         </w:rPr>
       </w:pPr>
@@ -9796,29 +8961,30 @@
     </w:p>
     <w:p>
       <w:pPr>
-        <w:spacing w:after="240" w:line="360" w:lineRule="auto"/>
-        <w:rPr>
-          <w:rFonts w:eastAsia="Times New Roman"/>
+        <w:spacing w:after="0" w:line="240" w:lineRule="auto"/>
+        <w:rPr>
+          <w:rFonts w:ascii="Times New Roman" w:eastAsia="Times New Roman" w:hAnsi="Times New Roman" w:cs="Times New Roman"/>
           <w:lang w:val="en-NP" w:eastAsia="en-US"/>
         </w:rPr>
       </w:pPr>
+      <w:proofErr w:type="gramStart"/>
       <w:r>
         <w:rPr>
           <w:rFonts w:eastAsia="Times New Roman"/>
           <w:color w:val="1F1F1F"/>
-          <w:lang w:val="en-NP" w:eastAsia="en-US"/>
-        </w:rPr>
-        <w:t>To fully grasp the categorical dimensions of the dataset, the unique() method was applied. The output confirmed that there are 5 unique geographic zones (Western, Southern, Central, Northern, Eastern) and 18 distinct product categories (including Auto, Food, Electronics &amp; Gadgets, etc.). Verifying these unique values ensures there are no hidden dummy values or spelling errors before generating visual charts.</w:t>
-      </w:r>
-    </w:p>
-    <w:p>
-      <w:pPr>
-        <w:spacing w:after="0" w:line="240" w:lineRule="auto"/>
-        <w:rPr>
-          <w:rFonts w:ascii="Times New Roman" w:eastAsia="Times New Roman" w:hAnsi="Times New Roman" w:cs="Times New Roman"/>
-          <w:lang w:val="en-NP" w:eastAsia="en-US"/>
-        </w:rPr>
-      </w:pPr>
+          <w:lang w:eastAsia="en-US"/>
+        </w:rPr>
+        <w:t>The .unique</w:t>
+      </w:r>
+      <w:proofErr w:type="gramEnd"/>
+      <w:r>
+        <w:rPr>
+          <w:rFonts w:eastAsia="Times New Roman"/>
+          <w:color w:val="1F1F1F"/>
+          <w:lang w:eastAsia="en-US"/>
+        </w:rPr>
+        <w:t>() method was applied to confirm the categorical dimensions of the dataset. The output verified 5 unique geographic zones and 18 distinct product categories. Verifying these values ensures there are no dummy values or spelling errors before generating charts.</w:t>
+      </w:r>
     </w:p>
     <w:p/>
     <w:p/>
@@ -9869,9 +9035,9 @@
           <w14:ligatures w14:val="standardContextual"/>
         </w:rPr>
         <w:drawing>
-          <wp:inline distT="0" distB="0" distL="0" distR="0" wp14:anchorId="5A94BBAF" wp14:editId="5B3DB964">
-            <wp:extent cx="5727700" cy="1660525"/>
-            <wp:effectExtent l="0" t="0" r="0" b="3175"/>
+          <wp:inline distT="0" distB="0" distL="0" distR="0" wp14:anchorId="5A94BBAF" wp14:editId="4D79AF85">
+            <wp:extent cx="5245711" cy="1520791"/>
+            <wp:effectExtent l="0" t="0" r="0" b="0"/>
             <wp:docPr id="1991698959" name="Picture 1"/>
             <wp:cNvGraphicFramePr>
               <a:graphicFrameLocks xmlns:a="http://schemas.openxmlformats.org/drawingml/2006/main" noChangeAspect="1"/>
@@ -9898,7 +9064,7 @@
                   <pic:spPr>
                     <a:xfrm>
                       <a:off x="0" y="0"/>
-                      <a:ext cx="5727700" cy="1660525"/>
+                      <a:ext cx="5245711" cy="1520791"/>
                     </a:xfrm>
                     <a:prstGeom prst="rect">
                       <a:avLst/>
@@ -9953,9 +9119,9 @@
           <w14:ligatures w14:val="standardContextual"/>
         </w:rPr>
         <w:drawing>
-          <wp:inline distT="0" distB="0" distL="0" distR="0" wp14:anchorId="3D85EEFF" wp14:editId="437E317F">
-            <wp:extent cx="5727700" cy="3465830"/>
-            <wp:effectExtent l="0" t="0" r="0" b="1270"/>
+          <wp:inline distT="0" distB="0" distL="0" distR="0" wp14:anchorId="3D85EEFF" wp14:editId="3E03A818">
+            <wp:extent cx="5245768" cy="3174213"/>
+            <wp:effectExtent l="0" t="0" r="0" b="0"/>
             <wp:docPr id="221937613" name="Picture 2"/>
             <wp:cNvGraphicFramePr>
               <a:graphicFrameLocks xmlns:a="http://schemas.openxmlformats.org/drawingml/2006/main" noChangeAspect="1"/>
@@ -9982,7 +9148,7 @@
                   <pic:spPr>
                     <a:xfrm>
                       <a:off x="0" y="0"/>
-                      <a:ext cx="5727700" cy="3465830"/>
+                      <a:ext cx="5245768" cy="3174213"/>
                     </a:xfrm>
                     <a:prstGeom prst="rect">
                       <a:avLst/>
@@ -10046,144 +9212,161 @@
     </w:p>
     <w:p>
       <w:pPr>
-        <w:rPr>
-          <w:lang w:val="en-NP"/>
-        </w:rPr>
-      </w:pPr>
-      <w:r>
-        <w:rPr>
-          <w:lang w:val="en-NP"/>
-        </w:rPr>
-        <w:t>We calculated key statistics (summary statistics) for the 'Age,' 'Orders,' and 'Amount' columns to better understand the way our numerical data is distributed. We used the .agg() function to compute four main metrics simultaneously:</w:t>
-      </w:r>
-    </w:p>
-    <w:p>
-      <w:pPr>
+        <w:pStyle w:val="NormalWeb"/>
+        <w:spacing w:before="0" w:beforeAutospacing="0" w:after="160" w:afterAutospacing="0" w:line="360" w:lineRule="auto"/>
+      </w:pPr>
+      <w:bookmarkStart w:id="26" w:name="_Toc228188130"/>
+      <w:r>
+        <w:rPr>
+          <w:rFonts w:ascii="Arial" w:hAnsi="Arial" w:cs="Arial"/>
+          <w:color w:val="000000"/>
+        </w:rPr>
+        <w:t>We used the .agg() function to calculate key summary statistics for the 'Age,' 'Orders,' and 'Amount' columns to understand their distribution:</w:t>
+      </w:r>
+    </w:p>
+    <w:p>
+      <w:pPr>
+        <w:pStyle w:val="NormalWeb"/>
         <w:numPr>
           <w:ilvl w:val="0"/>
-          <w:numId w:val="3"/>
+          <w:numId w:val="8"/>
         </w:numPr>
-        <w:rPr>
-          <w:lang w:val="en-NP"/>
-        </w:rPr>
-      </w:pPr>
-      <w:r>
-        <w:rPr>
+        <w:spacing w:before="0" w:beforeAutospacing="0" w:after="0" w:afterAutospacing="0" w:line="360" w:lineRule="auto"/>
+        <w:textAlignment w:val="baseline"/>
+        <w:rPr>
+          <w:rFonts w:ascii="Arial" w:hAnsi="Arial" w:cs="Arial"/>
+          <w:color w:val="000000"/>
+        </w:rPr>
+      </w:pPr>
+      <w:r>
+        <w:rPr>
+          <w:rFonts w:ascii="Arial" w:hAnsi="Arial" w:cs="Arial"/>
           <w:b/>
           <w:bCs/>
-          <w:lang w:val="en-NP"/>
+          <w:color w:val="000000"/>
         </w:rPr>
         <w:t>Mean:</w:t>
       </w:r>
       <w:r>
         <w:rPr>
-          <w:lang w:val="en-NP"/>
-        </w:rPr>
-        <w:t xml:space="preserve"> The average value for each column.</w:t>
-      </w:r>
-    </w:p>
-    <w:p>
-      <w:pPr>
+          <w:rFonts w:ascii="Arial" w:hAnsi="Arial" w:cs="Arial"/>
+          <w:color w:val="000000"/>
+        </w:rPr>
+        <w:t xml:space="preserve"> Average value.</w:t>
+      </w:r>
+    </w:p>
+    <w:p>
+      <w:pPr>
+        <w:pStyle w:val="NormalWeb"/>
         <w:numPr>
           <w:ilvl w:val="0"/>
-          <w:numId w:val="3"/>
+          <w:numId w:val="8"/>
         </w:numPr>
-        <w:rPr>
-          <w:lang w:val="en-NP"/>
-        </w:rPr>
-      </w:pPr>
-      <w:r>
-        <w:rPr>
+        <w:spacing w:before="0" w:beforeAutospacing="0" w:after="0" w:afterAutospacing="0" w:line="360" w:lineRule="auto"/>
+        <w:textAlignment w:val="baseline"/>
+        <w:rPr>
+          <w:rFonts w:ascii="Arial" w:hAnsi="Arial" w:cs="Arial"/>
+          <w:color w:val="000000"/>
+        </w:rPr>
+      </w:pPr>
+      <w:r>
+        <w:rPr>
+          <w:rFonts w:ascii="Arial" w:hAnsi="Arial" w:cs="Arial"/>
           <w:b/>
           <w:bCs/>
-          <w:lang w:val="en-NP"/>
+          <w:color w:val="000000"/>
         </w:rPr>
         <w:t>Standard Deviation (std):</w:t>
       </w:r>
       <w:r>
         <w:rPr>
-          <w:lang w:val="en-NP"/>
-        </w:rPr>
-        <w:t xml:space="preserve"> Shows how much the data points are spread out from the average.</w:t>
-      </w:r>
-    </w:p>
-    <w:p>
-      <w:pPr>
+          <w:rFonts w:ascii="Arial" w:hAnsi="Arial" w:cs="Arial"/>
+          <w:color w:val="000000"/>
+        </w:rPr>
+        <w:t xml:space="preserve"> Data spread from the average.</w:t>
+      </w:r>
+    </w:p>
+    <w:p>
+      <w:pPr>
+        <w:pStyle w:val="NormalWeb"/>
         <w:numPr>
           <w:ilvl w:val="0"/>
-          <w:numId w:val="3"/>
+          <w:numId w:val="8"/>
         </w:numPr>
-        <w:rPr>
-          <w:lang w:val="en-NP"/>
-        </w:rPr>
-      </w:pPr>
-      <w:r>
-        <w:rPr>
+        <w:spacing w:before="0" w:beforeAutospacing="0" w:after="0" w:afterAutospacing="0" w:line="360" w:lineRule="auto"/>
+        <w:textAlignment w:val="baseline"/>
+        <w:rPr>
+          <w:rFonts w:ascii="Arial" w:hAnsi="Arial" w:cs="Arial"/>
+          <w:color w:val="000000"/>
+        </w:rPr>
+      </w:pPr>
+      <w:r>
+        <w:rPr>
+          <w:rFonts w:ascii="Arial" w:hAnsi="Arial" w:cs="Arial"/>
           <w:b/>
           <w:bCs/>
-          <w:lang w:val="en-NP"/>
+          <w:color w:val="000000"/>
         </w:rPr>
         <w:t>Skewness:</w:t>
       </w:r>
       <w:r>
         <w:rPr>
-          <w:lang w:val="en-NP"/>
-        </w:rPr>
-        <w:t xml:space="preserve"> Measures if the data is unbalanced (asymmetrical). For instance, a positive skew in 'Amount' suggests that most purchases are small, but there are a few very large outliers.</w:t>
-      </w:r>
-    </w:p>
-    <w:p>
-      <w:pPr>
+          <w:rFonts w:ascii="Arial" w:hAnsi="Arial" w:cs="Arial"/>
+          <w:color w:val="000000"/>
+        </w:rPr>
+        <w:t xml:space="preserve"> Measures data asymmetry (e.g., positive skew in 'Amount' suggests small purchases with large outliers).</w:t>
+      </w:r>
+    </w:p>
+    <w:p>
+      <w:pPr>
+        <w:pStyle w:val="NormalWeb"/>
         <w:numPr>
           <w:ilvl w:val="0"/>
-          <w:numId w:val="3"/>
+          <w:numId w:val="8"/>
         </w:numPr>
+        <w:spacing w:before="0" w:beforeAutospacing="0" w:after="0" w:afterAutospacing="0" w:line="360" w:lineRule="auto"/>
+        <w:textAlignment w:val="baseline"/>
+        <w:rPr>
+          <w:rFonts w:ascii="Arial" w:hAnsi="Arial" w:cs="Arial"/>
+          <w:color w:val="000000"/>
+        </w:rPr>
+      </w:pPr>
+      <w:r>
+        <w:rPr>
+          <w:rFonts w:ascii="Arial" w:hAnsi="Arial" w:cs="Arial"/>
+          <w:b/>
+          <w:color w:val="000000"/>
+        </w:rPr>
+        <w:t>Kurtosis</w:t>
+      </w:r>
+      <w:r>
+        <w:rPr>
+          <w:rFonts w:ascii="Arial" w:hAnsi="Arial" w:cs="Arial"/>
+          <w:bCs/>
+          <w:color w:val="000000"/>
+        </w:rPr>
+        <w:t>:</w:t>
+      </w:r>
+      <w:r>
+        <w:rPr>
+          <w:rFonts w:ascii="Arial" w:hAnsi="Arial" w:cs="Arial"/>
+          <w:color w:val="000000"/>
+        </w:rPr>
+        <w:t xml:space="preserve"> Identifies if data has heavy tails (extreme outliers).</w:t>
+      </w:r>
+    </w:p>
+    <w:p>
+      <w:pPr>
+        <w:pStyle w:val="Heading2"/>
         <w:rPr>
           <w:lang w:val="en-NP"/>
         </w:rPr>
       </w:pPr>
       <w:r>
         <w:rPr>
-          <w:b/>
-          <w:bCs/>
           <w:lang w:val="en-NP"/>
         </w:rPr>
         <w:lastRenderedPageBreak/>
-        <w:t>Kurtosis:</w:t>
-      </w:r>
-      <w:r>
-        <w:rPr>
-          <w:lang w:val="en-NP"/>
-        </w:rPr>
-        <w:t xml:space="preserve"> Helps to </w:t>
-      </w:r>
-      <w:r>
-        <w:rPr>
-          <w:i/>
-          <w:iCs/>
-          <w:lang w:val="en-NP"/>
-        </w:rPr>
-        <w:t>identify</w:t>
-      </w:r>
-      <w:r>
-        <w:rPr>
-          <w:lang w:val="en-NP"/>
-        </w:rPr>
-        <w:t xml:space="preserve"> whether the data has heavy tails (meaning it has extreme outliers).</w:t>
-      </w:r>
-    </w:p>
-    <w:p>
-      <w:pPr>
-        <w:pStyle w:val="Heading2"/>
-        <w:rPr>
-          <w:lang w:val="en-NP"/>
-        </w:rPr>
-      </w:pPr>
-      <w:bookmarkStart w:id="26" w:name="_Toc228188130"/>
-      <w:r>
-        <w:rPr>
-          <w:lang w:val="en-NP"/>
-        </w:rPr>
         <w:t>4.2 Correlation Analysis</w:t>
       </w:r>
       <w:bookmarkEnd w:id="26"/>
@@ -10201,9 +9384,9 @@
           <w14:ligatures w14:val="standardContextual"/>
         </w:rPr>
         <w:drawing>
-          <wp:inline distT="0" distB="0" distL="0" distR="0" wp14:anchorId="218F8ABE" wp14:editId="2E27E879">
-            <wp:extent cx="5727700" cy="2004060"/>
-            <wp:effectExtent l="0" t="0" r="0" b="2540"/>
+          <wp:inline distT="0" distB="0" distL="0" distR="0" wp14:anchorId="218F8ABE" wp14:editId="50999925">
+            <wp:extent cx="4869177" cy="1703672"/>
+            <wp:effectExtent l="0" t="0" r="0" b="0"/>
             <wp:docPr id="2051796850" name="Picture 4"/>
             <wp:cNvGraphicFramePr>
               <a:graphicFrameLocks xmlns:a="http://schemas.openxmlformats.org/drawingml/2006/main" noChangeAspect="1"/>
@@ -10216,7 +9399,7 @@
                     <pic:cNvPicPr/>
                   </pic:nvPicPr>
                   <pic:blipFill>
-                    <a:blip r:embed="rId22">
+                    <a:blip r:embed="rId22" cstate="print">
                       <a:extLst>
                         <a:ext uri="{28A0092B-C50C-407E-A947-70E740481C1C}">
                           <a14:useLocalDpi xmlns:a14="http://schemas.microsoft.com/office/drawing/2010/main" val="0"/>
@@ -10230,7 +9413,7 @@
                   <pic:spPr>
                     <a:xfrm>
                       <a:off x="0" y="0"/>
-                      <a:ext cx="5727700" cy="2004060"/>
+                      <a:ext cx="4891578" cy="1711510"/>
                     </a:xfrm>
                     <a:prstGeom prst="rect">
                       <a:avLst/>
@@ -10287,8 +9470,8 @@
           <w14:ligatures w14:val="standardContextual"/>
         </w:rPr>
         <w:drawing>
-          <wp:inline distT="0" distB="0" distL="0" distR="0" wp14:anchorId="417A8CBA" wp14:editId="325C250A">
-            <wp:extent cx="5727700" cy="4358640"/>
+          <wp:inline distT="0" distB="0" distL="0" distR="0" wp14:anchorId="417A8CBA" wp14:editId="25D0A6BE">
+            <wp:extent cx="4880008" cy="3713567"/>
             <wp:effectExtent l="0" t="0" r="0" b="0"/>
             <wp:docPr id="537915563" name="Picture 3"/>
             <wp:cNvGraphicFramePr>
@@ -10316,7 +9499,7 @@
                   <pic:spPr>
                     <a:xfrm>
                       <a:off x="0" y="0"/>
-                      <a:ext cx="5727700" cy="4358640"/>
+                      <a:ext cx="4884945" cy="3717324"/>
                     </a:xfrm>
                     <a:prstGeom prst="rect">
                       <a:avLst/>
@@ -10372,231 +9555,27 @@
     <w:p>
       <w:pPr>
         <w:rPr>
+          <w:lang w:val="en-NP"/>
+        </w:rPr>
+      </w:pPr>
+      <w:r>
+        <w:rPr>
           <w:b/>
           <w:bCs/>
           <w:lang w:val="en-NP"/>
         </w:rPr>
-      </w:pPr>
-    </w:p>
-    <w:p>
-      <w:pPr>
-        <w:rPr>
-          <w:b/>
-          <w:bCs/>
+        <w:t>Explanation:</w:t>
+      </w:r>
+    </w:p>
+    <w:p>
+      <w:pPr>
+        <w:rPr>
           <w:lang w:val="en-NP"/>
         </w:rPr>
       </w:pPr>
-    </w:p>
-    <w:p>
-      <w:pPr>
-        <w:rPr>
-          <w:lang w:val="en-NP"/>
-        </w:rPr>
-      </w:pPr>
-      <w:r>
-        <w:rPr>
-          <w:b/>
-          <w:bCs/>
-          <w:lang w:val="en-NP"/>
-        </w:rPr>
-        <w:lastRenderedPageBreak/>
-        <w:t>Explanation:</w:t>
-      </w:r>
-    </w:p>
-    <w:p>
-      <w:pPr>
-        <w:rPr>
-          <w:lang w:val="en-NP"/>
-        </w:rPr>
-      </w:pPr>
-      <w:r>
-        <w:rPr>
-          <w:lang w:val="en-NP"/>
-        </w:rPr>
-        <w:t xml:space="preserve">We performed a correlation analysis to </w:t>
-      </w:r>
-      <w:r>
-        <w:rPr>
-          <w:i/>
-          <w:iCs/>
-          <w:lang w:val="en-NP"/>
-        </w:rPr>
-        <w:t>determine</w:t>
-      </w:r>
-      <w:r>
-        <w:rPr>
-          <w:lang w:val="en-NP"/>
-        </w:rPr>
-        <w:t xml:space="preserve"> if there is a statistical link (relationship) between the numerical variables. We used the Pearson correlation method to calculate the links between all pairs, which we then visualized using a Seaborn heatmap. In this heatmap, values that are close to 1 show a strong positive relationship (for example, if 'Orders' increase, the 'Amount' spent also increases). Values closer to 0 indicate no meaningful relationship. Displaying this information as a heatmap makes it easy to quickly </w:t>
-      </w:r>
-      <w:r>
-        <w:rPr>
-          <w:i/>
-          <w:iCs/>
-          <w:lang w:val="en-NP"/>
-        </w:rPr>
-        <w:t>discern</w:t>
-      </w:r>
-      <w:r>
-        <w:rPr>
-          <w:lang w:val="en-NP"/>
-        </w:rPr>
-        <w:t xml:space="preserve"> which variables </w:t>
-      </w:r>
-      <w:r>
-        <w:rPr>
-          <w:i/>
-          <w:iCs/>
-          <w:lang w:val="en-NP"/>
-        </w:rPr>
-        <w:t>coincide</w:t>
-      </w:r>
-      <w:r>
-        <w:rPr>
-          <w:lang w:val="en-NP"/>
-        </w:rPr>
-        <w:t xml:space="preserve"> (move together).</w:t>
-      </w:r>
-    </w:p>
-    <w:p>
-      <w:pPr>
-        <w:rPr>
-          <w:lang w:val="en-NP"/>
-        </w:rPr>
-      </w:pPr>
-    </w:p>
-    <w:p>
-      <w:pPr>
-        <w:rPr>
-          <w:lang w:val="en-NP"/>
-        </w:rPr>
-      </w:pPr>
-    </w:p>
-    <w:p>
-      <w:pPr>
-        <w:rPr>
-          <w:lang w:val="en-NP"/>
-        </w:rPr>
-      </w:pPr>
-    </w:p>
-    <w:p>
-      <w:pPr>
-        <w:rPr>
-          <w:lang w:val="en-NP"/>
-        </w:rPr>
-      </w:pPr>
-    </w:p>
-    <w:p>
-      <w:pPr>
-        <w:rPr>
-          <w:lang w:val="en-NP"/>
-        </w:rPr>
-      </w:pPr>
-    </w:p>
-    <w:p>
-      <w:pPr>
-        <w:rPr>
-          <w:lang w:val="en-NP"/>
-        </w:rPr>
-      </w:pPr>
-    </w:p>
-    <w:p>
-      <w:pPr>
-        <w:rPr>
-          <w:lang w:val="en-NP"/>
-        </w:rPr>
-      </w:pPr>
-    </w:p>
-    <w:p>
-      <w:pPr>
-        <w:rPr>
-          <w:lang w:val="en-NP"/>
-        </w:rPr>
-      </w:pPr>
-    </w:p>
-    <w:p>
-      <w:pPr>
-        <w:rPr>
-          <w:lang w:val="en-NP"/>
-        </w:rPr>
-      </w:pPr>
-    </w:p>
-    <w:p>
-      <w:pPr>
-        <w:rPr>
-          <w:lang w:val="en-NP"/>
-        </w:rPr>
-      </w:pPr>
-    </w:p>
-    <w:p>
-      <w:pPr>
-        <w:rPr>
-          <w:lang w:val="en-NP"/>
-        </w:rPr>
-      </w:pPr>
-    </w:p>
-    <w:p>
-      <w:pPr>
-        <w:rPr>
-          <w:lang w:val="en-NP"/>
-        </w:rPr>
-      </w:pPr>
-    </w:p>
-    <w:p>
-      <w:pPr>
-        <w:rPr>
-          <w:lang w:val="en-NP"/>
-        </w:rPr>
-      </w:pPr>
-    </w:p>
-    <w:p>
-      <w:pPr>
-        <w:rPr>
-          <w:lang w:val="en-NP"/>
-        </w:rPr>
-      </w:pPr>
-    </w:p>
-    <w:p>
-      <w:pPr>
-        <w:rPr>
-          <w:lang w:val="en-NP"/>
-        </w:rPr>
-      </w:pPr>
-    </w:p>
-    <w:p>
-      <w:pPr>
-        <w:rPr>
-          <w:lang w:val="en-NP"/>
-        </w:rPr>
-      </w:pPr>
-    </w:p>
-    <w:p>
-      <w:pPr>
-        <w:rPr>
-          <w:lang w:val="en-NP"/>
-        </w:rPr>
-      </w:pPr>
-    </w:p>
-    <w:p>
-      <w:pPr>
-        <w:rPr>
-          <w:lang w:val="en-NP"/>
-        </w:rPr>
-      </w:pPr>
-    </w:p>
-    <w:p>
-      <w:pPr>
-        <w:rPr>
-          <w:lang w:val="en-NP"/>
-        </w:rPr>
-      </w:pPr>
-    </w:p>
-    <w:p>
-      <w:pPr>
-        <w:rPr>
-          <w:lang w:val="en-NP"/>
-        </w:rPr>
-      </w:pPr>
+      <w:r>
+        <w:t>A correlation analysis was performed using the Pearson method to find statistical relationships between numerical variables, visualized with a Seaborn heatmap. Values near 1 indicate a strong positive relationship (e.g., as 'Orders' increase, 'Amount' increases), while values near 0 show no relationship. This heatmap allows for quick discernment of co-moving variables.</w:t>
+      </w:r>
     </w:p>
     <w:p>
       <w:pPr>
@@ -10626,7 +9605,6 @@
         <w:rPr>
           <w:lang w:val="en-NP"/>
         </w:rPr>
-        <w:lastRenderedPageBreak/>
         <w:t>5. Comprehensive Data Discovery</w:t>
       </w:r>
       <w:bookmarkEnd w:id="29"/>
@@ -10875,30 +9853,17 @@
     </w:p>
     <w:p>
       <w:pPr>
+        <w:pStyle w:val="Heading3"/>
         <w:rPr>
           <w:lang w:val="en-NP"/>
         </w:rPr>
       </w:pPr>
-    </w:p>
-    <w:p>
-      <w:pPr>
+      <w:bookmarkStart w:id="34" w:name="_Toc228188134"/>
+      <w:r>
         <w:rPr>
           <w:lang w:val="en-NP"/>
         </w:rPr>
-      </w:pPr>
-    </w:p>
-    <w:p>
-      <w:pPr>
-        <w:pStyle w:val="Heading3"/>
-        <w:rPr>
-          <w:lang w:val="en-NP"/>
-        </w:rPr>
-      </w:pPr>
-      <w:bookmarkStart w:id="34" w:name="_Toc228188134"/>
-      <w:r>
-        <w:rPr>
-          <w:lang w:val="en-NP"/>
-        </w:rPr>
+        <w:lastRenderedPageBreak/>
         <w:t xml:space="preserve">5.1.2. </w:t>
       </w:r>
       <w:r>
@@ -11173,6 +10138,7 @@
         <w:rPr>
           <w:lang w:val="en-NP"/>
         </w:rPr>
+        <w:lastRenderedPageBreak/>
         <w:t xml:space="preserve">5.1.3. </w:t>
       </w:r>
       <w:r>
@@ -11290,7 +10256,7 @@
           <w14:ligatures w14:val="standardContextual"/>
         </w:rPr>
         <w:drawing>
-          <wp:inline distT="0" distB="0" distL="0" distR="0" wp14:anchorId="3878F21F" wp14:editId="6A9782C9">
+          <wp:inline distT="0" distB="0" distL="0" distR="0" wp14:anchorId="3878F21F" wp14:editId="5D4DCBEC">
             <wp:extent cx="5727700" cy="3740150"/>
             <wp:effectExtent l="0" t="0" r="0" b="6350"/>
             <wp:docPr id="503386566" name="Picture 24"/>
@@ -11647,7 +10613,7 @@
           <w14:ligatures w14:val="standardContextual"/>
         </w:rPr>
         <w:drawing>
-          <wp:inline distT="0" distB="0" distL="0" distR="0" wp14:anchorId="74B65082" wp14:editId="66BAD37B">
+          <wp:inline distT="0" distB="0" distL="0" distR="0" wp14:anchorId="74B65082" wp14:editId="624A73EA">
             <wp:extent cx="5727700" cy="2244725"/>
             <wp:effectExtent l="0" t="0" r="0" b="3175"/>
             <wp:docPr id="520018879" name="Picture 26"/>
@@ -11899,6 +10865,7 @@
         <w:rPr>
           <w:b/>
           <w:bCs/>
+          <w:noProof/>
           <w:lang w:val="en-NP"/>
         </w:rPr>
         <w:drawing>
@@ -11977,6 +10944,7 @@
       </w:pPr>
       <w:r>
         <w:rPr>
+          <w:noProof/>
           <w:lang w:val="en-NP"/>
         </w:rPr>
         <w:drawing>
@@ -12242,11 +11210,23 @@
         </w:rPr>
       </w:pPr>
       <w:r>
+        <w:t xml:space="preserve">A One-Way ANOVA test investigated if professional background influences spending. </w:t>
+      </w:r>
+      <w:proofErr w:type="spellStart"/>
+      <w:r>
+        <w:t>Analyzing</w:t>
+      </w:r>
+      <w:proofErr w:type="spellEnd"/>
+      <w:r>
+        <w:t xml:space="preserve"> variance, we checked if the p-value met the 0.05 threshold. Significance confirms occupation is a substantial factor in determining spending levels.</w:t>
+      </w:r>
+    </w:p>
+    <w:p>
+      <w:pPr>
         <w:rPr>
           <w:lang w:val="en-NP"/>
         </w:rPr>
-        <w:t>A One-Way ANOVA test was utilized to investigate if professional background influences purchasing behavior. By analyzing variance within and between groups, we determine if the p-value meets the 0.05 threshold. Reaching this level of significance allows us to conclude that occupation is a substantial factor in determining spending levels.</w:t>
-      </w:r>
+      </w:pPr>
     </w:p>
     <w:p>
       <w:pPr>
@@ -12299,31 +11279,16 @@
     </w:p>
     <w:p>
       <w:pPr>
+        <w:pStyle w:val="Heading2"/>
         <w:rPr>
           <w:lang w:val="en-NP"/>
         </w:rPr>
       </w:pPr>
-    </w:p>
-    <w:p>
-      <w:pPr>
+      <w:bookmarkStart w:id="50" w:name="_Toc228188140"/>
+      <w:r>
         <w:rPr>
           <w:lang w:val="en-NP"/>
         </w:rPr>
-      </w:pPr>
-    </w:p>
-    <w:p>
-      <w:pPr>
-        <w:pStyle w:val="Heading2"/>
-        <w:rPr>
-          <w:lang w:val="en-NP"/>
-        </w:rPr>
-      </w:pPr>
-      <w:bookmarkStart w:id="50" w:name="_Toc228188140"/>
-      <w:r>
-        <w:rPr>
-          <w:lang w:val="en-NP"/>
-        </w:rPr>
-        <w:lastRenderedPageBreak/>
         <w:t xml:space="preserve">6.2 Chi-Square </w:t>
       </w:r>
       <w:r>
@@ -12369,8 +11334,10 @@
         <w:rPr>
           <w:b/>
           <w:bCs/>
+          <w:noProof/>
           <w:lang w:val="en-NP"/>
         </w:rPr>
+        <w:lastRenderedPageBreak/>
         <w:drawing>
           <wp:inline distT="0" distB="0" distL="0" distR="0" wp14:anchorId="0BC0A61B" wp14:editId="14B190A3">
             <wp:extent cx="233680" cy="233680"/>
@@ -12447,6 +11414,7 @@
       </w:pPr>
       <w:r>
         <w:rPr>
+          <w:noProof/>
           <w:lang w:val="en-NP"/>
         </w:rPr>
         <w:drawing>
@@ -12526,7 +11494,7 @@
           <w14:ligatures w14:val="standardContextual"/>
         </w:rPr>
         <w:drawing>
-          <wp:inline distT="0" distB="0" distL="0" distR="0" wp14:anchorId="67B48E4B" wp14:editId="27E51C3B">
+          <wp:inline distT="0" distB="0" distL="0" distR="0" wp14:anchorId="67B48E4B" wp14:editId="3588F5CC">
             <wp:extent cx="5727700" cy="1864360"/>
             <wp:effectExtent l="0" t="0" r="0" b="2540"/>
             <wp:docPr id="1423414603" name="Picture 32"/>
@@ -12707,11 +11675,22 @@
         </w:rPr>
       </w:pPr>
       <w:r>
+        <w:t>The Chi-Square test determined if regionality affects product selection. By using contingency tables to measure frequency, we evaluated the p-value. If significant, the findings confirm that specific geographic zones exhibit distinct preferences for merchandise.</w:t>
+      </w:r>
+    </w:p>
+    <w:p>
+      <w:pPr>
         <w:rPr>
           <w:lang w:val="en-NP"/>
         </w:rPr>
-        <w:t>The Chi-Square test of independence was employed to determine if regionality affects product selection. By constructing contingency tables to measure frequency distribution, we evaluate the resulting p-value. If significant, the findings confirm that specific geographic zones exhibit distinct preferences for certain merchandise.</w:t>
-      </w:r>
+      </w:pPr>
+    </w:p>
+    <w:p>
+      <w:pPr>
+        <w:rPr>
+          <w:lang w:val="en-NP"/>
+        </w:rPr>
+      </w:pPr>
     </w:p>
     <w:p>
       <w:pPr>
@@ -12799,44 +11778,14 @@
         </w:rPr>
       </w:pPr>
       <w:r>
-        <w:rPr>
-          <w:lang w:val="en-NP"/>
-        </w:rPr>
-        <w:t>This analysis has successfully converted complex transaction data into strategic insights regarding sales performance.</w:t>
-      </w:r>
-    </w:p>
-    <w:p>
-      <w:pPr>
-        <w:rPr>
-          <w:lang w:val="en-NP"/>
-        </w:rPr>
-      </w:pPr>
-      <w:r>
-        <w:rPr>
-          <w:lang w:val="en-NP"/>
-        </w:rPr>
-        <w:t>Through data refinement, we identified key patterns including high-performing regions, gender-based preferences, and purchasing power across age groups. These findings highlight the most profitable markets and demographic segments for the organization.</w:t>
-      </w:r>
-    </w:p>
-    <w:p>
-      <w:pPr>
-        <w:rPr>
-          <w:lang w:val="en-NP"/>
-        </w:rPr>
-      </w:pPr>
-      <w:r>
-        <w:rPr>
-          <w:lang w:val="en-NP"/>
-        </w:rPr>
-        <w:t>Ultimately, these visual trends were corroborated by formal statistical evidence. The ANOVA and Chi-Square tests validated the significant roles that occupation and geography play in consumer behavior. These empirical results provide a robust foundation for optimizing inventory, targeting key audiences, and enhancing regional marketing strategies for upcoming seasons.</w:t>
-      </w:r>
-    </w:p>
-    <w:p>
-      <w:pPr>
-        <w:rPr>
-          <w:lang w:val="en-NP"/>
-        </w:rPr>
-      </w:pPr>
+        <w:t xml:space="preserve">This analysis converted transaction data into strategic sales insights. We identified key patterns—including high-performing regions and demographic preferences—that highlight the most profitable segments. Formal statistical tests (ANOVA and Chi-Square) validated that occupation and geography significantly influence consumer </w:t>
+      </w:r>
+      <w:r>
+        <w:t>behaviour</w:t>
+      </w:r>
+      <w:r>
+        <w:t>, providing a robust foundation for optimizing inventory and marketing strategies.</w:t>
+      </w:r>
     </w:p>
     <w:p/>
     <w:sectPr>
@@ -13875,122 +12824,9 @@
     </w:lvl>
   </w:abstractNum>
   <w:abstractNum w:abstractNumId="5" w15:restartNumberingAfterBreak="0">
-    <w:nsid w:val="6F805921"/>
+    <w:nsid w:val="69256EFE"/>
     <w:multiLevelType w:val="multilevel"/>
-    <w:tmpl w:val="1436BDD6"/>
-    <w:lvl w:ilvl="0">
-      <w:start w:val="1"/>
-      <w:numFmt w:val="decimal"/>
-      <w:lvlText w:val="%1."/>
-      <w:lvlJc w:val="left"/>
-      <w:pPr>
-        <w:tabs>
-          <w:tab w:val="num" w:pos="720"/>
-        </w:tabs>
-        <w:ind w:left="720" w:hanging="360"/>
-      </w:pPr>
-    </w:lvl>
-    <w:lvl w:ilvl="1" w:tentative="1">
-      <w:start w:val="1"/>
-      <w:numFmt w:val="decimal"/>
-      <w:lvlText w:val="%2."/>
-      <w:lvlJc w:val="left"/>
-      <w:pPr>
-        <w:tabs>
-          <w:tab w:val="num" w:pos="1440"/>
-        </w:tabs>
-        <w:ind w:left="1440" w:hanging="360"/>
-      </w:pPr>
-    </w:lvl>
-    <w:lvl w:ilvl="2" w:tentative="1">
-      <w:start w:val="1"/>
-      <w:numFmt w:val="decimal"/>
-      <w:lvlText w:val="%3."/>
-      <w:lvlJc w:val="left"/>
-      <w:pPr>
-        <w:tabs>
-          <w:tab w:val="num" w:pos="2160"/>
-        </w:tabs>
-        <w:ind w:left="2160" w:hanging="360"/>
-      </w:pPr>
-    </w:lvl>
-    <w:lvl w:ilvl="3" w:tentative="1">
-      <w:start w:val="1"/>
-      <w:numFmt w:val="decimal"/>
-      <w:lvlText w:val="%4."/>
-      <w:lvlJc w:val="left"/>
-      <w:pPr>
-        <w:tabs>
-          <w:tab w:val="num" w:pos="2880"/>
-        </w:tabs>
-        <w:ind w:left="2880" w:hanging="360"/>
-      </w:pPr>
-    </w:lvl>
-    <w:lvl w:ilvl="4" w:tentative="1">
-      <w:start w:val="1"/>
-      <w:numFmt w:val="decimal"/>
-      <w:lvlText w:val="%5."/>
-      <w:lvlJc w:val="left"/>
-      <w:pPr>
-        <w:tabs>
-          <w:tab w:val="num" w:pos="3600"/>
-        </w:tabs>
-        <w:ind w:left="3600" w:hanging="360"/>
-      </w:pPr>
-    </w:lvl>
-    <w:lvl w:ilvl="5" w:tentative="1">
-      <w:start w:val="1"/>
-      <w:numFmt w:val="decimal"/>
-      <w:lvlText w:val="%6."/>
-      <w:lvlJc w:val="left"/>
-      <w:pPr>
-        <w:tabs>
-          <w:tab w:val="num" w:pos="4320"/>
-        </w:tabs>
-        <w:ind w:left="4320" w:hanging="360"/>
-      </w:pPr>
-    </w:lvl>
-    <w:lvl w:ilvl="6" w:tentative="1">
-      <w:start w:val="1"/>
-      <w:numFmt w:val="decimal"/>
-      <w:lvlText w:val="%7."/>
-      <w:lvlJc w:val="left"/>
-      <w:pPr>
-        <w:tabs>
-          <w:tab w:val="num" w:pos="5040"/>
-        </w:tabs>
-        <w:ind w:left="5040" w:hanging="360"/>
-      </w:pPr>
-    </w:lvl>
-    <w:lvl w:ilvl="7" w:tentative="1">
-      <w:start w:val="1"/>
-      <w:numFmt w:val="decimal"/>
-      <w:lvlText w:val="%8."/>
-      <w:lvlJc w:val="left"/>
-      <w:pPr>
-        <w:tabs>
-          <w:tab w:val="num" w:pos="5760"/>
-        </w:tabs>
-        <w:ind w:left="5760" w:hanging="360"/>
-      </w:pPr>
-    </w:lvl>
-    <w:lvl w:ilvl="8" w:tentative="1">
-      <w:start w:val="1"/>
-      <w:numFmt w:val="decimal"/>
-      <w:lvlText w:val="%9."/>
-      <w:lvlJc w:val="left"/>
-      <w:pPr>
-        <w:tabs>
-          <w:tab w:val="num" w:pos="6480"/>
-        </w:tabs>
-        <w:ind w:left="6480" w:hanging="360"/>
-      </w:pPr>
-    </w:lvl>
-  </w:abstractNum>
-  <w:abstractNum w:abstractNumId="6" w15:restartNumberingAfterBreak="0">
-    <w:nsid w:val="7FC03929"/>
-    <w:multiLevelType w:val="multilevel"/>
-    <w:tmpl w:val="382080A2"/>
+    <w:tmpl w:val="BE263034"/>
     <w:lvl w:ilvl="0">
       <w:start w:val="1"/>
       <w:numFmt w:val="bullet"/>
@@ -14136,11 +12972,273 @@
       </w:rPr>
     </w:lvl>
   </w:abstractNum>
+  <w:abstractNum w:abstractNumId="6" w15:restartNumberingAfterBreak="0">
+    <w:nsid w:val="6F805921"/>
+    <w:multiLevelType w:val="multilevel"/>
+    <w:tmpl w:val="1436BDD6"/>
+    <w:lvl w:ilvl="0">
+      <w:start w:val="1"/>
+      <w:numFmt w:val="decimal"/>
+      <w:lvlText w:val="%1."/>
+      <w:lvlJc w:val="left"/>
+      <w:pPr>
+        <w:tabs>
+          <w:tab w:val="num" w:pos="720"/>
+        </w:tabs>
+        <w:ind w:left="720" w:hanging="360"/>
+      </w:pPr>
+    </w:lvl>
+    <w:lvl w:ilvl="1" w:tentative="1">
+      <w:start w:val="1"/>
+      <w:numFmt w:val="decimal"/>
+      <w:lvlText w:val="%2."/>
+      <w:lvlJc w:val="left"/>
+      <w:pPr>
+        <w:tabs>
+          <w:tab w:val="num" w:pos="1440"/>
+        </w:tabs>
+        <w:ind w:left="1440" w:hanging="360"/>
+      </w:pPr>
+    </w:lvl>
+    <w:lvl w:ilvl="2" w:tentative="1">
+      <w:start w:val="1"/>
+      <w:numFmt w:val="decimal"/>
+      <w:lvlText w:val="%3."/>
+      <w:lvlJc w:val="left"/>
+      <w:pPr>
+        <w:tabs>
+          <w:tab w:val="num" w:pos="2160"/>
+        </w:tabs>
+        <w:ind w:left="2160" w:hanging="360"/>
+      </w:pPr>
+    </w:lvl>
+    <w:lvl w:ilvl="3" w:tentative="1">
+      <w:start w:val="1"/>
+      <w:numFmt w:val="decimal"/>
+      <w:lvlText w:val="%4."/>
+      <w:lvlJc w:val="left"/>
+      <w:pPr>
+        <w:tabs>
+          <w:tab w:val="num" w:pos="2880"/>
+        </w:tabs>
+        <w:ind w:left="2880" w:hanging="360"/>
+      </w:pPr>
+    </w:lvl>
+    <w:lvl w:ilvl="4" w:tentative="1">
+      <w:start w:val="1"/>
+      <w:numFmt w:val="decimal"/>
+      <w:lvlText w:val="%5."/>
+      <w:lvlJc w:val="left"/>
+      <w:pPr>
+        <w:tabs>
+          <w:tab w:val="num" w:pos="3600"/>
+        </w:tabs>
+        <w:ind w:left="3600" w:hanging="360"/>
+      </w:pPr>
+    </w:lvl>
+    <w:lvl w:ilvl="5" w:tentative="1">
+      <w:start w:val="1"/>
+      <w:numFmt w:val="decimal"/>
+      <w:lvlText w:val="%6."/>
+      <w:lvlJc w:val="left"/>
+      <w:pPr>
+        <w:tabs>
+          <w:tab w:val="num" w:pos="4320"/>
+        </w:tabs>
+        <w:ind w:left="4320" w:hanging="360"/>
+      </w:pPr>
+    </w:lvl>
+    <w:lvl w:ilvl="6" w:tentative="1">
+      <w:start w:val="1"/>
+      <w:numFmt w:val="decimal"/>
+      <w:lvlText w:val="%7."/>
+      <w:lvlJc w:val="left"/>
+      <w:pPr>
+        <w:tabs>
+          <w:tab w:val="num" w:pos="5040"/>
+        </w:tabs>
+        <w:ind w:left="5040" w:hanging="360"/>
+      </w:pPr>
+    </w:lvl>
+    <w:lvl w:ilvl="7" w:tentative="1">
+      <w:start w:val="1"/>
+      <w:numFmt w:val="decimal"/>
+      <w:lvlText w:val="%8."/>
+      <w:lvlJc w:val="left"/>
+      <w:pPr>
+        <w:tabs>
+          <w:tab w:val="num" w:pos="5760"/>
+        </w:tabs>
+        <w:ind w:left="5760" w:hanging="360"/>
+      </w:pPr>
+    </w:lvl>
+    <w:lvl w:ilvl="8" w:tentative="1">
+      <w:start w:val="1"/>
+      <w:numFmt w:val="decimal"/>
+      <w:lvlText w:val="%9."/>
+      <w:lvlJc w:val="left"/>
+      <w:pPr>
+        <w:tabs>
+          <w:tab w:val="num" w:pos="6480"/>
+        </w:tabs>
+        <w:ind w:left="6480" w:hanging="360"/>
+      </w:pPr>
+    </w:lvl>
+  </w:abstractNum>
+  <w:abstractNum w:abstractNumId="7" w15:restartNumberingAfterBreak="0">
+    <w:nsid w:val="7FC03929"/>
+    <w:multiLevelType w:val="multilevel"/>
+    <w:tmpl w:val="382080A2"/>
+    <w:lvl w:ilvl="0">
+      <w:start w:val="1"/>
+      <w:numFmt w:val="bullet"/>
+      <w:lvlText w:val=""/>
+      <w:lvlJc w:val="left"/>
+      <w:pPr>
+        <w:tabs>
+          <w:tab w:val="num" w:pos="720"/>
+        </w:tabs>
+        <w:ind w:left="720" w:hanging="360"/>
+      </w:pPr>
+      <w:rPr>
+        <w:rFonts w:ascii="Symbol" w:hAnsi="Symbol" w:hint="default"/>
+        <w:sz w:val="20"/>
+      </w:rPr>
+    </w:lvl>
+    <w:lvl w:ilvl="1" w:tentative="1">
+      <w:start w:val="1"/>
+      <w:numFmt w:val="bullet"/>
+      <w:lvlText w:val="o"/>
+      <w:lvlJc w:val="left"/>
+      <w:pPr>
+        <w:tabs>
+          <w:tab w:val="num" w:pos="1440"/>
+        </w:tabs>
+        <w:ind w:left="1440" w:hanging="360"/>
+      </w:pPr>
+      <w:rPr>
+        <w:rFonts w:ascii="Courier New" w:hAnsi="Courier New" w:hint="default"/>
+        <w:sz w:val="20"/>
+      </w:rPr>
+    </w:lvl>
+    <w:lvl w:ilvl="2" w:tentative="1">
+      <w:start w:val="1"/>
+      <w:numFmt w:val="bullet"/>
+      <w:lvlText w:val=""/>
+      <w:lvlJc w:val="left"/>
+      <w:pPr>
+        <w:tabs>
+          <w:tab w:val="num" w:pos="2160"/>
+        </w:tabs>
+        <w:ind w:left="2160" w:hanging="360"/>
+      </w:pPr>
+      <w:rPr>
+        <w:rFonts w:ascii="Wingdings" w:hAnsi="Wingdings" w:hint="default"/>
+        <w:sz w:val="20"/>
+      </w:rPr>
+    </w:lvl>
+    <w:lvl w:ilvl="3" w:tentative="1">
+      <w:start w:val="1"/>
+      <w:numFmt w:val="bullet"/>
+      <w:lvlText w:val=""/>
+      <w:lvlJc w:val="left"/>
+      <w:pPr>
+        <w:tabs>
+          <w:tab w:val="num" w:pos="2880"/>
+        </w:tabs>
+        <w:ind w:left="2880" w:hanging="360"/>
+      </w:pPr>
+      <w:rPr>
+        <w:rFonts w:ascii="Wingdings" w:hAnsi="Wingdings" w:hint="default"/>
+        <w:sz w:val="20"/>
+      </w:rPr>
+    </w:lvl>
+    <w:lvl w:ilvl="4" w:tentative="1">
+      <w:start w:val="1"/>
+      <w:numFmt w:val="bullet"/>
+      <w:lvlText w:val=""/>
+      <w:lvlJc w:val="left"/>
+      <w:pPr>
+        <w:tabs>
+          <w:tab w:val="num" w:pos="3600"/>
+        </w:tabs>
+        <w:ind w:left="3600" w:hanging="360"/>
+      </w:pPr>
+      <w:rPr>
+        <w:rFonts w:ascii="Wingdings" w:hAnsi="Wingdings" w:hint="default"/>
+        <w:sz w:val="20"/>
+      </w:rPr>
+    </w:lvl>
+    <w:lvl w:ilvl="5" w:tentative="1">
+      <w:start w:val="1"/>
+      <w:numFmt w:val="bullet"/>
+      <w:lvlText w:val=""/>
+      <w:lvlJc w:val="left"/>
+      <w:pPr>
+        <w:tabs>
+          <w:tab w:val="num" w:pos="4320"/>
+        </w:tabs>
+        <w:ind w:left="4320" w:hanging="360"/>
+      </w:pPr>
+      <w:rPr>
+        <w:rFonts w:ascii="Wingdings" w:hAnsi="Wingdings" w:hint="default"/>
+        <w:sz w:val="20"/>
+      </w:rPr>
+    </w:lvl>
+    <w:lvl w:ilvl="6" w:tentative="1">
+      <w:start w:val="1"/>
+      <w:numFmt w:val="bullet"/>
+      <w:lvlText w:val=""/>
+      <w:lvlJc w:val="left"/>
+      <w:pPr>
+        <w:tabs>
+          <w:tab w:val="num" w:pos="5040"/>
+        </w:tabs>
+        <w:ind w:left="5040" w:hanging="360"/>
+      </w:pPr>
+      <w:rPr>
+        <w:rFonts w:ascii="Wingdings" w:hAnsi="Wingdings" w:hint="default"/>
+        <w:sz w:val="20"/>
+      </w:rPr>
+    </w:lvl>
+    <w:lvl w:ilvl="7" w:tentative="1">
+      <w:start w:val="1"/>
+      <w:numFmt w:val="bullet"/>
+      <w:lvlText w:val=""/>
+      <w:lvlJc w:val="left"/>
+      <w:pPr>
+        <w:tabs>
+          <w:tab w:val="num" w:pos="5760"/>
+        </w:tabs>
+        <w:ind w:left="5760" w:hanging="360"/>
+      </w:pPr>
+      <w:rPr>
+        <w:rFonts w:ascii="Wingdings" w:hAnsi="Wingdings" w:hint="default"/>
+        <w:sz w:val="20"/>
+      </w:rPr>
+    </w:lvl>
+    <w:lvl w:ilvl="8" w:tentative="1">
+      <w:start w:val="1"/>
+      <w:numFmt w:val="bullet"/>
+      <w:lvlText w:val=""/>
+      <w:lvlJc w:val="left"/>
+      <w:pPr>
+        <w:tabs>
+          <w:tab w:val="num" w:pos="6480"/>
+        </w:tabs>
+        <w:ind w:left="6480" w:hanging="360"/>
+      </w:pPr>
+      <w:rPr>
+        <w:rFonts w:ascii="Wingdings" w:hAnsi="Wingdings" w:hint="default"/>
+        <w:sz w:val="20"/>
+      </w:rPr>
+    </w:lvl>
+  </w:abstractNum>
   <w:num w:numId="1" w16cid:durableId="1438795845">
     <w:abstractNumId w:val="1"/>
   </w:num>
   <w:num w:numId="2" w16cid:durableId="572008286">
-    <w:abstractNumId w:val="5"/>
+    <w:abstractNumId w:val="6"/>
   </w:num>
   <w:num w:numId="3" w16cid:durableId="983463173">
     <w:abstractNumId w:val="4"/>
@@ -14149,13 +13247,16 @@
     <w:abstractNumId w:val="2"/>
   </w:num>
   <w:num w:numId="5" w16cid:durableId="534656764">
-    <w:abstractNumId w:val="6"/>
+    <w:abstractNumId w:val="7"/>
   </w:num>
   <w:num w:numId="6" w16cid:durableId="1011955425">
     <w:abstractNumId w:val="3"/>
   </w:num>
   <w:num w:numId="7" w16cid:durableId="1424572960">
     <w:abstractNumId w:val="0"/>
+  </w:num>
+  <w:num w:numId="8" w16cid:durableId="1326088098">
+    <w:abstractNumId w:val="5"/>
   </w:num>
 </w:numbering>
 </file>
@@ -15177,7 +14278,6 @@
     <w:name w:val="Normal (Web)"/>
     <w:basedOn w:val="Normal"/>
     <w:uiPriority w:val="99"/>
-    <w:semiHidden/>
     <w:unhideWhenUsed/>
     <w:rsid w:val="00AC1324"/>
     <w:pPr>
@@ -15418,6 +14518,63 @@
     <w:pPr>
       <w:spacing w:after="0"/>
     </w:pPr>
+  </w:style>
+  <w:style w:type="table" w:styleId="GridTable1Light">
+    <w:name w:val="Grid Table 1 Light"/>
+    <w:basedOn w:val="TableNormal"/>
+    <w:uiPriority w:val="46"/>
+    <w:rsid w:val="00634A3F"/>
+    <w:pPr>
+      <w:spacing w:after="0" w:line="240" w:lineRule="auto"/>
+    </w:pPr>
+    <w:tblPr>
+      <w:tblStyleRowBandSize w:val="1"/>
+      <w:tblStyleColBandSize w:val="1"/>
+      <w:tblBorders>
+        <w:top w:val="single" w:sz="4" w:space="0" w:color="999999" w:themeColor="text1" w:themeTint="66"/>
+        <w:left w:val="single" w:sz="4" w:space="0" w:color="999999" w:themeColor="text1" w:themeTint="66"/>
+        <w:bottom w:val="single" w:sz="4" w:space="0" w:color="999999" w:themeColor="text1" w:themeTint="66"/>
+        <w:right w:val="single" w:sz="4" w:space="0" w:color="999999" w:themeColor="text1" w:themeTint="66"/>
+        <w:insideH w:val="single" w:sz="4" w:space="0" w:color="999999" w:themeColor="text1" w:themeTint="66"/>
+        <w:insideV w:val="single" w:sz="4" w:space="0" w:color="999999" w:themeColor="text1" w:themeTint="66"/>
+      </w:tblBorders>
+    </w:tblPr>
+    <w:tblStylePr w:type="firstRow">
+      <w:rPr>
+        <w:b/>
+        <w:bCs/>
+      </w:rPr>
+      <w:tblPr/>
+      <w:tcPr>
+        <w:tcBorders>
+          <w:bottom w:val="single" w:sz="12" w:space="0" w:color="666666" w:themeColor="text1" w:themeTint="99"/>
+        </w:tcBorders>
+      </w:tcPr>
+    </w:tblStylePr>
+    <w:tblStylePr w:type="lastRow">
+      <w:rPr>
+        <w:b/>
+        <w:bCs/>
+      </w:rPr>
+      <w:tblPr/>
+      <w:tcPr>
+        <w:tcBorders>
+          <w:top w:val="double" w:sz="2" w:space="0" w:color="666666" w:themeColor="text1" w:themeTint="99"/>
+        </w:tcBorders>
+      </w:tcPr>
+    </w:tblStylePr>
+    <w:tblStylePr w:type="firstCol">
+      <w:rPr>
+        <w:b/>
+        <w:bCs/>
+      </w:rPr>
+    </w:tblStylePr>
+    <w:tblStylePr w:type="lastCol">
+      <w:rPr>
+        <w:b/>
+        <w:bCs/>
+      </w:rPr>
+    </w:tblStylePr>
   </w:style>
 </w:styles>
 </file>
@@ -15673,12 +14830,14 @@
   </w:compat>
   <w:rsids>
     <w:rsidRoot w:val="00B44355"/>
-    <w:rsid w:val="006D68A3"/>
     <w:rsid w:val="007863D9"/>
+    <w:rsid w:val="007B0170"/>
     <w:rsid w:val="009526D4"/>
     <w:rsid w:val="00B44355"/>
+    <w:rsid w:val="00C12F7A"/>
     <w:rsid w:val="00D6081B"/>
     <w:rsid w:val="00E23C07"/>
+    <w:rsid w:val="00F7196F"/>
   </w:rsids>
   <m:mathPr>
     <m:mathFont m:val="Cambria Math"/>

</xml_diff>